<commit_message>
2209-A raporunun akademik görünümünü ve resmî başvuru dilini yenile
</commit_message>
<xml_diff>
--- a/docs/2209-A/ARASTIRMA_ONERISI.docx
+++ b/docs/2209-A/ARASTIRMA_ONERISI.docx
@@ -2,1408 +2,33 @@
 <file path=word/document.xml><?xml version="1.0" encoding="utf-8"?>
 <w:document xmlns:w="http://schemas.openxmlformats.org/wordprocessingml/2006/main" xmlns:m="http://schemas.openxmlformats.org/officeDocument/2006/math" xmlns:r="http://schemas.openxmlformats.org/officeDocument/2006/relationships" xmlns:o="urn:schemas-microsoft-com:office:office" xmlns:v="urn:schemas-microsoft-com:vml" xmlns:w10="urn:schemas-microsoft-com:office:word" xmlns:a="http://schemas.openxmlformats.org/drawingml/2006/main" xmlns:pic="http://schemas.openxmlformats.org/drawingml/2006/picture" xmlns:wp="http://schemas.openxmlformats.org/drawingml/2006/wordprocessingDrawing">
   <w:body>
-    <w:bookmarkStart w:id="60" w:name="tübitak-2209-a"/>
-    <w:p>
-      <w:pPr>
-        <w:pStyle w:val="Heading1"/>
-        <w:keepNext/>
-        <w:spacing w:after="360" w:before="1200"/>
-        <w:jc w:val="center"/>
-      </w:pPr>
-      <w:r>
-        <w:rPr>
-          <w:sz w:val="44"/>
-        </w:rPr>
-        <w:t xml:space="preserve">TÜBİTAK 2209-A</w:t>
-      </w:r>
-    </w:p>
     <w:p>
       <w:pPr>
         <w:pStyle w:val="FirstParagraph"/>
         <w:keepNext/>
-        <w:spacing w:after="360"/>
-        <w:jc w:val="center"/>
-      </w:pPr>
-      <w:r>
-        <w:rPr>
-          <w:b/>
-          <w:bCs/>
-        </w:rPr>
-        <w:t xml:space="preserve">ÜNİVERSİTE ÖĞRENCİLERİ ARAŞTIRMA PROJELERİ DESTEKLEME PROGRAMI</w:t>
-      </w:r>
-    </w:p>
-    <w:p>
-      <w:pPr>
-        <w:pStyle w:val="BodyText"/>
-        <w:keepNext/>
-        <w:spacing w:after="360"/>
-        <w:jc w:val="center"/>
-      </w:pPr>
-      <w:r>
-        <w:rPr>
-          <w:b/>
-          <w:bCs/>
-        </w:rPr>
-        <w:t xml:space="preserve">ARAŞTIRMA ÖNERİSİ</w:t>
-      </w:r>
-    </w:p>
-    <w:p>
-      <w:pPr>
-        <w:pStyle w:val="BodyText"/>
-        <w:keepNext/>
-        <w:spacing w:after="640" w:before="480"/>
-        <w:jc w:val="center"/>
-      </w:pPr>
-      <w:r>
-        <w:rPr>
-          <w:b/>
-          <w:bCs/>
-          <w:sz w:val="34"/>
-        </w:rPr>
-        <w:t xml:space="preserve">Kullanıcı tarafından belirlenen rota bilgisine göre hareket eden otonom araç tasarımı</w:t>
-      </w:r>
-    </w:p>
-    <w:p>
-      <w:pPr>
-        <w:pStyle w:val="BodyText"/>
-        <w:keepNext/>
-        <w:spacing w:after="360"/>
-        <w:jc w:val="center"/>
-      </w:pPr>
-      <w:r>
-        <w:rPr>
-          <w:b/>
-          <w:bCs/>
-        </w:rPr>
-        <w:t xml:space="preserve">Proje yürütücüsü</w:t>
-      </w:r>
-      <w:r>
-        <w:br/>
-      </w:r>
-      <w:r>
-        <w:t xml:space="preserve">Ahmet Talha Arslan</w:t>
-      </w:r>
-    </w:p>
-    <w:p>
-      <w:pPr>
-        <w:pStyle w:val="BodyText"/>
-        <w:keepNext/>
-        <w:spacing w:after="360"/>
-        <w:jc w:val="center"/>
-      </w:pPr>
-      <w:r>
-        <w:rPr>
-          <w:b/>
-          <w:bCs/>
-        </w:rPr>
-        <w:t xml:space="preserve">Akademik danışman</w:t>
-      </w:r>
-      <w:r>
-        <w:br/>
-      </w:r>
-      <w:r>
-        <w:t xml:space="preserve">Prof. Dr. Murat Ceylan</w:t>
-      </w:r>
-    </w:p>
-    <w:p>
-      <w:pPr>
-        <w:pStyle w:val="BodyText"/>
-        <w:keepNext/>
-        <w:spacing w:after="360"/>
-        <w:jc w:val="center"/>
-      </w:pPr>
-      <w:r>
-        <w:rPr>
-          <w:b/>
-          <w:bCs/>
-        </w:rPr>
-        <w:t xml:space="preserve">Konya Teknik Üniversitesi</w:t>
-      </w:r>
-      <w:r>
-        <w:br/>
-      </w:r>
-      <w:r>
-        <w:t xml:space="preserve">Elektrik-Elektronik Mühendisliği</w:t>
-      </w:r>
-    </w:p>
-    <w:p>
-      <w:pPr>
-        <w:pStyle w:val="BodyText"/>
-        <w:keepNext w:val="0"/>
-        <w:spacing w:after="360" w:before="480"/>
-        <w:jc w:val="center"/>
-      </w:pPr>
-      <w:r>
-        <w:rPr>
-          <w:b/>
-          <w:bCs/>
-        </w:rPr>
-        <w:t xml:space="preserve">2026 YILI</w:t>
-      </w:r>
-    </w:p>
-    <w:bookmarkStart w:id="20" w:name="a.-genel-bilgiler"/>
-    <w:p>
-      <w:pPr>
-        <w:pStyle w:val="Heading2"/>
-        <w:pageBreakBefore/>
-      </w:pPr>
-      <w:r>
-        <w:t xml:space="preserve">A. GENEL BİLGİLER</w:t>
-      </w:r>
-    </w:p>
-    <w:tbl>
-      <w:tblPr>
-        <w:tblStyle w:val="TableGrid"/>
-        <w:tblW w:type="pct" w:w="5000"/>
-        <w:jc w:val="left"/>
-        <w:tblLayout w:type="fixed"/>
-        <w:tblLook w:firstRow="1" w:lastRow="0" w:firstColumn="0" w:lastColumn="0" w:noHBand="0" w:noVBand="0" w:val="0020"/>
-      </w:tblPr>
-      <w:tblGrid>
-        <w:gridCol w:w="2381"/>
-        <w:gridCol w:w="7257"/>
-      </w:tblGrid>
-      <w:tr>
-        <w:trPr>
-          <w:tblHeader w:val="on"/>
-          <w:tblHeader/>
-          <w:cantSplit/>
-        </w:trPr>
-        <w:tc>
-          <w:tcPr>
-            <w:tcW w:type="dxa" w:w="2381"/>
-            <w:vAlign w:val="top"/>
-            <w:shd w:fill="EAF1F7"/>
-          </w:tcPr>
-          <w:p>
-            <w:pPr>
-              <w:pStyle w:val="Compact"/>
-              <w:spacing w:after="60" w:line="252" w:lineRule="auto"/>
-              <w:jc w:val="left"/>
-            </w:pPr>
-            <w:r>
-              <w:rPr>
-                <w:b/>
-                <w:sz w:val="19"/>
-              </w:rPr>
-              <w:t xml:space="preserve">Alan</w:t>
-            </w:r>
-          </w:p>
-        </w:tc>
-        <w:tc>
-          <w:tcPr>
-            <w:tcW w:type="dxa" w:w="7257"/>
-            <w:vAlign w:val="top"/>
-            <w:shd w:fill="EAF1F7"/>
-          </w:tcPr>
-          <w:p>
-            <w:pPr>
-              <w:pStyle w:val="Compact"/>
-              <w:spacing w:after="60" w:line="252" w:lineRule="auto"/>
-              <w:jc w:val="left"/>
-            </w:pPr>
-            <w:r>
-              <w:rPr>
-                <w:b/>
-                <w:sz w:val="19"/>
-              </w:rPr>
-              <w:t xml:space="preserve">Bilgi</w:t>
-            </w:r>
-          </w:p>
-        </w:tc>
-      </w:tr>
-      <w:tr>
-        <w:trPr>
-          <w:cantSplit/>
-        </w:trPr>
-        <w:tc>
-          <w:tcPr>
-            <w:tcW w:type="dxa" w:w="2381"/>
-            <w:vAlign w:val="top"/>
-          </w:tcPr>
-          <w:p>
-            <w:pPr>
-              <w:pStyle w:val="Compact"/>
-              <w:spacing w:after="60" w:line="252" w:lineRule="auto"/>
-              <w:jc w:val="left"/>
-            </w:pPr>
-            <w:r>
-              <w:rPr>
-                <w:sz w:val="19"/>
-              </w:rPr>
-              <w:t xml:space="preserve">Başvuru sahibinin adı soyadı</w:t>
-            </w:r>
-          </w:p>
-        </w:tc>
-        <w:tc>
-          <w:tcPr>
-            <w:tcW w:type="dxa" w:w="7257"/>
-            <w:vAlign w:val="top"/>
-          </w:tcPr>
-          <w:p>
-            <w:pPr>
-              <w:pStyle w:val="Compact"/>
-              <w:spacing w:after="60" w:line="252" w:lineRule="auto"/>
-              <w:jc w:val="left"/>
-            </w:pPr>
-            <w:r>
-              <w:rPr>
-                <w:sz w:val="19"/>
-              </w:rPr>
-              <w:t xml:space="preserve">Ahmet Talha Arslan</w:t>
-            </w:r>
-          </w:p>
-        </w:tc>
-      </w:tr>
-      <w:tr>
-        <w:trPr>
-          <w:cantSplit/>
-        </w:trPr>
-        <w:tc>
-          <w:tcPr>
-            <w:tcW w:type="dxa" w:w="2381"/>
-            <w:vAlign w:val="top"/>
-          </w:tcPr>
-          <w:p>
-            <w:pPr>
-              <w:pStyle w:val="Compact"/>
-              <w:spacing w:after="60" w:line="252" w:lineRule="auto"/>
-              <w:jc w:val="left"/>
-            </w:pPr>
-            <w:r>
-              <w:rPr>
-                <w:sz w:val="19"/>
-              </w:rPr>
-              <w:t xml:space="preserve">Araştırma önerisinin başlığı</w:t>
-            </w:r>
-          </w:p>
-        </w:tc>
-        <w:tc>
-          <w:tcPr>
-            <w:tcW w:type="dxa" w:w="7257"/>
-            <w:vAlign w:val="top"/>
-          </w:tcPr>
-          <w:p>
-            <w:pPr>
-              <w:pStyle w:val="Compact"/>
-              <w:spacing w:after="60" w:line="252" w:lineRule="auto"/>
-              <w:jc w:val="left"/>
-            </w:pPr>
-            <w:r>
-              <w:rPr>
-                <w:sz w:val="19"/>
-              </w:rPr>
-              <w:t xml:space="preserve">Kullanıcı tarafından belirlenen rota bilgisine göre hareket eden otonom araç tasarımı</w:t>
-            </w:r>
-          </w:p>
-        </w:tc>
-      </w:tr>
-      <w:tr>
-        <w:trPr>
-          <w:cantSplit/>
-        </w:trPr>
-        <w:tc>
-          <w:tcPr>
-            <w:tcW w:type="dxa" w:w="2381"/>
-            <w:vAlign w:val="top"/>
-          </w:tcPr>
-          <w:p>
-            <w:pPr>
-              <w:pStyle w:val="Compact"/>
-              <w:spacing w:after="60" w:line="252" w:lineRule="auto"/>
-              <w:jc w:val="left"/>
-            </w:pPr>
-            <w:r>
-              <w:rPr>
-                <w:sz w:val="19"/>
-              </w:rPr>
-              <w:t xml:space="preserve">Akademik danışman</w:t>
-            </w:r>
-          </w:p>
-        </w:tc>
-        <w:tc>
-          <w:tcPr>
-            <w:tcW w:type="dxa" w:w="7257"/>
-            <w:vAlign w:val="top"/>
-          </w:tcPr>
-          <w:p>
-            <w:pPr>
-              <w:pStyle w:val="Compact"/>
-              <w:spacing w:after="60" w:line="252" w:lineRule="auto"/>
-              <w:jc w:val="left"/>
-            </w:pPr>
-            <w:r>
-              <w:rPr>
-                <w:sz w:val="19"/>
-              </w:rPr>
-              <w:t xml:space="preserve">Prof. Dr. Murat Ceylan</w:t>
-            </w:r>
-          </w:p>
-        </w:tc>
-      </w:tr>
-      <w:tr>
-        <w:trPr>
-          <w:cantSplit/>
-        </w:trPr>
-        <w:tc>
-          <w:tcPr>
-            <w:tcW w:type="dxa" w:w="2381"/>
-            <w:vAlign w:val="top"/>
-          </w:tcPr>
-          <w:p>
-            <w:pPr>
-              <w:pStyle w:val="Compact"/>
-              <w:spacing w:after="60" w:line="252" w:lineRule="auto"/>
-              <w:jc w:val="left"/>
-            </w:pPr>
-            <w:r>
-              <w:rPr>
-                <w:sz w:val="19"/>
-              </w:rPr>
-              <w:t xml:space="preserve">Üniversite / bölüm</w:t>
-            </w:r>
-          </w:p>
-        </w:tc>
-        <w:tc>
-          <w:tcPr>
-            <w:tcW w:type="dxa" w:w="7257"/>
-            <w:vAlign w:val="top"/>
-          </w:tcPr>
-          <w:p>
-            <w:pPr>
-              <w:pStyle w:val="Compact"/>
-              <w:spacing w:after="60" w:line="252" w:lineRule="auto"/>
-              <w:jc w:val="left"/>
-            </w:pPr>
-            <w:r>
-              <w:rPr>
-                <w:sz w:val="19"/>
-              </w:rPr>
-              <w:t xml:space="preserve">Konya Teknik Üniversitesi / Elektrik-Elektronik Mühendisliği</w:t>
-            </w:r>
-          </w:p>
-        </w:tc>
-      </w:tr>
-      <w:tr>
-        <w:trPr>
-          <w:cantSplit/>
-        </w:trPr>
-        <w:tc>
-          <w:tcPr>
-            <w:tcW w:type="dxa" w:w="2381"/>
-            <w:vAlign w:val="top"/>
-          </w:tcPr>
-          <w:p>
-            <w:pPr>
-              <w:pStyle w:val="Compact"/>
-              <w:spacing w:after="60" w:line="252" w:lineRule="auto"/>
-              <w:jc w:val="left"/>
-            </w:pPr>
-            <w:r>
-              <w:rPr>
-                <w:sz w:val="19"/>
-              </w:rPr>
-              <w:t xml:space="preserve">Öğrenim düzeyi</w:t>
-            </w:r>
-          </w:p>
-        </w:tc>
-        <w:tc>
-          <w:tcPr>
-            <w:tcW w:type="dxa" w:w="7257"/>
-            <w:vAlign w:val="top"/>
-          </w:tcPr>
-          <w:p>
-            <w:pPr>
-              <w:pStyle w:val="Compact"/>
-              <w:spacing w:after="60" w:line="252" w:lineRule="auto"/>
-              <w:jc w:val="left"/>
-            </w:pPr>
-            <w:r>
-              <w:rPr>
-                <w:sz w:val="19"/>
-              </w:rPr>
-              <w:t xml:space="preserve">Lisans, 4. sınıf</w:t>
-            </w:r>
-          </w:p>
-        </w:tc>
-      </w:tr>
-      <w:tr>
-        <w:trPr>
-          <w:cantSplit/>
-        </w:trPr>
-        <w:tc>
-          <w:tcPr>
-            <w:tcW w:type="dxa" w:w="2381"/>
-            <w:vAlign w:val="top"/>
-          </w:tcPr>
-          <w:p>
-            <w:pPr>
-              <w:pStyle w:val="Compact"/>
-              <w:spacing w:after="60" w:line="252" w:lineRule="auto"/>
-              <w:jc w:val="left"/>
-            </w:pPr>
-            <w:r>
-              <w:rPr>
-                <w:sz w:val="19"/>
-              </w:rPr>
-              <w:t xml:space="preserve">Proje ekibi</w:t>
-            </w:r>
-          </w:p>
-        </w:tc>
-        <w:tc>
-          <w:tcPr>
-            <w:tcW w:type="dxa" w:w="7257"/>
-            <w:vAlign w:val="top"/>
-          </w:tcPr>
-          <w:p>
-            <w:pPr>
-              <w:pStyle w:val="Compact"/>
-              <w:spacing w:after="60" w:line="252" w:lineRule="auto"/>
-              <w:jc w:val="left"/>
-            </w:pPr>
-            <w:r>
-              <w:rPr>
-                <w:sz w:val="19"/>
-              </w:rPr>
-              <w:t xml:space="preserve">Bir öğrenci yürütücü</w:t>
-            </w:r>
-          </w:p>
-        </w:tc>
-      </w:tr>
-      <w:tr>
-        <w:trPr>
-          <w:cantSplit/>
-        </w:trPr>
-        <w:tc>
-          <w:tcPr>
-            <w:tcW w:type="dxa" w:w="2381"/>
-            <w:vAlign w:val="top"/>
-          </w:tcPr>
-          <w:p>
-            <w:pPr>
-              <w:pStyle w:val="Compact"/>
-              <w:spacing w:after="60" w:line="252" w:lineRule="auto"/>
-              <w:jc w:val="left"/>
-            </w:pPr>
-            <w:r>
-              <w:rPr>
-                <w:sz w:val="19"/>
-              </w:rPr>
-              <w:t xml:space="preserve">Proje süresi</w:t>
-            </w:r>
-          </w:p>
-        </w:tc>
-        <w:tc>
-          <w:tcPr>
-            <w:tcW w:type="dxa" w:w="7257"/>
-            <w:vAlign w:val="top"/>
-          </w:tcPr>
-          <w:p>
-            <w:pPr>
-              <w:pStyle w:val="Compact"/>
-              <w:spacing w:after="60" w:line="252" w:lineRule="auto"/>
-              <w:jc w:val="left"/>
-            </w:pPr>
-            <w:r>
-              <w:rPr>
-                <w:sz w:val="19"/>
-              </w:rPr>
-              <w:t xml:space="preserve">6 ay</w:t>
-            </w:r>
-          </w:p>
-        </w:tc>
-      </w:tr>
-      <w:tr>
-        <w:trPr>
-          <w:cantSplit/>
-        </w:trPr>
-        <w:tc>
-          <w:tcPr>
-            <w:tcW w:type="dxa" w:w="2381"/>
-            <w:vAlign w:val="top"/>
-          </w:tcPr>
-          <w:p>
-            <w:pPr>
-              <w:pStyle w:val="Compact"/>
-              <w:spacing w:after="60" w:line="252" w:lineRule="auto"/>
-              <w:jc w:val="left"/>
-            </w:pPr>
-            <w:r>
-              <w:rPr>
-                <w:sz w:val="19"/>
-              </w:rPr>
-              <w:t xml:space="preserve">Talep edilen destek</w:t>
-            </w:r>
-          </w:p>
-        </w:tc>
-        <w:tc>
-          <w:tcPr>
-            <w:tcW w:type="dxa" w:w="7257"/>
-            <w:vAlign w:val="top"/>
-          </w:tcPr>
-          <w:p>
-            <w:pPr>
-              <w:pStyle w:val="Compact"/>
-              <w:spacing w:after="60" w:line="252" w:lineRule="auto"/>
-              <w:jc w:val="left"/>
-            </w:pPr>
-            <w:r>
-              <w:rPr>
-                <w:sz w:val="19"/>
-              </w:rPr>
-              <w:t xml:space="preserve">11.500 TL; KDV dahil tahmini bütçe</w:t>
-            </w:r>
-          </w:p>
-        </w:tc>
-      </w:tr>
-    </w:tbl>
-    <w:bookmarkEnd w:id="20"/>
-    <w:bookmarkStart w:id="21" w:name="özet"/>
-    <w:p>
-      <w:pPr>
-        <w:pStyle w:val="Heading2"/>
-      </w:pPr>
-      <w:r>
-        <w:t xml:space="preserve">ÖZET</w:t>
-      </w:r>
-    </w:p>
-    <w:p>
-      <w:pPr>
-        <w:pStyle w:val="FirstParagraph"/>
-      </w:pPr>
-      <w:r>
-        <w:t xml:space="preserve">Bu araştırmada, kullanıcı tarafından tanımlanan rotayı izleyen, sabit engelleri algılayıp çarpışmadan kaçınarak rotasına dönen küçük ölçekli bir otonom kara aracı geliştirilecektir. Araştırmanın temel sorusu, aynı rota üzerindeki farklı engel yerleşimlerinin algılama, kaçınma, rotaya dönüş ve görev tamamlama başarısını nasıl etkilediğidir.</w:t>
-      </w:r>
-    </w:p>
-    <w:p>
-      <w:pPr>
-        <w:pStyle w:val="BodyText"/>
-      </w:pPr>
-      <w:r>
-        <w:t xml:space="preserve">Sistem; ESP32 kontrol birimi, bağımsız sürülen iki enkoderli motor ve beş sabit uçuş süresi (ToF) mesafe sensöründen oluşacaktır. Bilgisayar öncelikli, telefondan da erişilebilir web arayüzünde yerel koordinatlarla sıralı ara rota noktaları (waypoint) tanımlanacaktır. Enkoder tabanlı konum kestirimi ve mesafe ölçümleriyle hareket kontrol edilecek; engelden kaçınma ve rotaya yeniden katılma, Bug 2 yaklaşımından yararlanan bir durum makinesiyle gerçekleştirilecektir.</w:t>
-      </w:r>
-    </w:p>
-    <w:p>
-      <w:pPr>
-        <w:pStyle w:val="BodyText"/>
-      </w:pPr>
-      <w:r>
-        <w:t xml:space="preserve">Düz zeminde 3 × 3 metrelik kontrollü alanda, engelsiz referans ve üç sabit engel yerleşimi değerlendirilecektir. Her koşulda 10 tekrar olmak üzere toplam 40 geçerli deneme yapılacaktır. Her engelli koşulda en az 8/10 denemede temas öncesi algılama, çarpışmasız kaçınma, rotaya dönüş ve hedefe ulaşmanın birlikte sağlanması hedeflenmektedir. Waypoint erişimi ve rotaya dönüş için 10 cm tolerans, görev tamamlama için 120 saniye üst sınırı kullanılacaktır. Hareket, mevcut telefonla alınacak sabit görüntü kaydı üzerinden bağımsız olarak değerlendirilecektir. Başarı oranları, tamamlanma süreleri ve rota izleme hataları raporlanacaktır.</w:t>
-      </w:r>
-    </w:p>
-    <w:p>
-      <w:pPr>
-        <w:pStyle w:val="BodyText"/>
-      </w:pPr>
-      <w:r>
-        <w:t xml:space="preserve">Altı aylık çalışma, donanım ve kalibrasyon, arayüz, rota takibi, engelden kaçınma ile deney ve analizden oluşan beş iş paketinde yürütülecektir. Beklenen çıktılar bir araç prototipi, rota arayüzü, deney kayıt kümesi ve sürümlenmiş yazılım ile teknik dokümantasyondur. Çalışmanın, gömülü kontrol ve mobil robotik alanında deneysel bir eğitim ve geliştirme altyapısı oluşturması beklenmektedir.</w:t>
-      </w:r>
-    </w:p>
-    <w:p>
-      <w:pPr>
-        <w:pStyle w:val="BodyText"/>
-      </w:pPr>
-      <w:r>
-        <w:rPr>
-          <w:b/>
-          <w:bCs/>
-        </w:rPr>
-        <w:t xml:space="preserve">Anahtar kelimeler:</w:t>
-      </w:r>
-      <w:r>
-        <w:t xml:space="preserve"> </w:t>
-      </w:r>
-      <w:r>
-        <w:t xml:space="preserve">Otonom kara aracı, rota takibi, engelden kaçınma, enkoder, gömülü kontrol.</w:t>
-      </w:r>
-    </w:p>
-    <w:bookmarkEnd w:id="21"/>
-    <w:bookmarkStart w:id="24" w:name="araştirma-önerisinin-bilimsel-niteliği"/>
-    <w:p>
-      <w:pPr>
-        <w:pStyle w:val="Heading2"/>
-        <w:pageBreakBefore/>
-      </w:pPr>
-      <w:r>
-        <w:t xml:space="preserve">1. ARAŞTIRMA ÖNERİSİNİN BİLİMSEL NİTELİĞİ</w:t>
-      </w:r>
-    </w:p>
-    <w:bookmarkStart w:id="22" w:name="X2d024c15c071b3cb5d3e99d34387eb7593d965e"/>
-    <w:p>
-      <w:pPr>
-        <w:pStyle w:val="Heading3"/>
-      </w:pPr>
-      <w:r>
-        <w:t xml:space="preserve">1.1. Konunun önemi ve araştırma önerisinin bilimsel niteliği</w:t>
-      </w:r>
-    </w:p>
-    <w:p>
-      <w:pPr>
-        <w:pStyle w:val="FirstParagraph"/>
-      </w:pPr>
-      <w:r>
-        <w:rPr>
-          <w:b/>
-          <w:bCs/>
-        </w:rPr>
-        <w:t xml:space="preserve">Araştırma problemi ve önemi</w:t>
-      </w:r>
-    </w:p>
-    <w:p>
-      <w:pPr>
-        <w:pStyle w:val="BodyText"/>
-      </w:pPr>
-      <w:r>
-        <w:t xml:space="preserve">Otonom kara araçlarında rota takibi, aracın konum ve yön bilgisinin hareket kontrolüyle birlikte değerlendirilmesini gerektirir. İki tekeri bağımsız sürülen mobil robotların kinematik modeli, tekerleklerin hareketi ile aracın doğrusal ve açısal hareketi arasındaki ilişkiyi tanımlar. Bu nedenle kullanıcı tarafından belirlenen bir rotanın fiziksel ortamda izlenmesi, yalnızca hareket komutlarının gönderilmesine değil, aracın yöneliminin ve hareketinin uygun biçimde izlenmesine de bağlıdır (Dellaert ve Hutchinson, t.y.). Rota üzerinde engel bulunması durumunda ise aracın engeli algılaması, çarpışmadan kaçınacak bir hareket üretmesi ve hedefe ilerleyişini sürdürebilmesi gerekir.</w:t>
-      </w:r>
-    </w:p>
-    <w:p>
-      <w:pPr>
-        <w:pStyle w:val="BodyText"/>
-      </w:pPr>
-      <w:r>
-        <w:rPr>
-          <w:b/>
-          <w:bCs/>
-        </w:rPr>
-        <w:t xml:space="preserve">Literatürdeki yaklaşımlar ve projenin konumu</w:t>
-      </w:r>
-    </w:p>
-    <w:p>
-      <w:pPr>
-        <w:pStyle w:val="BodyText"/>
-      </w:pPr>
-      <w:r>
-        <w:t xml:space="preserve">Hareket planlama literatüründe yerel engel bilgisini kullanan Bug türü yöntemler, önceden tüm engellerin haritası bilinmeden hedefe yönelik hareketin ele alınabildiği yaklaşımlar arasındadır. Bu yöntemlerin incelenmesinde robotun konumuna, engel geometrisine ve algılama biçimine ilişkin varsayımlar önem taşır. Ayrıca robotun fiziksel boyutlarının dikkate alınması, noktasal bir modelle bulunan yolun gerçek bir araçta uygulanabilirliğinin değerlendirilmesi açısından gereklidir (Hauser, t.y.-a).</w:t>
-      </w:r>
-    </w:p>
-    <w:p>
-      <w:pPr>
-        <w:pStyle w:val="BodyText"/>
-      </w:pPr>
-      <w:r>
-        <w:t xml:space="preserve">Alajlan vd. (2017), FEZ Cerbot platformunda kızılötesi sensörler, ultrasonik sensör ve araç üzeri kamerayı birleştirerek sabit ve kısmen dinamik engelli senaryoları incelemiştir. Bu çalışma, algılama kapsamının hareket kararlarıyla birlikte tasarlanmasına örnek oluşturmaktadır. Bu araştırmada ise beş sabit mesafe sensörünün sağladığı yerel bilgiyle sabit engeller çevresinde kaçınma davranışı değerlendirilecektir. Telefonla yapılacak görüntü kaydı, aracın hareketini bağımsız olarak ölçmek amacıyla kullanılacaktır. Algılama altyapısı ve deney koşulları farklı olduğundan, ilgili yayındaki performans sonuçları bu prototip için öngörülen başarı değerleri olarak alınmayacaktır.</w:t>
-      </w:r>
-    </w:p>
-    <w:p>
-      <w:pPr>
-        <w:pStyle w:val="BodyText"/>
-      </w:pPr>
-      <w:r>
-        <w:t xml:space="preserve">Koordinat tabanlı uygulamalarda Iqbal vd. (2023), yapı modelinden çıkarılan koordinatların masaüstü uygulaması ve bulut bağlantısı üzerinden ESP32 tabanlı bir mobil robota aktarılmasıyla zemin çizimi gerçekleştiren bir sistem sunmuştur. Rodrigues vd. (2026) ise enkoderler, dış kamera temelli konum bilgisi ve ESP32 gömülü kontrol katmanını içeren küçük bir diferansiyel sürüşlü robotta yörünge takibini deneysel olarak değerlendirmiştir. Bu örnekler, koordinat aktarımı, konum bilgisi ve motor kontrolünün farklı mimarilerle bütünleştirilebildiğini göstermektedir. Önerilen projede ele alınacak değerlendirme görevi, kullanıcının tanımladığı rota üzerinde yerel algıyla engelden kaçınma ve rotaya yeniden katılmadır. Çalışmanın bilimsel çerçevesi, bu davranışın seçilen donanım ve sınırlı deney koşullarında hangi aşamalarda başarılı veya başarısız olduğunun tekrarlı ölçümlerle incelenmesine dayanmaktadır.</w:t>
-      </w:r>
-    </w:p>
-    <w:p>
-      <w:pPr>
-        <w:pStyle w:val="BodyText"/>
-      </w:pPr>
-      <w:r>
-        <w:rPr>
-          <w:b/>
-          <w:bCs/>
-        </w:rPr>
-        <w:t xml:space="preserve">Araştırma sorusu, kapsam ve beklenen katkı</w:t>
-      </w:r>
-    </w:p>
-    <w:p>
-      <w:pPr>
-        <w:pStyle w:val="BodyText"/>
-      </w:pPr>
-      <w:r>
-        <w:t xml:space="preserve">Araştırma problemi, mikrodenetleyici tabanlı bir aracın kullanıcı tanımlı rotada karşılaştığı sabit engelleri aşarak aynı rota üzerindeki görevini sürdürebilmesidir. Bu problem, düz zeminde yaklaşık 3 × 3 metre olarak planlanan kontrollü alanda incelenecektir. Aynı referans rota üzerinde engelin yeri değiştirilerek algılama, kaçınma, rotaya dönüş ve görevi tamamlama aşamalarındaki başarı ve başarısızlıklar karşılaştırılacaktır.</w:t>
-      </w:r>
-    </w:p>
-    <w:p>
-      <w:pPr>
-        <w:pStyle w:val="BodyText"/>
-      </w:pPr>
-      <w:r>
-        <w:t xml:space="preserve">Çalışmanın araştırma sorusu,</w:t>
-      </w:r>
-      <w:r>
-        <w:t xml:space="preserve"> </w:t>
-      </w:r>
-      <w:r>
-        <w:t xml:space="preserve">“</w:t>
-      </w:r>
-      <w:r>
-        <w:t xml:space="preserve">Sabit engellerin yerleşimi, kullanıcı tanımlı waypoint rotalarını izleyen küçük ölçekli bir kara aracında engel algılama, çarpışmasız kaçınma ve rotaya yeniden katılma başarısını nasıl etkiler?</w:t>
-      </w:r>
-      <w:r>
-        <w:t xml:space="preserve">”</w:t>
-      </w:r>
-      <w:r>
-        <w:t xml:space="preserve"> </w:t>
-      </w:r>
-      <w:r>
-        <w:t xml:space="preserve">biçiminde ele alınmaktadır. Geliştirilecek prototip üzerinde tekrarlanabilir deneyler gerçekleştirilmesi, başarılı ve başarısız durumların kaydedilmesi ve performansın ölçülebilir göstergelerle açıklanması amaçlanmaktadır. Kalibrasyon ve değerlendirmede güvenilir referans ölçümleri kullanılması, sensör çıktıları ile fiziksel hareket arasındaki ilişkinin incelenmesine dayanak sağlayacaktır (Hauser, t.y.-b). Bu kapsamda beklenen katkı; kullanıcı arayüzü, gömülü kontrol ve engelden kaçınma davranışının bütünleştirildiği bir prototip ile sınırları tanımlı deney koşullarına ait performans verilerinin oluşturulmasıdır.</w:t>
-      </w:r>
-    </w:p>
-    <w:bookmarkEnd w:id="22"/>
-    <w:bookmarkStart w:id="23" w:name="amaç-ve-hedefler"/>
-    <w:p>
-      <w:pPr>
-        <w:pStyle w:val="Heading3"/>
-      </w:pPr>
-      <w:r>
-        <w:t xml:space="preserve">1.2. Amaç ve hedefler</w:t>
-      </w:r>
-    </w:p>
-    <w:p>
-      <w:pPr>
-        <w:pStyle w:val="FirstParagraph"/>
-      </w:pPr>
-      <w:r>
-        <w:t xml:space="preserve">Projenin amacı, kullanıcı tarafından belirlenen waypoint rotasını izleyen küçük ölçekli bir kara aracında sabit engelin temas öncesinde algılanmasını, çarpışmasız kaçınma hareketinin gerçekleştirilmesini ve aynı rotaya yeniden katılarak görevin sürdürülmesini sağlayan bir prototip geliştirmektir. Bu bütünleşik davranışın başarısı, engel yerleşiminin değiştirildiği kontrollü ve tekrarlı deneylerle değerlendirilecektir.</w:t>
-      </w:r>
-    </w:p>
-    <w:p>
-      <w:pPr>
-        <w:pStyle w:val="BodyText"/>
-      </w:pPr>
-      <w:r>
-        <w:t xml:space="preserve">Bu amaca yönelik hedefler şunlardır:</w:t>
-      </w:r>
-    </w:p>
-    <w:p>
-      <w:pPr>
-        <w:pStyle w:val="Compact"/>
-        <w:numPr>
-          <w:ilvl w:val="0"/>
-          <w:numId w:val="1001"/>
-        </w:numPr>
-      </w:pPr>
-      <w:r>
-        <w:t xml:space="preserve">Yerel koordinatlarla sıralı rota tanımlama, rotayı araca aktarma, başlatma/durdurma ve görev durumunu izleme işlevlerini bilgisayar ve telefon tarayıcısında sunan bir arayüz geliştirmek.</w:t>
-      </w:r>
-    </w:p>
-    <w:p>
-      <w:pPr>
-        <w:pStyle w:val="Compact"/>
-        <w:numPr>
-          <w:ilvl w:val="0"/>
-          <w:numId w:val="1001"/>
-        </w:numPr>
-      </w:pPr>
-      <w:r>
-        <w:t xml:space="preserve">İki enkoderli motor, beş sabit ToF sensörü ve ESP32’yi bütünleştirmek; tekerlek hareketi, dönüş, sensör kapsaması ve durma davranışı için kalibrasyon kayıtları oluşturmak.</w:t>
-      </w:r>
-    </w:p>
-    <w:p>
-      <w:pPr>
-        <w:pStyle w:val="Compact"/>
-        <w:numPr>
-          <w:ilvl w:val="0"/>
-          <w:numId w:val="1001"/>
-        </w:numPr>
-      </w:pPr>
-      <w:r>
-        <w:t xml:space="preserve">Engel algılama, engel kenarını izleme ve rotaya dönüş davranışlarını durum/geçiş kurallarıyla gerçekleştirmek; waypoint sırasını kaçınma boyunca korumak.</w:t>
-      </w:r>
-    </w:p>
-    <w:p>
-      <w:pPr>
-        <w:pStyle w:val="Compact"/>
-        <w:numPr>
-          <w:ilvl w:val="0"/>
-          <w:numId w:val="1001"/>
-        </w:numPr>
-      </w:pPr>
-      <w:r>
-        <w:t xml:space="preserve">Engelsiz referans ve üç sabit engel yerleşiminde koşul başına 10, toplam 40 geçerli değerlendirme denemesi yürütmek.</w:t>
-      </w:r>
-    </w:p>
-    <w:p>
-      <w:pPr>
-        <w:pStyle w:val="Compact"/>
-        <w:numPr>
-          <w:ilvl w:val="0"/>
-          <w:numId w:val="1001"/>
-        </w:numPr>
-      </w:pPr>
-      <w:r>
-        <w:t xml:space="preserve">Her engelli koşulda en az 8/10 denemede temas öncesi algılama, çarpışmasız kaçınma, rotaya dönüş ve sıralı hedeflere erişimi 120 saniye içinde birlikte sağlamak. Waypoint erişiminde ve rotaya dönüşte 10 cm tolerans kullanmak.</w:t>
-      </w:r>
-    </w:p>
-    <w:p>
-      <w:pPr>
-        <w:pStyle w:val="Compact"/>
-        <w:numPr>
-          <w:ilvl w:val="0"/>
-          <w:numId w:val="1001"/>
-        </w:numPr>
-      </w:pPr>
-      <w:r>
-        <w:t xml:space="preserve">Başarılı ve başarısız denemeleri birlikte raporlamak; aşama bazlı başarı oranları, tamamlanma süreleri ve bağımsız görüntü ölçümünden elde edilen rota hatalarıyla engel yerleşimlerinin etkisini açıklamak.</w:t>
-      </w:r>
-    </w:p>
-    <w:p>
-      <w:pPr>
-        <w:pStyle w:val="FirstParagraph"/>
-      </w:pPr>
-      <w:r>
-        <w:t xml:space="preserve">Bu sayısal değerler araştırmanın başarı hedefleridir; çalışma sonunda ölçülecek performansı tanımlar.</w:t>
-      </w:r>
-    </w:p>
-    <w:bookmarkEnd w:id="23"/>
-    <w:bookmarkEnd w:id="24"/>
-    <w:bookmarkStart w:id="43" w:name="yöntem"/>
-    <w:p>
-      <w:pPr>
-        <w:pStyle w:val="Heading2"/>
-        <w:pageBreakBefore/>
-      </w:pPr>
-      <w:r>
-        <w:t xml:space="preserve">2. YÖNTEM</w:t>
-      </w:r>
-    </w:p>
-    <w:bookmarkStart w:id="25" w:name="X7b0ebfeb556529fc3ca809f82ae0cba7eaf9da9"/>
-    <w:p>
-      <w:pPr>
-        <w:pStyle w:val="Heading3"/>
-      </w:pPr>
-      <w:r>
-        <w:t xml:space="preserve">2.1. Araştırma tasarımı ve iş paketleriyle ilişki</w:t>
-      </w:r>
-    </w:p>
-    <w:p>
-      <w:pPr>
-        <w:pStyle w:val="FirstParagraph"/>
-      </w:pPr>
-      <w:r>
-        <w:t xml:space="preserve">Araştırma, prototip geliştirme ve kontrollü koşullarda tekrarlı deney tasarımına dayanmaktadır. Temel bağımsız değişken, aynı referans rota üzerindeki sabit engelin yerleşimidir. Bağımlı değişkenler; temas öncesi algılama, çarpışmasız kaçınma, rotaya dönüş ve görev tamamlama sonuçları ile süre ve rota izleme hatasıdır. Engel sayısı, boyutu ve yüzeyi engelli koşullar arasında sabit tutulacaktır. Başlangıç konumu/yönü, rota, zemin, hız ayarları ve son yazılım sürümü koşullar arasında değiştirilmeyecektir. Pil gerilimi, aydınlatma ve kontrol edilemeyen değişimler kaydedilecektir.</w:t>
-      </w:r>
-    </w:p>
-    <w:p>
-      <w:pPr>
-        <w:pStyle w:val="BodyText"/>
-      </w:pPr>
-      <w:r>
-        <w:t xml:space="preserve">Donanım ve kalibrasyon İP1, arayüz ve haberleşme İP2, konum kestirimi ve rota takibi İP3, kaçınma ve rotaya dönüş İP4 kapsamında geliştirilecektir. Bütünleşik sistemin dört koşulda değerlendirilmesi ve veri analizi İP5 kapsamında yapılacaktır. Geliştirme/ayar denemeleri, nihai 40 değerlendirme denemesinden ayrı tutulacaktır.</w:t>
-      </w:r>
-    </w:p>
-    <w:bookmarkEnd w:id="25"/>
-    <w:bookmarkStart w:id="29" w:name="X157134930360a1a904b3414a0b258b82cf01dd0"/>
-    <w:p>
-      <w:pPr>
-        <w:pStyle w:val="Heading3"/>
-      </w:pPr>
-      <w:r>
-        <w:t xml:space="preserve">2.2. Donanım mimarisi ve bileşen gereksinimleri</w:t>
-      </w:r>
-    </w:p>
-    <w:p>
-      <w:pPr>
-        <w:pStyle w:val="FirstParagraph"/>
-      </w:pPr>
-      <w:r>
-        <w:t xml:space="preserve">Araç, iki tahrik tekerinin bağımsız sürüldüğü ve bir serbest tekerlekle desteklendiği diferansiyel sürüş düzeninde kurulacaktır. Başlangıç mekanik tasarımında gövde zarfı en çok 25 × 20 cm olacak; tekerlekler, sensörler ve bağlantılar dahil gerçek dış ölçüler kaydedilecektir. Araç referans noktası, iki tahrik tekeri arasındaki aksın orta noktası olarak tanımlanacaktır.</w:t>
-      </w:r>
-    </w:p>
-    <w:p>
-      <w:pPr>
-        <w:pStyle w:val="BodyText"/>
-      </w:pPr>
-      <w:r>
-        <w:t xml:space="preserve">ESP32, enkoderleri okuyacak, mesafe ölçümlerini işleyecek, hareket kararlarını verecek ve motorları sürecektir. Bileşenler aşağıdaki işlevsel gereksinimlerle temin edilecektir. Ticari ürün kodu yerine bu gereksinimlerin esas alınması, eşdeğer ürünlerle aynı araştırma yönteminin uygulanmasını sağlayacaktır.</w:t>
-      </w:r>
-    </w:p>
-    <w:tbl>
-      <w:tblPr>
-        <w:tblStyle w:val="TableGrid"/>
-        <w:tblW w:type="pct" w:w="5000"/>
-        <w:jc w:val="left"/>
-        <w:tblLayout w:type="fixed"/>
-        <w:tblLook w:firstRow="1" w:lastRow="0" w:firstColumn="0" w:lastColumn="0" w:noHBand="0" w:noVBand="0" w:val="0020"/>
-      </w:tblPr>
-      <w:tblGrid>
-        <w:gridCol w:w="2098"/>
-        <w:gridCol w:w="794"/>
-        <w:gridCol w:w="6746"/>
-      </w:tblGrid>
-      <w:tr>
-        <w:trPr>
-          <w:tblHeader w:val="on"/>
-          <w:tblHeader/>
-          <w:cantSplit/>
-        </w:trPr>
-        <w:tc>
-          <w:tcPr>
-            <w:tcW w:type="dxa" w:w="2098"/>
-            <w:vAlign w:val="top"/>
-            <w:shd w:fill="EAF1F7"/>
-          </w:tcPr>
-          <w:p>
-            <w:pPr>
-              <w:pStyle w:val="Compact"/>
-              <w:spacing w:after="60" w:line="252" w:lineRule="auto"/>
-              <w:jc w:val="left"/>
-            </w:pPr>
-            <w:r>
-              <w:rPr>
-                <w:b/>
-                <w:sz w:val="19"/>
-              </w:rPr>
-              <w:t xml:space="preserve">Bileşen</w:t>
-            </w:r>
-          </w:p>
-        </w:tc>
-        <w:tc>
-          <w:tcPr>
-            <w:tcW w:type="dxa" w:w="794"/>
-            <w:vAlign w:val="top"/>
-            <w:shd w:fill="EAF1F7"/>
-          </w:tcPr>
-          <w:p>
-            <w:pPr>
-              <w:pStyle w:val="Compact"/>
-              <w:spacing w:after="60" w:line="252" w:lineRule="auto"/>
-              <w:jc w:val="left"/>
-            </w:pPr>
-            <w:r>
-              <w:rPr>
-                <w:b/>
-                <w:sz w:val="19"/>
-              </w:rPr>
-              <w:t xml:space="preserve">Miktar</w:t>
-            </w:r>
-          </w:p>
-        </w:tc>
-        <w:tc>
-          <w:tcPr>
-            <w:tcW w:type="dxa" w:w="6746"/>
-            <w:vAlign w:val="top"/>
-            <w:shd w:fill="EAF1F7"/>
-          </w:tcPr>
-          <w:p>
-            <w:pPr>
-              <w:pStyle w:val="Compact"/>
-              <w:spacing w:after="60" w:line="252" w:lineRule="auto"/>
-              <w:jc w:val="left"/>
-            </w:pPr>
-            <w:r>
-              <w:rPr>
-                <w:b/>
-                <w:sz w:val="19"/>
-              </w:rPr>
-              <w:t xml:space="preserve">Teknik gereksinim ve kullanım</w:t>
-            </w:r>
-          </w:p>
-        </w:tc>
-      </w:tr>
-      <w:tr>
-        <w:trPr>
-          <w:cantSplit/>
-        </w:trPr>
-        <w:tc>
-          <w:tcPr>
-            <w:tcW w:type="dxa" w:w="2098"/>
-            <w:vAlign w:val="top"/>
-          </w:tcPr>
-          <w:p>
-            <w:pPr>
-              <w:pStyle w:val="Compact"/>
-              <w:spacing w:after="60" w:line="252" w:lineRule="auto"/>
-              <w:jc w:val="left"/>
-            </w:pPr>
-            <w:r>
-              <w:rPr>
-                <w:sz w:val="19"/>
-              </w:rPr>
-              <w:t xml:space="preserve">ESP32 geliştirme kartı</w:t>
-            </w:r>
-          </w:p>
-        </w:tc>
-        <w:tc>
-          <w:tcPr>
-            <w:tcW w:type="dxa" w:w="794"/>
-            <w:vAlign w:val="top"/>
-          </w:tcPr>
-          <w:p>
-            <w:pPr>
-              <w:pStyle w:val="Compact"/>
-              <w:spacing w:after="60" w:line="252" w:lineRule="auto"/>
-              <w:jc w:val="left"/>
-            </w:pPr>
-            <w:r>
-              <w:rPr>
-                <w:sz w:val="19"/>
-              </w:rPr>
-              <w:t xml:space="preserve">1</w:t>
-            </w:r>
-          </w:p>
-        </w:tc>
-        <w:tc>
-          <w:tcPr>
-            <w:tcW w:type="dxa" w:w="6746"/>
-            <w:vAlign w:val="top"/>
-          </w:tcPr>
-          <w:p>
-            <w:pPr>
-              <w:pStyle w:val="Compact"/>
-              <w:spacing w:after="60" w:line="252" w:lineRule="auto"/>
-              <w:jc w:val="left"/>
-            </w:pPr>
-            <w:r>
-              <w:rPr>
-                <w:sz w:val="19"/>
-              </w:rPr>
-              <w:t xml:space="preserve">Wi-Fi, 3,3 V sayısal arayüzler, enkoder okumaya ve iki motorun bağımsız hız/yön kontrolüne yeterli giriş/çıkış.</w:t>
-            </w:r>
-          </w:p>
-        </w:tc>
-      </w:tr>
-      <w:tr>
-        <w:trPr>
-          <w:cantSplit/>
-        </w:trPr>
-        <w:tc>
-          <w:tcPr>
-            <w:tcW w:type="dxa" w:w="2098"/>
-            <w:vAlign w:val="top"/>
-          </w:tcPr>
-          <w:p>
-            <w:pPr>
-              <w:pStyle w:val="Compact"/>
-              <w:spacing w:after="60" w:line="252" w:lineRule="auto"/>
-              <w:jc w:val="left"/>
-            </w:pPr>
-            <w:r>
-              <w:rPr>
-                <w:sz w:val="19"/>
-              </w:rPr>
-              <w:t xml:space="preserve">Enkoderli DC motor</w:t>
-            </w:r>
-          </w:p>
-        </w:tc>
-        <w:tc>
-          <w:tcPr>
-            <w:tcW w:type="dxa" w:w="794"/>
-            <w:vAlign w:val="top"/>
-          </w:tcPr>
-          <w:p>
-            <w:pPr>
-              <w:pStyle w:val="Compact"/>
-              <w:spacing w:after="60" w:line="252" w:lineRule="auto"/>
-              <w:jc w:val="left"/>
-            </w:pPr>
-            <w:r>
-              <w:rPr>
-                <w:sz w:val="19"/>
-              </w:rPr>
-              <w:t xml:space="preserve">2</w:t>
-            </w:r>
-          </w:p>
-        </w:tc>
-        <w:tc>
-          <w:tcPr>
-            <w:tcW w:type="dxa" w:w="6746"/>
-            <w:vAlign w:val="top"/>
-          </w:tcPr>
-          <w:p>
-            <w:pPr>
-              <w:pStyle w:val="Compact"/>
-              <w:spacing w:after="60" w:line="252" w:lineRule="auto"/>
-              <w:jc w:val="left"/>
-            </w:pPr>
-            <w:r>
-              <w:rPr>
-                <w:sz w:val="19"/>
-              </w:rPr>
-              <w:t xml:space="preserve">Aynı model, redüktörlü; 5 V motor beslemesinde 0,10 m/s araç hızını sağlayan tork/hız ve 3,3 V uyumlu ya da seviyelendirilmiş A/B geri bildirim çıkışları.</w:t>
-            </w:r>
-          </w:p>
-        </w:tc>
-      </w:tr>
-      <w:tr>
-        <w:trPr>
-          <w:cantSplit/>
-        </w:trPr>
-        <w:tc>
-          <w:tcPr>
-            <w:tcW w:type="dxa" w:w="2098"/>
-            <w:vAlign w:val="top"/>
-          </w:tcPr>
-          <w:p>
-            <w:pPr>
-              <w:pStyle w:val="Compact"/>
-              <w:spacing w:after="60" w:line="252" w:lineRule="auto"/>
-              <w:jc w:val="left"/>
-            </w:pPr>
-            <w:r>
-              <w:rPr>
-                <w:sz w:val="19"/>
-              </w:rPr>
-              <w:t xml:space="preserve">Çift kanallı motor sürücü düzeni</w:t>
-            </w:r>
-          </w:p>
-        </w:tc>
-        <w:tc>
-          <w:tcPr>
-            <w:tcW w:type="dxa" w:w="794"/>
-            <w:vAlign w:val="top"/>
-          </w:tcPr>
-          <w:p>
-            <w:pPr>
-              <w:pStyle w:val="Compact"/>
-              <w:spacing w:after="60" w:line="252" w:lineRule="auto"/>
-              <w:jc w:val="left"/>
-            </w:pPr>
-            <w:r>
-              <w:rPr>
-                <w:sz w:val="19"/>
-              </w:rPr>
-              <w:t xml:space="preserve">1 takım</w:t>
-            </w:r>
-          </w:p>
-        </w:tc>
-        <w:tc>
-          <w:tcPr>
-            <w:tcW w:type="dxa" w:w="6746"/>
-            <w:vAlign w:val="top"/>
-          </w:tcPr>
-          <w:p>
-            <w:pPr>
-              <w:pStyle w:val="Compact"/>
-              <w:spacing w:after="60" w:line="252" w:lineRule="auto"/>
-              <w:jc w:val="left"/>
-            </w:pPr>
-            <w:r>
-              <w:rPr>
-                <w:sz w:val="19"/>
-              </w:rPr>
-              <w:t xml:space="preserve">3,3 V kontrol uyumu; her kanalın sürekli ve kısa süreli akım kapasitesinin motorun yük ve kalkış/sıkışma gereksinimlerini karşılaması.</w:t>
-            </w:r>
-          </w:p>
-        </w:tc>
-      </w:tr>
-      <w:tr>
-        <w:trPr>
-          <w:cantSplit/>
-        </w:trPr>
-        <w:tc>
-          <w:tcPr>
-            <w:tcW w:type="dxa" w:w="2098"/>
-            <w:vAlign w:val="top"/>
-          </w:tcPr>
-          <w:p>
-            <w:pPr>
-              <w:pStyle w:val="Compact"/>
-              <w:spacing w:after="60" w:line="252" w:lineRule="auto"/>
-              <w:jc w:val="left"/>
-            </w:pPr>
-            <w:r>
-              <w:rPr>
-                <w:sz w:val="19"/>
-              </w:rPr>
-              <w:t xml:space="preserve">Sabit ToF mesafe sensörü</w:t>
-            </w:r>
-          </w:p>
-        </w:tc>
-        <w:tc>
-          <w:tcPr>
-            <w:tcW w:type="dxa" w:w="794"/>
-            <w:vAlign w:val="top"/>
-          </w:tcPr>
-          <w:p>
-            <w:pPr>
-              <w:pStyle w:val="Compact"/>
-              <w:spacing w:after="60" w:line="252" w:lineRule="auto"/>
-              <w:jc w:val="left"/>
-            </w:pPr>
-            <w:r>
-              <w:rPr>
-                <w:sz w:val="19"/>
-              </w:rPr>
-              <w:t xml:space="preserve">5</w:t>
-            </w:r>
-          </w:p>
-        </w:tc>
-        <w:tc>
-          <w:tcPr>
-            <w:tcW w:type="dxa" w:w="6746"/>
-            <w:vAlign w:val="top"/>
-          </w:tcPr>
-          <w:p>
-            <w:pPr>
-              <w:pStyle w:val="Compact"/>
-              <w:spacing w:after="60" w:line="252" w:lineRule="auto"/>
-              <w:jc w:val="left"/>
-            </w:pPr>
-            <w:r>
-              <w:rPr>
-                <w:sz w:val="19"/>
-              </w:rPr>
-              <w:t xml:space="preserve">Ön orta, iki ön çapraz ve iki yan yerleşim; 3,3 V uyumlu taşıyıcı arayüzü; beşli taramayı 200 ms içinde tamamlayan ölçüm düzeni ve geçersiz ölçüm bilgisinin okunması.</w:t>
-            </w:r>
-          </w:p>
-        </w:tc>
-      </w:tr>
-      <w:tr>
-        <w:trPr>
-          <w:cantSplit/>
-        </w:trPr>
-        <w:tc>
-          <w:tcPr>
-            <w:tcW w:type="dxa" w:w="2098"/>
-            <w:vAlign w:val="top"/>
-          </w:tcPr>
-          <w:p>
-            <w:pPr>
-              <w:pStyle w:val="Compact"/>
-              <w:spacing w:after="60" w:line="252" w:lineRule="auto"/>
-              <w:jc w:val="left"/>
-            </w:pPr>
-            <w:r>
-              <w:rPr>
-                <w:sz w:val="19"/>
-              </w:rPr>
-              <w:t xml:space="preserve">I²C çoklayıcı</w:t>
-            </w:r>
-          </w:p>
-        </w:tc>
-        <w:tc>
-          <w:tcPr>
-            <w:tcW w:type="dxa" w:w="794"/>
-            <w:vAlign w:val="top"/>
-          </w:tcPr>
-          <w:p>
-            <w:pPr>
-              <w:pStyle w:val="Compact"/>
-              <w:spacing w:after="60" w:line="252" w:lineRule="auto"/>
-              <w:jc w:val="left"/>
-            </w:pPr>
-            <w:r>
-              <w:rPr>
-                <w:sz w:val="19"/>
-              </w:rPr>
-              <w:t xml:space="preserve">1</w:t>
-            </w:r>
-          </w:p>
-        </w:tc>
-        <w:tc>
-          <w:tcPr>
-            <w:tcW w:type="dxa" w:w="6746"/>
-            <w:vAlign w:val="top"/>
-          </w:tcPr>
-          <w:p>
-            <w:pPr>
-              <w:pStyle w:val="Compact"/>
-              <w:spacing w:after="60" w:line="252" w:lineRule="auto"/>
-              <w:jc w:val="left"/>
-            </w:pPr>
-            <w:r>
-              <w:rPr>
-                <w:sz w:val="19"/>
-              </w:rPr>
-              <w:t xml:space="preserve">Beş sensörü ayrı kanallardan seçerek okumaya uygun, en az beş kanallı ve 3,3 V mantık uyumlu düzen.</w:t>
-            </w:r>
-          </w:p>
-        </w:tc>
-      </w:tr>
-      <w:tr>
-        <w:trPr>
-          <w:cantSplit/>
-        </w:trPr>
-        <w:tc>
-          <w:tcPr>
-            <w:tcW w:type="dxa" w:w="2098"/>
-            <w:vAlign w:val="top"/>
-          </w:tcPr>
-          <w:p>
-            <w:pPr>
-              <w:pStyle w:val="Compact"/>
-              <w:spacing w:after="60" w:line="252" w:lineRule="auto"/>
-              <w:jc w:val="left"/>
-            </w:pPr>
-            <w:r>
-              <w:rPr>
-                <w:sz w:val="19"/>
-              </w:rPr>
-              <w:t xml:space="preserve">Güç altyapısı</w:t>
-            </w:r>
-          </w:p>
-        </w:tc>
-        <w:tc>
-          <w:tcPr>
-            <w:tcW w:type="dxa" w:w="794"/>
-            <w:vAlign w:val="top"/>
-          </w:tcPr>
-          <w:p>
-            <w:pPr>
-              <w:pStyle w:val="Compact"/>
-              <w:spacing w:after="60" w:line="252" w:lineRule="auto"/>
-              <w:jc w:val="left"/>
-            </w:pPr>
-            <w:r>
-              <w:rPr>
-                <w:sz w:val="19"/>
-              </w:rPr>
-              <w:t xml:space="preserve">1 takım</w:t>
-            </w:r>
-          </w:p>
-        </w:tc>
-        <w:tc>
-          <w:tcPr>
-            <w:tcW w:type="dxa" w:w="6746"/>
-            <w:vAlign w:val="top"/>
-          </w:tcPr>
-          <w:p>
-            <w:pPr>
-              <w:pStyle w:val="Compact"/>
-              <w:spacing w:after="60" w:line="252" w:lineRule="auto"/>
-              <w:jc w:val="left"/>
-            </w:pPr>
-            <w:r>
-              <w:rPr>
-                <w:sz w:val="19"/>
-              </w:rPr>
-              <w:t xml:space="preserve">Hazır 2S batarya, kimyası ve bağlantılarıyla uyumlu şarj cihazı, paket koruması, 5 V ve 3,3 V düzenlenmiş besleme dalları.</w:t>
-            </w:r>
-          </w:p>
-        </w:tc>
-      </w:tr>
-    </w:tbl>
-    <w:p>
-      <w:pPr>
-        <w:pStyle w:val="BodyText"/>
-      </w:pPr>
-      <w:r>
-        <w:t xml:space="preserve">Sensörlerin başlangıç yönleri ileri eksene göre 0°, ±45° ve ±90° olacaktır. Ön sensörler yaklaşan engeli, yan sensörler engel kenarındaki açıklığı izleyecektir. Montaj yüksekliği, ışınların deney engelini göreceği biçimde ayarlanacak; gerçek kapsama ve kör bölgeler kalibrasyon kaydına işlenecektir. Beş sensörün varlığı kesintisiz çevre algısı olarak yorumlanmayacaktır.</w:t>
-      </w:r>
-    </w:p>
-    <w:p>
-      <w:pPr>
-        <w:pStyle w:val="BodyText"/>
-      </w:pPr>
-      <w:r>
-        <w:t xml:space="preserve">Motorlar ve kontrol elektroniği ayrı güç kablo dallarından beslenecek, ortak toprak referansı kullanılacaktır. Bataryanın ham gerilimi motorlara veya ESP32 giriş/çıkışlarına uygulanmayacaktır. Motor sürücüsü, regülatör, kablo ve koruma elemanları iki motorun birlikte kalkış/yük akımı esas alınarak boyutlandırılacaktır. Ürünlerin gerilim, akım, bağlantı ve şarj uyumu, montajın giriş kontrolünde veri sayfaları ve elektriksel kontrollerle doğrulanacaktır.</w:t>
-      </w:r>
-    </w:p>
-    <w:p>
-      <w:pPr>
-        <w:pStyle w:val="BodyText"/>
-        <w:keepNext/>
-        <w:spacing w:after="40"/>
+        <w:pBdr>
+          <w:top w:val="single" w:sz="5" w:space="10" w:color="203E5C"/>
+        </w:pBdr>
+        <w:spacing w:before="400" w:after="40"/>
         <w:jc w:val="center"/>
       </w:pPr>
       <w:r>
         <w:drawing>
           <wp:inline>
-            <wp:extent cx="6048000" cy="4031999"/>
+            <wp:extent cx="936000" cy="1144000"/>
             <wp:effectExtent b="0" l="0" r="0" t="0"/>
-            <wp:docPr descr="Şekil 1 — Sistem mimarisi" title="" id="27" name="Picture"/>
+            <wp:docPr descr="TÜBİTAK logosu" title="" id="21" name="Picture"/>
             <a:graphic>
               <a:graphicData uri="http://schemas.openxmlformats.org/drawingml/2006/picture">
                 <pic:pic>
                   <pic:nvPicPr>
-                    <pic:cNvPr descr="gorseller/danisman_sunumu/sekil_1_sistem_mimarisi.png" id="28" name="Picture"/>
+                    <pic:cNvPr descr="belge_kaynaklari/varliklar/tubitak_logo.png" id="22" name="Picture"/>
                     <pic:cNvPicPr>
                       <a:picLocks noChangeArrowheads="1" noChangeAspect="1"/>
                     </pic:cNvPicPr>
                   </pic:nvPicPr>
                   <pic:blipFill>
-                    <a:blip r:embed="rId26"/>
+                    <a:blip r:embed="rId20"/>
                     <a:stretch>
                       <a:fillRect/>
                     </a:stretch>
@@ -1411,7 +36,7 @@
                   <pic:spPr bwMode="auto">
                     <a:xfrm>
                       <a:off x="0" y="0"/>
-                      <a:ext cx="6048000" cy="4031999"/>
+                      <a:ext cx="936000" cy="1144000"/>
                     </a:xfrm>
                     <a:prstGeom prst="rect">
                       <a:avLst/>
@@ -1430,6 +55,1548 @@
         </w:drawing>
       </w:r>
     </w:p>
+    <w:bookmarkStart w:id="63" w:name="tübitak-2209-a"/>
+    <w:p>
+      <w:pPr>
+        <w:pStyle w:val="Heading1"/>
+        <w:keepNext/>
+        <w:spacing w:after="280" w:before="300"/>
+        <w:jc w:val="center"/>
+      </w:pPr>
+      <w:r>
+        <w:rPr>
+          <w:rFonts w:ascii="Arial" w:hAnsi="Arial"/>
+          <w:color w:val="203E5C"/>
+          <w:sz w:val="44"/>
+        </w:rPr>
+        <w:t xml:space="preserve">TÜBİTAK 2209-A</w:t>
+      </w:r>
+    </w:p>
+    <w:p>
+      <w:pPr>
+        <w:pStyle w:val="FirstParagraph"/>
+        <w:keepNext/>
+        <w:spacing w:after="280"/>
+        <w:jc w:val="center"/>
+      </w:pPr>
+      <w:r>
+        <w:rPr>
+          <w:rFonts w:ascii="Arial" w:hAnsi="Arial"/>
+          <w:b/>
+          <w:bCs/>
+          <w:color w:val="203E5C"/>
+          <w:sz w:val="30"/>
+        </w:rPr>
+        <w:t xml:space="preserve">ÜNİVERSİTE ÖĞRENCİLERİ ARAŞTIRMA PROJELERİ DESTEKLEME PROGRAMI</w:t>
+      </w:r>
+    </w:p>
+    <w:p>
+      <w:pPr>
+        <w:pStyle w:val="BodyText"/>
+        <w:keepNext/>
+        <w:spacing w:after="280" w:before="360"/>
+        <w:jc w:val="center"/>
+      </w:pPr>
+      <w:r>
+        <w:rPr>
+          <w:rFonts w:ascii="Arial" w:hAnsi="Arial"/>
+          <w:b/>
+          <w:bCs/>
+          <w:color w:val="203E5C"/>
+          <w:sz w:val="38"/>
+        </w:rPr>
+        <w:t xml:space="preserve">ARAŞTIRMA ÖNERİSİ</w:t>
+      </w:r>
+    </w:p>
+    <w:p>
+      <w:pPr>
+        <w:pStyle w:val="BodyText"/>
+        <w:keepNext/>
+        <w:spacing w:after="560" w:before="600"/>
+        <w:jc w:val="center"/>
+      </w:pPr>
+      <w:r>
+        <w:rPr>
+          <w:rFonts w:ascii="Arial" w:hAnsi="Arial"/>
+          <w:b/>
+          <w:bCs/>
+          <w:color w:val="203E5C"/>
+          <w:sz w:val="28"/>
+        </w:rPr>
+        <w:t xml:space="preserve">Kullanıcı tarafından belirlenen rota bilgisine göre hareket eden otonom araç tasarımı</w:t>
+      </w:r>
+    </w:p>
+    <w:p>
+      <w:pPr>
+        <w:pStyle w:val="BodyText"/>
+        <w:keepNext/>
+        <w:spacing w:after="280"/>
+        <w:jc w:val="center"/>
+      </w:pPr>
+      <w:r>
+        <w:rPr>
+          <w:rFonts w:ascii="Arial" w:hAnsi="Arial"/>
+          <w:b/>
+          <w:bCs/>
+          <w:color w:val="203E5C"/>
+        </w:rPr>
+        <w:t xml:space="preserve">Proje yürütücüsü</w:t>
+      </w:r>
+      <w:r>
+        <w:rPr>
+          <w:rFonts w:ascii="Arial" w:hAnsi="Arial"/>
+          <w:color w:val="203E5C"/>
+        </w:rPr>
+        <w:br/>
+      </w:r>
+      <w:r>
+        <w:rPr>
+          <w:rFonts w:ascii="Arial" w:hAnsi="Arial"/>
+          <w:color w:val="203E5C"/>
+        </w:rPr>
+        <w:t xml:space="preserve">Ahmet Talha Arslan</w:t>
+      </w:r>
+    </w:p>
+    <w:p>
+      <w:pPr>
+        <w:pStyle w:val="BodyText"/>
+        <w:keepNext/>
+        <w:spacing w:after="280"/>
+        <w:jc w:val="center"/>
+      </w:pPr>
+      <w:r>
+        <w:rPr>
+          <w:rFonts w:ascii="Arial" w:hAnsi="Arial"/>
+          <w:b/>
+          <w:bCs/>
+          <w:color w:val="203E5C"/>
+        </w:rPr>
+        <w:t xml:space="preserve">Akademik danışman</w:t>
+      </w:r>
+      <w:r>
+        <w:rPr>
+          <w:rFonts w:ascii="Arial" w:hAnsi="Arial"/>
+          <w:color w:val="203E5C"/>
+        </w:rPr>
+        <w:br/>
+      </w:r>
+      <w:r>
+        <w:rPr>
+          <w:rFonts w:ascii="Arial" w:hAnsi="Arial"/>
+          <w:color w:val="203E5C"/>
+        </w:rPr>
+        <w:t xml:space="preserve">Prof. Dr. Murat Ceylan</w:t>
+      </w:r>
+    </w:p>
+    <w:p>
+      <w:pPr>
+        <w:pStyle w:val="BodyText"/>
+        <w:keepNext/>
+        <w:spacing w:after="280"/>
+        <w:jc w:val="center"/>
+      </w:pPr>
+      <w:r>
+        <w:rPr>
+          <w:rFonts w:ascii="Arial" w:hAnsi="Arial"/>
+          <w:b/>
+          <w:bCs/>
+          <w:color w:val="203E5C"/>
+        </w:rPr>
+        <w:t xml:space="preserve">Konya Teknik Üniversitesi</w:t>
+      </w:r>
+      <w:r>
+        <w:rPr>
+          <w:rFonts w:ascii="Arial" w:hAnsi="Arial"/>
+          <w:color w:val="203E5C"/>
+        </w:rPr>
+        <w:br/>
+      </w:r>
+      <w:r>
+        <w:rPr>
+          <w:rFonts w:ascii="Arial" w:hAnsi="Arial"/>
+          <w:color w:val="203E5C"/>
+        </w:rPr>
+        <w:t xml:space="preserve">Elektrik-Elektronik Mühendisliği</w:t>
+      </w:r>
+    </w:p>
+    <w:p>
+      <w:pPr>
+        <w:pStyle w:val="BodyText"/>
+        <w:keepNext w:val="0"/>
+        <w:spacing w:after="280" w:before="600"/>
+        <w:jc w:val="center"/>
+        <w:pBdr>
+          <w:bottom w:val="single" w:sz="5" w:space="10" w:color="CBD7E0"/>
+        </w:pBdr>
+      </w:pPr>
+      <w:r>
+        <w:rPr>
+          <w:rFonts w:ascii="Arial" w:hAnsi="Arial"/>
+          <w:b/>
+          <w:bCs/>
+          <w:color w:val="203E5C"/>
+          <w:sz w:val="28"/>
+        </w:rPr>
+        <w:t xml:space="preserve">2026 YILI</w:t>
+      </w:r>
+    </w:p>
+    <w:bookmarkStart w:id="23" w:name="a.-genel-bilgiler"/>
+    <w:p>
+      <w:pPr>
+        <w:pStyle w:val="Heading2"/>
+        <w:pageBreakBefore/>
+      </w:pPr>
+      <w:r>
+        <w:t xml:space="preserve">A. GENEL BİLGİLER</w:t>
+      </w:r>
+    </w:p>
+    <w:tbl>
+      <w:tblPr>
+        <w:tblStyle w:val="TableGrid"/>
+        <w:tblW w:type="pct" w:w="5000"/>
+        <w:jc w:val="left"/>
+        <w:tblLayout w:type="fixed"/>
+        <w:tblLook w:firstRow="1" w:lastRow="0" w:firstColumn="0" w:lastColumn="0" w:noHBand="0" w:noVBand="0" w:val="0020"/>
+        <w:tblBorders>
+          <w:top w:val="single" w:sz="4" w:color="879CAE"/>
+          <w:left w:val="single" w:sz="4" w:color="879CAE"/>
+          <w:bottom w:val="single" w:sz="4" w:color="879CAE"/>
+          <w:right w:val="single" w:sz="4" w:color="879CAE"/>
+          <w:insideH w:val="single" w:sz="4" w:color="879CAE"/>
+          <w:insideV w:val="single" w:sz="4" w:color="879CAE"/>
+        </w:tblBorders>
+      </w:tblPr>
+      <w:tblGrid>
+        <w:gridCol w:w="2381"/>
+        <w:gridCol w:w="7257"/>
+      </w:tblGrid>
+      <w:tr>
+        <w:trPr>
+          <w:tblHeader w:val="on"/>
+          <w:tblHeader/>
+          <w:cantSplit/>
+        </w:trPr>
+        <w:tc>
+          <w:tcPr>
+            <w:tcW w:type="dxa" w:w="2381"/>
+            <w:vAlign w:val="top"/>
+            <w:shd w:fill="EAF1F7"/>
+          </w:tcPr>
+          <w:p>
+            <w:pPr>
+              <w:pStyle w:val="Compact"/>
+              <w:spacing w:after="60" w:line="252" w:lineRule="auto"/>
+              <w:jc w:val="left"/>
+            </w:pPr>
+            <w:r>
+              <w:rPr>
+                <w:b/>
+                <w:sz w:val="19"/>
+              </w:rPr>
+              <w:t xml:space="preserve">Alan</w:t>
+            </w:r>
+          </w:p>
+        </w:tc>
+        <w:tc>
+          <w:tcPr>
+            <w:tcW w:type="dxa" w:w="7257"/>
+            <w:vAlign w:val="top"/>
+            <w:shd w:fill="EAF1F7"/>
+          </w:tcPr>
+          <w:p>
+            <w:pPr>
+              <w:pStyle w:val="Compact"/>
+              <w:spacing w:after="60" w:line="252" w:lineRule="auto"/>
+              <w:jc w:val="left"/>
+            </w:pPr>
+            <w:r>
+              <w:rPr>
+                <w:b/>
+                <w:sz w:val="19"/>
+              </w:rPr>
+              <w:t xml:space="preserve">Bilgi</w:t>
+            </w:r>
+          </w:p>
+        </w:tc>
+      </w:tr>
+      <w:tr>
+        <w:trPr>
+          <w:cantSplit/>
+        </w:trPr>
+        <w:tc>
+          <w:tcPr>
+            <w:tcW w:type="dxa" w:w="2381"/>
+            <w:vAlign w:val="top"/>
+          </w:tcPr>
+          <w:p>
+            <w:pPr>
+              <w:pStyle w:val="Compact"/>
+              <w:spacing w:after="60" w:line="252" w:lineRule="auto"/>
+              <w:jc w:val="left"/>
+            </w:pPr>
+            <w:r>
+              <w:rPr>
+                <w:sz w:val="19"/>
+              </w:rPr>
+              <w:t xml:space="preserve">Başvuru sahibinin adı soyadı</w:t>
+            </w:r>
+          </w:p>
+        </w:tc>
+        <w:tc>
+          <w:tcPr>
+            <w:tcW w:type="dxa" w:w="7257"/>
+            <w:vAlign w:val="top"/>
+          </w:tcPr>
+          <w:p>
+            <w:pPr>
+              <w:pStyle w:val="Compact"/>
+              <w:spacing w:after="60" w:line="252" w:lineRule="auto"/>
+              <w:jc w:val="left"/>
+            </w:pPr>
+            <w:r>
+              <w:rPr>
+                <w:sz w:val="19"/>
+              </w:rPr>
+              <w:t xml:space="preserve">Ahmet Talha Arslan</w:t>
+            </w:r>
+          </w:p>
+        </w:tc>
+      </w:tr>
+      <w:tr>
+        <w:trPr>
+          <w:cantSplit/>
+        </w:trPr>
+        <w:tc>
+          <w:tcPr>
+            <w:tcW w:type="dxa" w:w="2381"/>
+            <w:vAlign w:val="top"/>
+          </w:tcPr>
+          <w:p>
+            <w:pPr>
+              <w:pStyle w:val="Compact"/>
+              <w:spacing w:after="60" w:line="252" w:lineRule="auto"/>
+              <w:jc w:val="left"/>
+            </w:pPr>
+            <w:r>
+              <w:rPr>
+                <w:sz w:val="19"/>
+              </w:rPr>
+              <w:t xml:space="preserve">Araştırma önerisinin başlığı</w:t>
+            </w:r>
+          </w:p>
+        </w:tc>
+        <w:tc>
+          <w:tcPr>
+            <w:tcW w:type="dxa" w:w="7257"/>
+            <w:vAlign w:val="top"/>
+          </w:tcPr>
+          <w:p>
+            <w:pPr>
+              <w:pStyle w:val="Compact"/>
+              <w:spacing w:after="60" w:line="252" w:lineRule="auto"/>
+              <w:jc w:val="left"/>
+            </w:pPr>
+            <w:r>
+              <w:rPr>
+                <w:sz w:val="19"/>
+              </w:rPr>
+              <w:t xml:space="preserve">Kullanıcı tarafından belirlenen rota bilgisine göre hareket eden otonom araç tasarımı</w:t>
+            </w:r>
+          </w:p>
+        </w:tc>
+      </w:tr>
+      <w:tr>
+        <w:trPr>
+          <w:cantSplit/>
+        </w:trPr>
+        <w:tc>
+          <w:tcPr>
+            <w:tcW w:type="dxa" w:w="2381"/>
+            <w:vAlign w:val="top"/>
+          </w:tcPr>
+          <w:p>
+            <w:pPr>
+              <w:pStyle w:val="Compact"/>
+              <w:spacing w:after="60" w:line="252" w:lineRule="auto"/>
+              <w:jc w:val="left"/>
+            </w:pPr>
+            <w:r>
+              <w:rPr>
+                <w:sz w:val="19"/>
+              </w:rPr>
+              <w:t xml:space="preserve">Akademik danışman</w:t>
+            </w:r>
+          </w:p>
+        </w:tc>
+        <w:tc>
+          <w:tcPr>
+            <w:tcW w:type="dxa" w:w="7257"/>
+            <w:vAlign w:val="top"/>
+          </w:tcPr>
+          <w:p>
+            <w:pPr>
+              <w:pStyle w:val="Compact"/>
+              <w:spacing w:after="60" w:line="252" w:lineRule="auto"/>
+              <w:jc w:val="left"/>
+            </w:pPr>
+            <w:r>
+              <w:rPr>
+                <w:sz w:val="19"/>
+              </w:rPr>
+              <w:t xml:space="preserve">Prof. Dr. Murat Ceylan</w:t>
+            </w:r>
+          </w:p>
+        </w:tc>
+      </w:tr>
+      <w:tr>
+        <w:trPr>
+          <w:cantSplit/>
+        </w:trPr>
+        <w:tc>
+          <w:tcPr>
+            <w:tcW w:type="dxa" w:w="2381"/>
+            <w:vAlign w:val="top"/>
+          </w:tcPr>
+          <w:p>
+            <w:pPr>
+              <w:pStyle w:val="Compact"/>
+              <w:spacing w:after="60" w:line="252" w:lineRule="auto"/>
+              <w:jc w:val="left"/>
+            </w:pPr>
+            <w:r>
+              <w:rPr>
+                <w:sz w:val="19"/>
+              </w:rPr>
+              <w:t xml:space="preserve">Üniversite / bölüm</w:t>
+            </w:r>
+          </w:p>
+        </w:tc>
+        <w:tc>
+          <w:tcPr>
+            <w:tcW w:type="dxa" w:w="7257"/>
+            <w:vAlign w:val="top"/>
+          </w:tcPr>
+          <w:p>
+            <w:pPr>
+              <w:pStyle w:val="Compact"/>
+              <w:spacing w:after="60" w:line="252" w:lineRule="auto"/>
+              <w:jc w:val="left"/>
+            </w:pPr>
+            <w:r>
+              <w:rPr>
+                <w:sz w:val="19"/>
+              </w:rPr>
+              <w:t xml:space="preserve">Konya Teknik Üniversitesi / Elektrik-Elektronik Mühendisliği</w:t>
+            </w:r>
+          </w:p>
+        </w:tc>
+      </w:tr>
+      <w:tr>
+        <w:trPr>
+          <w:cantSplit/>
+        </w:trPr>
+        <w:tc>
+          <w:tcPr>
+            <w:tcW w:type="dxa" w:w="2381"/>
+            <w:vAlign w:val="top"/>
+          </w:tcPr>
+          <w:p>
+            <w:pPr>
+              <w:pStyle w:val="Compact"/>
+              <w:spacing w:after="60" w:line="252" w:lineRule="auto"/>
+              <w:jc w:val="left"/>
+            </w:pPr>
+            <w:r>
+              <w:rPr>
+                <w:sz w:val="19"/>
+              </w:rPr>
+              <w:t xml:space="preserve">Öğrenim düzeyi</w:t>
+            </w:r>
+          </w:p>
+        </w:tc>
+        <w:tc>
+          <w:tcPr>
+            <w:tcW w:type="dxa" w:w="7257"/>
+            <w:vAlign w:val="top"/>
+          </w:tcPr>
+          <w:p>
+            <w:pPr>
+              <w:pStyle w:val="Compact"/>
+              <w:spacing w:after="60" w:line="252" w:lineRule="auto"/>
+              <w:jc w:val="left"/>
+            </w:pPr>
+            <w:r>
+              <w:rPr>
+                <w:sz w:val="19"/>
+              </w:rPr>
+              <w:t xml:space="preserve">Lisans, 4. sınıf</w:t>
+            </w:r>
+          </w:p>
+        </w:tc>
+      </w:tr>
+      <w:tr>
+        <w:trPr>
+          <w:cantSplit/>
+        </w:trPr>
+        <w:tc>
+          <w:tcPr>
+            <w:tcW w:type="dxa" w:w="2381"/>
+            <w:vAlign w:val="top"/>
+          </w:tcPr>
+          <w:p>
+            <w:pPr>
+              <w:pStyle w:val="Compact"/>
+              <w:spacing w:after="60" w:line="252" w:lineRule="auto"/>
+              <w:jc w:val="left"/>
+            </w:pPr>
+            <w:r>
+              <w:rPr>
+                <w:sz w:val="19"/>
+              </w:rPr>
+              <w:t xml:space="preserve">Proje ekibi</w:t>
+            </w:r>
+          </w:p>
+        </w:tc>
+        <w:tc>
+          <w:tcPr>
+            <w:tcW w:type="dxa" w:w="7257"/>
+            <w:vAlign w:val="top"/>
+          </w:tcPr>
+          <w:p>
+            <w:pPr>
+              <w:pStyle w:val="Compact"/>
+              <w:spacing w:after="60" w:line="252" w:lineRule="auto"/>
+              <w:jc w:val="left"/>
+            </w:pPr>
+            <w:r>
+              <w:rPr>
+                <w:sz w:val="19"/>
+              </w:rPr>
+              <w:t xml:space="preserve">Bir öğrenci yürütücü</w:t>
+            </w:r>
+          </w:p>
+        </w:tc>
+      </w:tr>
+      <w:tr>
+        <w:trPr>
+          <w:cantSplit/>
+        </w:trPr>
+        <w:tc>
+          <w:tcPr>
+            <w:tcW w:type="dxa" w:w="2381"/>
+            <w:vAlign w:val="top"/>
+          </w:tcPr>
+          <w:p>
+            <w:pPr>
+              <w:pStyle w:val="Compact"/>
+              <w:spacing w:after="60" w:line="252" w:lineRule="auto"/>
+              <w:jc w:val="left"/>
+            </w:pPr>
+            <w:r>
+              <w:rPr>
+                <w:sz w:val="19"/>
+              </w:rPr>
+              <w:t xml:space="preserve">Proje süresi</w:t>
+            </w:r>
+          </w:p>
+        </w:tc>
+        <w:tc>
+          <w:tcPr>
+            <w:tcW w:type="dxa" w:w="7257"/>
+            <w:vAlign w:val="top"/>
+          </w:tcPr>
+          <w:p>
+            <w:pPr>
+              <w:pStyle w:val="Compact"/>
+              <w:spacing w:after="60" w:line="252" w:lineRule="auto"/>
+              <w:jc w:val="left"/>
+            </w:pPr>
+            <w:r>
+              <w:rPr>
+                <w:sz w:val="19"/>
+              </w:rPr>
+              <w:t xml:space="preserve">6 ay</w:t>
+            </w:r>
+          </w:p>
+        </w:tc>
+      </w:tr>
+      <w:tr>
+        <w:trPr>
+          <w:cantSplit/>
+        </w:trPr>
+        <w:tc>
+          <w:tcPr>
+            <w:tcW w:type="dxa" w:w="2381"/>
+            <w:vAlign w:val="top"/>
+          </w:tcPr>
+          <w:p>
+            <w:pPr>
+              <w:pStyle w:val="Compact"/>
+              <w:spacing w:after="60" w:line="252" w:lineRule="auto"/>
+              <w:jc w:val="left"/>
+            </w:pPr>
+            <w:r>
+              <w:rPr>
+                <w:sz w:val="19"/>
+              </w:rPr>
+              <w:t xml:space="preserve">Talep edilen destek</w:t>
+            </w:r>
+          </w:p>
+        </w:tc>
+        <w:tc>
+          <w:tcPr>
+            <w:tcW w:type="dxa" w:w="7257"/>
+            <w:vAlign w:val="top"/>
+          </w:tcPr>
+          <w:p>
+            <w:pPr>
+              <w:pStyle w:val="Compact"/>
+              <w:spacing w:after="60" w:line="252" w:lineRule="auto"/>
+              <w:jc w:val="left"/>
+            </w:pPr>
+            <w:r>
+              <w:rPr>
+                <w:sz w:val="19"/>
+              </w:rPr>
+              <w:t xml:space="preserve">11.500 TL; KDV dahil tahmini bütçe</w:t>
+            </w:r>
+          </w:p>
+        </w:tc>
+      </w:tr>
+    </w:tbl>
+    <w:bookmarkEnd w:id="23"/>
+    <w:bookmarkStart w:id="24" w:name="özet"/>
+    <w:p>
+      <w:pPr>
+        <w:pStyle w:val="Heading2"/>
+      </w:pPr>
+      <w:r>
+        <w:t xml:space="preserve">ÖZET</w:t>
+      </w:r>
+    </w:p>
+    <w:tbl>
+      <w:tblPr>
+        <w:tblStyle w:val="TableGrid"/>
+        <w:tblW w:type="auto" w:w="0"/>
+        <w:tblLayout w:type="fixed"/>
+        <w:tblLook w:firstColumn="1" w:firstRow="1" w:lastColumn="0" w:lastRow="0" w:noHBand="0" w:noVBand="1" w:val="04A0"/>
+        <w:tblBorders>
+          <w:top w:val="single" w:sz="4" w:color="879CAE"/>
+          <w:left w:val="single" w:sz="4" w:color="879CAE"/>
+          <w:bottom w:val="single" w:sz="4" w:color="879CAE"/>
+          <w:right w:val="single" w:sz="4" w:color="879CAE"/>
+          <w:insideH w:val="single" w:sz="4" w:color="879CAE"/>
+          <w:insideV w:val="single" w:sz="4" w:color="879CAE"/>
+        </w:tblBorders>
+      </w:tblPr>
+      <w:tblGrid>
+        <w:gridCol w:w="9638"/>
+      </w:tblGrid>
+      <w:tr>
+        <w:trPr>
+          <w:cantSplit/>
+        </w:trPr>
+        <w:tc>
+          <w:tcPr>
+            <w:tcW w:type="dxa" w:w="9638"/>
+            <w:vAlign w:val="top"/>
+          </w:tcPr>
+          <w:p>
+            <w:pPr>
+              <w:pStyle w:val="FirstParagraph"/>
+              <w:spacing w:after="60" w:line="252" w:lineRule="auto"/>
+            </w:pPr>
+            <w:r>
+              <w:rPr>
+                <w:sz w:val="20"/>
+              </w:rPr>
+              <w:t xml:space="preserve">Bu araştırmada, kullanıcı tarafından tanımlanan rotayı izleyen, sabit engelleri algılayıp çarpışmadan kaçınarak rotasına dönen küçük ölçekli bir otonom kara aracı geliştirilecektir. Araştırmanın temel sorusu, aynı rota üzerindeki farklı engel yerleşimlerinin algılama, kaçınma, rotaya dönüş ve görev tamamlama başarısını nasıl etkilediğidir.</w:t>
+            </w:r>
+          </w:p>
+          <w:p>
+            <w:pPr>
+              <w:pStyle w:val="BodyText"/>
+              <w:spacing w:after="60" w:line="252" w:lineRule="auto"/>
+            </w:pPr>
+            <w:r>
+              <w:rPr>
+                <w:sz w:val="20"/>
+              </w:rPr>
+              <w:t xml:space="preserve">Sistem; ESP32 kontrol birimi, bağımsız sürülen iki enkoderli motor ve beş sabit uçuş süresi (ToF) mesafe sensöründen oluşacaktır. Bilgisayar öncelikli, telefondan da erişilebilir web arayüzünde yerel koordinatlarla sıralı ara rota noktaları (waypoint) tanımlanacaktır. Enkoder tabanlı konum kestirimi ve mesafe ölçümleriyle hareket kontrol edilecek; engelden kaçınma ve rotaya yeniden katılma, Bug 2 yaklaşımından yararlanan bir durum makinesiyle gerçekleştirilecektir.</w:t>
+            </w:r>
+          </w:p>
+          <w:p>
+            <w:pPr>
+              <w:pStyle w:val="BodyText"/>
+              <w:spacing w:after="60" w:line="252" w:lineRule="auto"/>
+            </w:pPr>
+            <w:r>
+              <w:rPr>
+                <w:sz w:val="20"/>
+              </w:rPr>
+              <w:t xml:space="preserve">Düz zeminde 3 × 3 metrelik kontrollü alanda, engelsiz referans ve üç sabit engel yerleşimi değerlendirilecektir. Her koşulda 10 tekrar olmak üzere toplam 40 geçerli deneme yapılacaktır. Her engelli koşulda en az 8/10 denemede temas öncesi algılama, çarpışmasız kaçınma, rotaya dönüş ve hedefe ulaşmanın birlikte sağlanması hedeflenmektedir. Waypoint erişimi ve rotaya dönüş için 10 cm tolerans, görev tamamlama için 120 saniye üst sınırı kullanılacaktır. Hareket, mevcut telefonla alınacak sabit görüntü kaydı üzerinden bağımsız olarak değerlendirilecektir. Başarı oranları, tamamlanma süreleri ve rota izleme hataları raporlanacaktır.</w:t>
+            </w:r>
+          </w:p>
+          <w:p>
+            <w:pPr>
+              <w:pStyle w:val="BodyText"/>
+              <w:spacing w:after="60" w:line="252" w:lineRule="auto"/>
+            </w:pPr>
+            <w:r>
+              <w:rPr>
+                <w:sz w:val="20"/>
+              </w:rPr>
+              <w:t xml:space="preserve">Altı aylık çalışma, donanım ve kalibrasyon, arayüz, rota takibi, engelden kaçınma ile deney ve analizden oluşan beş iş paketinde yürütülecektir. Beklenen çıktılar bir araç prototipi, rota arayüzü, deney kayıt kümesi ve sürümlenmiş yazılım ile teknik dokümantasyondur. Çalışmanın, gömülü kontrol ve mobil robotik alanında deneysel bir eğitim ve geliştirme altyapısı oluşturması beklenmektedir.</w:t>
+            </w:r>
+          </w:p>
+          <w:p>
+            <w:pPr>
+              <w:pStyle w:val="BodyText"/>
+              <w:spacing w:after="60" w:line="252" w:lineRule="auto"/>
+            </w:pPr>
+            <w:r>
+              <w:rPr>
+                <w:b/>
+                <w:bCs/>
+                <w:sz w:val="20"/>
+              </w:rPr>
+              <w:t xml:space="preserve">Anahtar kelimeler:</w:t>
+            </w:r>
+            <w:r>
+              <w:rPr>
+                <w:sz w:val="20"/>
+              </w:rPr>
+              <w:t xml:space="preserve"> </w:t>
+            </w:r>
+            <w:r>
+              <w:rPr>
+                <w:sz w:val="20"/>
+              </w:rPr>
+              <w:t xml:space="preserve">Otonom kara aracı, rota takibi, engelden kaçınma, enkoder, gömülü kontrol.</w:t>
+            </w:r>
+          </w:p>
+        </w:tc>
+      </w:tr>
+    </w:tbl>
+    <w:bookmarkEnd w:id="24"/>
+    <w:bookmarkStart w:id="27" w:name="araştirma-önerisinin-bilimsel-niteliği"/>
+    <w:p>
+      <w:pPr>
+        <w:pStyle w:val="Heading2"/>
+      </w:pPr>
+      <w:r>
+        <w:t xml:space="preserve">1. ARAŞTIRMA ÖNERİSİNİN BİLİMSEL NİTELİĞİ</w:t>
+      </w:r>
+    </w:p>
+    <w:bookmarkStart w:id="25" w:name="X2d024c15c071b3cb5d3e99d34387eb7593d965e"/>
+    <w:p>
+      <w:pPr>
+        <w:pStyle w:val="Heading3"/>
+      </w:pPr>
+      <w:r>
+        <w:t xml:space="preserve">1.1. Konunun önemi ve araştırma önerisinin bilimsel niteliği</w:t>
+      </w:r>
+    </w:p>
+    <w:p>
+      <w:pPr>
+        <w:pStyle w:val="FirstParagraph"/>
+      </w:pPr>
+      <w:r>
+        <w:rPr>
+          <w:b/>
+          <w:bCs/>
+        </w:rPr>
+        <w:t xml:space="preserve">Konunun önemi ve ele alınan problem</w:t>
+      </w:r>
+    </w:p>
+    <w:p>
+      <w:pPr>
+        <w:pStyle w:val="BodyText"/>
+      </w:pPr>
+      <w:r>
+        <w:t xml:space="preserve">Kullanıcının bir arayüzde çizdiği rotanın gerçek bir araç tarafından izlenebilmesi için konum hesabı, motor kontrolü ve çevrenin algılanması birlikte çalışmalıdır. Araç rota üzerinde bir engelle karşılaştığında yalnızca durması görevi tamamlamaya yetmez. Engeli algılayıp uygun bir yönden dolaşması ve kullanıcı tarafından belirlenen rota üzerindeki görevine devam etmesi gerekir. Bu proje, söz konusu davranışı küçük ölçekli bir kara aracı üzerinde geliştirmeye ve kontrollü deneylerle değerlendirmeye odaklanmaktadır.</w:t>
+      </w:r>
+    </w:p>
+    <w:p>
+      <w:pPr>
+        <w:pStyle w:val="BodyText"/>
+      </w:pPr>
+      <w:r>
+        <w:t xml:space="preserve">İki tekerleği bağımsız sürülen araçlarda, tekerlek hareketleri kullanılarak aracın doğrusal hareketi ve yönelimi hesaplanabilir (Dellaert ve Hutchinson, t.y.). Bununla birlikte tekerlek kayması ve dönüşlerdeki hatalar konum hesabını etkileyebilir. Yerel mesafe bilgisiyle çalışan Bug türü yöntemler ise tüm engellerin haritası önceden bilinmeden hedefe ilerleme ve engel çevresini izleme davranışlarını ele almaktadır. Bu yöntemlerin fiziksel bir araçta uygulanmasında araç boyutu, algılama kapsamı ve konum hatası dikkate alınmalıdır (Hauser, t.y.-a).</w:t>
+      </w:r>
+    </w:p>
+    <w:p>
+      <w:pPr>
+        <w:pStyle w:val="BodyText"/>
+      </w:pPr>
+      <w:r>
+        <w:rPr>
+          <w:b/>
+          <w:bCs/>
+        </w:rPr>
+        <w:t xml:space="preserve">İlgili çalışmalar ve projenin yaklaşımı</w:t>
+      </w:r>
+    </w:p>
+    <w:p>
+      <w:pPr>
+        <w:pStyle w:val="BodyText"/>
+      </w:pPr>
+      <w:r>
+        <w:t xml:space="preserve">Alajlan vd. (2017), farklı sensörlerden gelen bilgiyi birleştirerek mobil bir robotun engelli ortamdaki hareketini incelemiştir. Bu çalışma, engel algılama ile hareket kararlarının birlikte tasarlanması açısından yol göstericidir. Önerilen projede beş sabit mesafe sensörüyle sabit engeller üzerinde çalışılacaktır. Telefon kamerası ise aracın engel algılayıcısı olarak değil, deneylerde hareketi bağımsız ölçmek için kullanılacaktır.</w:t>
+      </w:r>
+    </w:p>
+    <w:p>
+      <w:pPr>
+        <w:pStyle w:val="BodyText"/>
+      </w:pPr>
+      <w:r>
+        <w:t xml:space="preserve">Iqbal vd. (2023), koordinatların bir uygulamadan ESP32 tabanlı mobil robota aktarılmasını içeren bir sistem sunmuştur. Rodrigues vd. (2026), enkoderler, dış kamera temelli konum bilgisi ve ESP32 kontrol katmanını içeren küçük bir robotta yörünge takibini değerlendirmiştir. Bu çalışmalar, rota bilgisinin aktarılması ve hareket kontrolünün kurulması için örnek oluşturmaktadır. Bu projede ise arayüzden verilen rota, enkoder tabanlı konum hesabı ve yerel engel algılama bir araya getirilecek; engelden sonra aynı rotaya dönme davranışı incelenecektir.</w:t>
+      </w:r>
+    </w:p>
+    <w:p>
+      <w:pPr>
+        <w:pStyle w:val="BodyText"/>
+      </w:pPr>
+      <w:r>
+        <w:rPr>
+          <w:b/>
+          <w:bCs/>
+        </w:rPr>
+        <w:t xml:space="preserve">Araştırma sorusu ve beklenen katkı</w:t>
+      </w:r>
+    </w:p>
+    <w:p>
+      <w:pPr>
+        <w:pStyle w:val="BodyText"/>
+      </w:pPr>
+      <w:r>
+        <w:t xml:space="preserve">Araştırma sorusu,</w:t>
+      </w:r>
+      <w:r>
+        <w:t xml:space="preserve"> </w:t>
+      </w:r>
+      <w:r>
+        <w:t xml:space="preserve">“</w:t>
+      </w:r>
+      <w:r>
+        <w:t xml:space="preserve">Sabit engelin rota üzerindeki yeri, kullanıcı tanımlı waypoint rotasını izleyen bir kara aracının engeli algılama, çarpışmadan kaçınma ve rotaya yeniden katılma başarısını nasıl etkiler?</w:t>
+      </w:r>
+      <w:r>
+        <w:t xml:space="preserve">”</w:t>
+      </w:r>
+      <w:r>
+        <w:t xml:space="preserve"> </w:t>
+      </w:r>
+      <w:r>
+        <w:t xml:space="preserve">biçiminde belirlenmiştir. Aynı araç ve rota kullanılarak engelin düz bölümde, dönüş öncesinde ve dönüş sonrasında bulunması karşılaştırılacaktır. Engelsiz koşul, temel rota takibini değerlendirmek için referans alınacaktır.</w:t>
+      </w:r>
+    </w:p>
+    <w:p>
+      <w:pPr>
+        <w:pStyle w:val="BodyText"/>
+      </w:pPr>
+      <w:r>
+        <w:t xml:space="preserve">Beklenen katkı, kullanıcı arayüzü ile ESP32 tabanlı hareket kontrolünü bütünleştiren bir prototipin geliştirilmesi ve başarının tek bir genel oran yerine algılama, kaçınma, rotaya dönüş ve görev tamamlama aşamalarında değerlendirilmesidir. Başarılı ve başarısız denemelerin birlikte incelenmesi, sistemin hangi koşullarda yeterli olduğunu ve hangi noktalarda geliştirme gerektirdiğini gösterecektir. Ölçümlerin güvenilir referanslarla kontrol edilmesi kalibrasyon yaklaşımına dayanmaktadır (Hauser, t.y.-b). Çalışmanın sonuçları, düz zemindeki 3 × 3 metrelik alan ve seçilen sabit engel koşullarıyla sınırlandırılacaktır.</w:t>
+      </w:r>
+    </w:p>
+    <w:bookmarkEnd w:id="25"/>
+    <w:bookmarkStart w:id="26" w:name="amaç-ve-hedefler"/>
+    <w:p>
+      <w:pPr>
+        <w:pStyle w:val="Heading3"/>
+      </w:pPr>
+      <w:r>
+        <w:t xml:space="preserve">1.2. Amaç ve hedefler</w:t>
+      </w:r>
+    </w:p>
+    <w:p>
+      <w:pPr>
+        <w:pStyle w:val="FirstParagraph"/>
+      </w:pPr>
+      <w:r>
+        <w:t xml:space="preserve">Projenin amacı, kullanıcı tarafından belirlenen waypoint rotasını izleyen küçük ölçekli bir kara aracında sabit engelin temas öncesinde algılanmasını, çarpışmasız kaçınma hareketinin gerçekleştirilmesini ve aynı rotaya yeniden katılarak görevin sürdürülmesini sağlayan bir prototip geliştirmektir. Bu bütünleşik davranışın başarısı, engel yerleşiminin değiştirildiği kontrollü ve tekrarlı deneylerle değerlendirilecektir.</w:t>
+      </w:r>
+    </w:p>
+    <w:p>
+      <w:pPr>
+        <w:pStyle w:val="BodyText"/>
+      </w:pPr>
+      <w:r>
+        <w:t xml:space="preserve">Bu amaca yönelik hedefler şunlardır:</w:t>
+      </w:r>
+    </w:p>
+    <w:p>
+      <w:pPr>
+        <w:pStyle w:val="Compact"/>
+        <w:numPr>
+          <w:ilvl w:val="0"/>
+          <w:numId w:val="1001"/>
+        </w:numPr>
+      </w:pPr>
+      <w:r>
+        <w:t xml:space="preserve">Yerel koordinatlarla sıralı rota tanımlama, rotayı araca aktarma, başlatma/durdurma ve görev durumunu izleme işlevlerini bilgisayar ve telefon tarayıcısında sunan bir arayüz geliştirmek.</w:t>
+      </w:r>
+    </w:p>
+    <w:p>
+      <w:pPr>
+        <w:pStyle w:val="Compact"/>
+        <w:numPr>
+          <w:ilvl w:val="0"/>
+          <w:numId w:val="1001"/>
+        </w:numPr>
+      </w:pPr>
+      <w:r>
+        <w:t xml:space="preserve">İki enkoderli motor, beş sabit ToF sensörü ve ESP32’yi bütünleştirmek; tekerlek hareketi, dönüş, sensör kapsaması ve durma davranışı için kalibrasyon kayıtları oluşturmak.</w:t>
+      </w:r>
+    </w:p>
+    <w:p>
+      <w:pPr>
+        <w:pStyle w:val="Compact"/>
+        <w:numPr>
+          <w:ilvl w:val="0"/>
+          <w:numId w:val="1001"/>
+        </w:numPr>
+      </w:pPr>
+      <w:r>
+        <w:t xml:space="preserve">Engel algılama, engel kenarını izleme ve rotaya dönüş davranışlarını durum/geçiş kurallarıyla gerçekleştirmek; waypoint sırasını kaçınma boyunca korumak.</w:t>
+      </w:r>
+    </w:p>
+    <w:p>
+      <w:pPr>
+        <w:pStyle w:val="Compact"/>
+        <w:numPr>
+          <w:ilvl w:val="0"/>
+          <w:numId w:val="1001"/>
+        </w:numPr>
+      </w:pPr>
+      <w:r>
+        <w:t xml:space="preserve">Engelsiz referans ve üç sabit engel yerleşiminde koşul başına 10, toplam 40 geçerli değerlendirme denemesi yürütmek.</w:t>
+      </w:r>
+    </w:p>
+    <w:p>
+      <w:pPr>
+        <w:pStyle w:val="Compact"/>
+        <w:numPr>
+          <w:ilvl w:val="0"/>
+          <w:numId w:val="1001"/>
+        </w:numPr>
+      </w:pPr>
+      <w:r>
+        <w:t xml:space="preserve">Her engelli koşulda en az 8/10 denemede temas öncesi algılama, çarpışmasız kaçınma, rotaya dönüş ve sıralı hedeflere erişimi 120 saniye içinde birlikte sağlamak. Waypoint erişiminde ve rotaya dönüşte 10 cm tolerans kullanmak.</w:t>
+      </w:r>
+    </w:p>
+    <w:p>
+      <w:pPr>
+        <w:pStyle w:val="Compact"/>
+        <w:numPr>
+          <w:ilvl w:val="0"/>
+          <w:numId w:val="1001"/>
+        </w:numPr>
+      </w:pPr>
+      <w:r>
+        <w:t xml:space="preserve">Başarılı ve başarısız denemeleri birlikte raporlamak; aşama bazlı başarı oranları, tamamlanma süreleri ve bağımsız görüntü ölçümünden elde edilen rota hatalarıyla engel yerleşimlerinin etkisini açıklamak.</w:t>
+      </w:r>
+    </w:p>
+    <w:p>
+      <w:pPr>
+        <w:pStyle w:val="FirstParagraph"/>
+      </w:pPr>
+      <w:r>
+        <w:t xml:space="preserve">Bu sayısal değerler araştırmanın başarı hedefleridir; çalışma sonunda ölçülecek performansı tanımlar.</w:t>
+      </w:r>
+    </w:p>
+    <w:bookmarkEnd w:id="26"/>
+    <w:bookmarkEnd w:id="27"/>
+    <w:bookmarkStart w:id="46" w:name="yöntem"/>
+    <w:p>
+      <w:pPr>
+        <w:pStyle w:val="Heading2"/>
+      </w:pPr>
+      <w:r>
+        <w:t xml:space="preserve">2. YÖNTEM</w:t>
+      </w:r>
+    </w:p>
+    <w:bookmarkStart w:id="28" w:name="X7b0ebfeb556529fc3ca809f82ae0cba7eaf9da9"/>
+    <w:p>
+      <w:pPr>
+        <w:pStyle w:val="Heading3"/>
+      </w:pPr>
+      <w:r>
+        <w:t xml:space="preserve">2.1. Araştırma tasarımı ve iş paketleriyle ilişki</w:t>
+      </w:r>
+    </w:p>
+    <w:p>
+      <w:pPr>
+        <w:pStyle w:val="FirstParagraph"/>
+      </w:pPr>
+      <w:r>
+        <w:t xml:space="preserve">Araştırma, prototip geliştirme ve kontrollü koşullarda tekrarlı deney tasarımına dayanmaktadır. Temel bağımsız değişken, aynı referans rota üzerindeki sabit engelin yerleşimidir. Bağımlı değişkenler; temas öncesi algılama, çarpışmasız kaçınma, rotaya dönüş ve görev tamamlama sonuçları ile süre ve rota izleme hatasıdır. Engel sayısı, boyutu ve yüzeyi engelli koşullar arasında sabit tutulacaktır. Başlangıç konumu/yönü, rota, zemin, hız ayarları ve son yazılım sürümü koşullar arasında değiştirilmeyecektir. Pil gerilimi, aydınlatma ve kontrol edilemeyen değişimler kaydedilecektir.</w:t>
+      </w:r>
+    </w:p>
+    <w:p>
+      <w:pPr>
+        <w:pStyle w:val="BodyText"/>
+      </w:pPr>
+      <w:r>
+        <w:t xml:space="preserve">Donanım ve kalibrasyon İP1, arayüz ve haberleşme İP2, konum kestirimi ve rota takibi İP3, kaçınma ve rotaya dönüş İP4 kapsamında geliştirilecektir. Bütünleşik sistemin dört koşulda değerlendirilmesi ve veri analizi İP5 kapsamında yapılacaktır. Geliştirme/ayar denemeleri, nihai 40 değerlendirme denemesinden ayrı tutulacaktır.</w:t>
+      </w:r>
+    </w:p>
+    <w:bookmarkEnd w:id="28"/>
+    <w:bookmarkStart w:id="32" w:name="X157134930360a1a904b3414a0b258b82cf01dd0"/>
+    <w:p>
+      <w:pPr>
+        <w:pStyle w:val="Heading3"/>
+      </w:pPr>
+      <w:r>
+        <w:t xml:space="preserve">2.2. Donanım mimarisi ve bileşen gereksinimleri</w:t>
+      </w:r>
+    </w:p>
+    <w:p>
+      <w:pPr>
+        <w:pStyle w:val="FirstParagraph"/>
+      </w:pPr>
+      <w:r>
+        <w:t xml:space="preserve">Araç, iki tahrik tekerinin bağımsız sürüldüğü ve bir serbest tekerlekle desteklendiği diferansiyel sürüş düzeninde kurulacaktır. Başlangıç mekanik tasarımında gövde zarfı en çok 25 × 20 cm olacak; tekerlekler, sensörler ve bağlantılar dahil gerçek dış ölçüler kaydedilecektir. Araç referans noktası, iki tahrik tekeri arasındaki aksın orta noktası olarak tanımlanacaktır.</w:t>
+      </w:r>
+    </w:p>
+    <w:p>
+      <w:pPr>
+        <w:pStyle w:val="BodyText"/>
+      </w:pPr>
+      <w:r>
+        <w:t xml:space="preserve">ESP32, enkoderleri okuyacak, mesafe ölçümlerini işleyecek, hareket kararlarını verecek ve motorları sürecektir. Bileşenler aşağıdaki işlevsel gereksinimlerle temin edilecektir. Ticari ürün kodu yerine bu gereksinimlerin esas alınması, eşdeğer ürünlerle aynı araştırma yönteminin uygulanmasını sağlayacaktır.</w:t>
+      </w:r>
+    </w:p>
+    <w:tbl>
+      <w:tblPr>
+        <w:tblStyle w:val="TableGrid"/>
+        <w:tblW w:type="pct" w:w="5000"/>
+        <w:jc w:val="left"/>
+        <w:tblLayout w:type="fixed"/>
+        <w:tblLook w:firstRow="1" w:lastRow="0" w:firstColumn="0" w:lastColumn="0" w:noHBand="0" w:noVBand="0" w:val="0020"/>
+        <w:tblBorders>
+          <w:top w:val="single" w:sz="4" w:color="879CAE"/>
+          <w:left w:val="single" w:sz="4" w:color="879CAE"/>
+          <w:bottom w:val="single" w:sz="4" w:color="879CAE"/>
+          <w:right w:val="single" w:sz="4" w:color="879CAE"/>
+          <w:insideH w:val="single" w:sz="4" w:color="879CAE"/>
+          <w:insideV w:val="single" w:sz="4" w:color="879CAE"/>
+        </w:tblBorders>
+      </w:tblPr>
+      <w:tblGrid>
+        <w:gridCol w:w="2098"/>
+        <w:gridCol w:w="794"/>
+        <w:gridCol w:w="6746"/>
+      </w:tblGrid>
+      <w:tr>
+        <w:trPr>
+          <w:tblHeader w:val="on"/>
+          <w:tblHeader/>
+          <w:cantSplit/>
+        </w:trPr>
+        <w:tc>
+          <w:tcPr>
+            <w:tcW w:type="dxa" w:w="2098"/>
+            <w:vAlign w:val="top"/>
+            <w:shd w:fill="EAF1F7"/>
+          </w:tcPr>
+          <w:p>
+            <w:pPr>
+              <w:pStyle w:val="Compact"/>
+              <w:spacing w:after="60" w:line="252" w:lineRule="auto"/>
+              <w:jc w:val="left"/>
+            </w:pPr>
+            <w:r>
+              <w:rPr>
+                <w:b/>
+                <w:sz w:val="19"/>
+              </w:rPr>
+              <w:t xml:space="preserve">Bileşen</w:t>
+            </w:r>
+          </w:p>
+        </w:tc>
+        <w:tc>
+          <w:tcPr>
+            <w:tcW w:type="dxa" w:w="794"/>
+            <w:vAlign w:val="top"/>
+            <w:shd w:fill="EAF1F7"/>
+          </w:tcPr>
+          <w:p>
+            <w:pPr>
+              <w:pStyle w:val="Compact"/>
+              <w:spacing w:after="60" w:line="252" w:lineRule="auto"/>
+              <w:jc w:val="left"/>
+            </w:pPr>
+            <w:r>
+              <w:rPr>
+                <w:b/>
+                <w:sz w:val="19"/>
+              </w:rPr>
+              <w:t xml:space="preserve">Miktar</w:t>
+            </w:r>
+          </w:p>
+        </w:tc>
+        <w:tc>
+          <w:tcPr>
+            <w:tcW w:type="dxa" w:w="6746"/>
+            <w:vAlign w:val="top"/>
+            <w:shd w:fill="EAF1F7"/>
+          </w:tcPr>
+          <w:p>
+            <w:pPr>
+              <w:pStyle w:val="Compact"/>
+              <w:spacing w:after="60" w:line="252" w:lineRule="auto"/>
+              <w:jc w:val="left"/>
+            </w:pPr>
+            <w:r>
+              <w:rPr>
+                <w:b/>
+                <w:sz w:val="19"/>
+              </w:rPr>
+              <w:t xml:space="preserve">Teknik gereksinim ve kullanım</w:t>
+            </w:r>
+          </w:p>
+        </w:tc>
+      </w:tr>
+      <w:tr>
+        <w:trPr>
+          <w:cantSplit/>
+        </w:trPr>
+        <w:tc>
+          <w:tcPr>
+            <w:tcW w:type="dxa" w:w="2098"/>
+            <w:vAlign w:val="top"/>
+          </w:tcPr>
+          <w:p>
+            <w:pPr>
+              <w:pStyle w:val="Compact"/>
+              <w:spacing w:after="60" w:line="252" w:lineRule="auto"/>
+              <w:jc w:val="left"/>
+            </w:pPr>
+            <w:r>
+              <w:rPr>
+                <w:sz w:val="19"/>
+              </w:rPr>
+              <w:t xml:space="preserve">ESP32 geliştirme kartı</w:t>
+            </w:r>
+          </w:p>
+        </w:tc>
+        <w:tc>
+          <w:tcPr>
+            <w:tcW w:type="dxa" w:w="794"/>
+            <w:vAlign w:val="top"/>
+          </w:tcPr>
+          <w:p>
+            <w:pPr>
+              <w:pStyle w:val="Compact"/>
+              <w:spacing w:after="60" w:line="252" w:lineRule="auto"/>
+              <w:jc w:val="left"/>
+            </w:pPr>
+            <w:r>
+              <w:rPr>
+                <w:sz w:val="19"/>
+              </w:rPr>
+              <w:t xml:space="preserve">1</w:t>
+            </w:r>
+          </w:p>
+        </w:tc>
+        <w:tc>
+          <w:tcPr>
+            <w:tcW w:type="dxa" w:w="6746"/>
+            <w:vAlign w:val="top"/>
+          </w:tcPr>
+          <w:p>
+            <w:pPr>
+              <w:pStyle w:val="Compact"/>
+              <w:spacing w:after="60" w:line="252" w:lineRule="auto"/>
+              <w:jc w:val="left"/>
+            </w:pPr>
+            <w:r>
+              <w:rPr>
+                <w:sz w:val="19"/>
+              </w:rPr>
+              <w:t xml:space="preserve">Wi-Fi, 3,3 V sayısal arayüzler, enkoder okumaya ve iki motorun bağımsız hız/yön kontrolüne yeterli giriş/çıkış.</w:t>
+            </w:r>
+          </w:p>
+        </w:tc>
+      </w:tr>
+      <w:tr>
+        <w:trPr>
+          <w:cantSplit/>
+        </w:trPr>
+        <w:tc>
+          <w:tcPr>
+            <w:tcW w:type="dxa" w:w="2098"/>
+            <w:vAlign w:val="top"/>
+          </w:tcPr>
+          <w:p>
+            <w:pPr>
+              <w:pStyle w:val="Compact"/>
+              <w:spacing w:after="60" w:line="252" w:lineRule="auto"/>
+              <w:jc w:val="left"/>
+            </w:pPr>
+            <w:r>
+              <w:rPr>
+                <w:sz w:val="19"/>
+              </w:rPr>
+              <w:t xml:space="preserve">Enkoderli DC motor</w:t>
+            </w:r>
+          </w:p>
+        </w:tc>
+        <w:tc>
+          <w:tcPr>
+            <w:tcW w:type="dxa" w:w="794"/>
+            <w:vAlign w:val="top"/>
+          </w:tcPr>
+          <w:p>
+            <w:pPr>
+              <w:pStyle w:val="Compact"/>
+              <w:spacing w:after="60" w:line="252" w:lineRule="auto"/>
+              <w:jc w:val="left"/>
+            </w:pPr>
+            <w:r>
+              <w:rPr>
+                <w:sz w:val="19"/>
+              </w:rPr>
+              <w:t xml:space="preserve">2</w:t>
+            </w:r>
+          </w:p>
+        </w:tc>
+        <w:tc>
+          <w:tcPr>
+            <w:tcW w:type="dxa" w:w="6746"/>
+            <w:vAlign w:val="top"/>
+          </w:tcPr>
+          <w:p>
+            <w:pPr>
+              <w:pStyle w:val="Compact"/>
+              <w:spacing w:after="60" w:line="252" w:lineRule="auto"/>
+              <w:jc w:val="left"/>
+            </w:pPr>
+            <w:r>
+              <w:rPr>
+                <w:sz w:val="19"/>
+              </w:rPr>
+              <w:t xml:space="preserve">Aynı model, redüktörlü; 5 V motor beslemesinde 0,10 m/s araç hızını sağlayan tork/hız ve 3,3 V uyumlu ya da seviyelendirilmiş A/B geri bildirim çıkışları.</w:t>
+            </w:r>
+          </w:p>
+        </w:tc>
+      </w:tr>
+      <w:tr>
+        <w:trPr>
+          <w:cantSplit/>
+        </w:trPr>
+        <w:tc>
+          <w:tcPr>
+            <w:tcW w:type="dxa" w:w="2098"/>
+            <w:vAlign w:val="top"/>
+          </w:tcPr>
+          <w:p>
+            <w:pPr>
+              <w:pStyle w:val="Compact"/>
+              <w:spacing w:after="60" w:line="252" w:lineRule="auto"/>
+              <w:jc w:val="left"/>
+            </w:pPr>
+            <w:r>
+              <w:rPr>
+                <w:sz w:val="19"/>
+              </w:rPr>
+              <w:t xml:space="preserve">Çift kanallı motor sürücü düzeni</w:t>
+            </w:r>
+          </w:p>
+        </w:tc>
+        <w:tc>
+          <w:tcPr>
+            <w:tcW w:type="dxa" w:w="794"/>
+            <w:vAlign w:val="top"/>
+          </w:tcPr>
+          <w:p>
+            <w:pPr>
+              <w:pStyle w:val="Compact"/>
+              <w:spacing w:after="60" w:line="252" w:lineRule="auto"/>
+              <w:jc w:val="left"/>
+            </w:pPr>
+            <w:r>
+              <w:rPr>
+                <w:sz w:val="19"/>
+              </w:rPr>
+              <w:t xml:space="preserve">1 takım</w:t>
+            </w:r>
+          </w:p>
+        </w:tc>
+        <w:tc>
+          <w:tcPr>
+            <w:tcW w:type="dxa" w:w="6746"/>
+            <w:vAlign w:val="top"/>
+          </w:tcPr>
+          <w:p>
+            <w:pPr>
+              <w:pStyle w:val="Compact"/>
+              <w:spacing w:after="60" w:line="252" w:lineRule="auto"/>
+              <w:jc w:val="left"/>
+            </w:pPr>
+            <w:r>
+              <w:rPr>
+                <w:sz w:val="19"/>
+              </w:rPr>
+              <w:t xml:space="preserve">3,3 V kontrol uyumu; her kanalın sürekli ve kısa süreli akım kapasitesinin motorun yük ve kalkış/sıkışma gereksinimlerini karşılaması.</w:t>
+            </w:r>
+          </w:p>
+        </w:tc>
+      </w:tr>
+      <w:tr>
+        <w:trPr>
+          <w:cantSplit/>
+        </w:trPr>
+        <w:tc>
+          <w:tcPr>
+            <w:tcW w:type="dxa" w:w="2098"/>
+            <w:vAlign w:val="top"/>
+          </w:tcPr>
+          <w:p>
+            <w:pPr>
+              <w:pStyle w:val="Compact"/>
+              <w:spacing w:after="60" w:line="252" w:lineRule="auto"/>
+              <w:jc w:val="left"/>
+            </w:pPr>
+            <w:r>
+              <w:rPr>
+                <w:sz w:val="19"/>
+              </w:rPr>
+              <w:t xml:space="preserve">Sabit ToF mesafe sensörü</w:t>
+            </w:r>
+          </w:p>
+        </w:tc>
+        <w:tc>
+          <w:tcPr>
+            <w:tcW w:type="dxa" w:w="794"/>
+            <w:vAlign w:val="top"/>
+          </w:tcPr>
+          <w:p>
+            <w:pPr>
+              <w:pStyle w:val="Compact"/>
+              <w:spacing w:after="60" w:line="252" w:lineRule="auto"/>
+              <w:jc w:val="left"/>
+            </w:pPr>
+            <w:r>
+              <w:rPr>
+                <w:sz w:val="19"/>
+              </w:rPr>
+              <w:t xml:space="preserve">5</w:t>
+            </w:r>
+          </w:p>
+        </w:tc>
+        <w:tc>
+          <w:tcPr>
+            <w:tcW w:type="dxa" w:w="6746"/>
+            <w:vAlign w:val="top"/>
+          </w:tcPr>
+          <w:p>
+            <w:pPr>
+              <w:pStyle w:val="Compact"/>
+              <w:spacing w:after="60" w:line="252" w:lineRule="auto"/>
+              <w:jc w:val="left"/>
+            </w:pPr>
+            <w:r>
+              <w:rPr>
+                <w:sz w:val="19"/>
+              </w:rPr>
+              <w:t xml:space="preserve">Ön orta, iki ön çapraz ve iki yan yerleşim; 3,3 V uyumlu taşıyıcı arayüzü; beşli taramayı 200 ms içinde tamamlayan ölçüm düzeni ve geçersiz ölçüm bilgisinin okunması.</w:t>
+            </w:r>
+          </w:p>
+        </w:tc>
+      </w:tr>
+      <w:tr>
+        <w:trPr>
+          <w:cantSplit/>
+        </w:trPr>
+        <w:tc>
+          <w:tcPr>
+            <w:tcW w:type="dxa" w:w="2098"/>
+            <w:vAlign w:val="top"/>
+          </w:tcPr>
+          <w:p>
+            <w:pPr>
+              <w:pStyle w:val="Compact"/>
+              <w:spacing w:after="60" w:line="252" w:lineRule="auto"/>
+              <w:jc w:val="left"/>
+            </w:pPr>
+            <w:r>
+              <w:rPr>
+                <w:sz w:val="19"/>
+              </w:rPr>
+              <w:t xml:space="preserve">I²C çoklayıcı</w:t>
+            </w:r>
+          </w:p>
+        </w:tc>
+        <w:tc>
+          <w:tcPr>
+            <w:tcW w:type="dxa" w:w="794"/>
+            <w:vAlign w:val="top"/>
+          </w:tcPr>
+          <w:p>
+            <w:pPr>
+              <w:pStyle w:val="Compact"/>
+              <w:spacing w:after="60" w:line="252" w:lineRule="auto"/>
+              <w:jc w:val="left"/>
+            </w:pPr>
+            <w:r>
+              <w:rPr>
+                <w:sz w:val="19"/>
+              </w:rPr>
+              <w:t xml:space="preserve">1</w:t>
+            </w:r>
+          </w:p>
+        </w:tc>
+        <w:tc>
+          <w:tcPr>
+            <w:tcW w:type="dxa" w:w="6746"/>
+            <w:vAlign w:val="top"/>
+          </w:tcPr>
+          <w:p>
+            <w:pPr>
+              <w:pStyle w:val="Compact"/>
+              <w:spacing w:after="60" w:line="252" w:lineRule="auto"/>
+              <w:jc w:val="left"/>
+            </w:pPr>
+            <w:r>
+              <w:rPr>
+                <w:sz w:val="19"/>
+              </w:rPr>
+              <w:t xml:space="preserve">Beş sensörü ayrı kanallardan seçerek okumaya uygun, en az beş kanallı ve 3,3 V mantık uyumlu düzen.</w:t>
+            </w:r>
+          </w:p>
+        </w:tc>
+      </w:tr>
+      <w:tr>
+        <w:trPr>
+          <w:cantSplit/>
+        </w:trPr>
+        <w:tc>
+          <w:tcPr>
+            <w:tcW w:type="dxa" w:w="2098"/>
+            <w:vAlign w:val="top"/>
+          </w:tcPr>
+          <w:p>
+            <w:pPr>
+              <w:pStyle w:val="Compact"/>
+              <w:spacing w:after="60" w:line="252" w:lineRule="auto"/>
+              <w:jc w:val="left"/>
+            </w:pPr>
+            <w:r>
+              <w:rPr>
+                <w:sz w:val="19"/>
+              </w:rPr>
+              <w:t xml:space="preserve">Güç altyapısı</w:t>
+            </w:r>
+          </w:p>
+        </w:tc>
+        <w:tc>
+          <w:tcPr>
+            <w:tcW w:type="dxa" w:w="794"/>
+            <w:vAlign w:val="top"/>
+          </w:tcPr>
+          <w:p>
+            <w:pPr>
+              <w:pStyle w:val="Compact"/>
+              <w:spacing w:after="60" w:line="252" w:lineRule="auto"/>
+              <w:jc w:val="left"/>
+            </w:pPr>
+            <w:r>
+              <w:rPr>
+                <w:sz w:val="19"/>
+              </w:rPr>
+              <w:t xml:space="preserve">1 takım</w:t>
+            </w:r>
+          </w:p>
+        </w:tc>
+        <w:tc>
+          <w:tcPr>
+            <w:tcW w:type="dxa" w:w="6746"/>
+            <w:vAlign w:val="top"/>
+          </w:tcPr>
+          <w:p>
+            <w:pPr>
+              <w:pStyle w:val="Compact"/>
+              <w:spacing w:after="60" w:line="252" w:lineRule="auto"/>
+              <w:jc w:val="left"/>
+            </w:pPr>
+            <w:r>
+              <w:rPr>
+                <w:sz w:val="19"/>
+              </w:rPr>
+              <w:t xml:space="preserve">Hazır 2S batarya, kimyası ve bağlantılarıyla uyumlu şarj cihazı, paket koruması, 5 V ve 3,3 V düzenlenmiş besleme dalları.</w:t>
+            </w:r>
+          </w:p>
+        </w:tc>
+      </w:tr>
+    </w:tbl>
+    <w:p>
+      <w:pPr>
+        <w:pStyle w:val="BodyText"/>
+      </w:pPr>
+      <w:r>
+        <w:t xml:space="preserve">Sensörlerin başlangıç yönleri ileri eksene göre 0°, ±45° ve ±90° olacaktır. Ön sensörler yaklaşan engeli, yan sensörler engel kenarındaki açıklığı izleyecektir. Montaj yüksekliği, ışınların deney engelini göreceği biçimde ayarlanacak; gerçek kapsama ve kör bölgeler kalibrasyon kaydına işlenecektir. Beş sensörün varlığı kesintisiz çevre algısı olarak yorumlanmayacaktır.</w:t>
+      </w:r>
+    </w:p>
+    <w:p>
+      <w:pPr>
+        <w:pStyle w:val="BodyText"/>
+      </w:pPr>
+      <w:r>
+        <w:t xml:space="preserve">Motorlar ve kontrol elektroniği ayrı güç kablo dallarından beslenecek, ortak toprak referansı kullanılacaktır. Bataryanın ham gerilimi motorlara veya ESP32 giriş/çıkışlarına uygulanmayacaktır. Motor sürücüsü, regülatör, kablo ve koruma elemanları iki motorun birlikte kalkış/yük akımı esas alınarak boyutlandırılacaktır. Ürünlerin gerilim, akım, bağlantı ve şarj uyumu, montajın giriş kontrolünde veri sayfaları ve elektriksel kontrollerle doğrulanacaktır.</w:t>
+      </w:r>
+    </w:p>
+    <w:p>
+      <w:pPr>
+        <w:pStyle w:val="BodyText"/>
+        <w:keepNext/>
+        <w:spacing w:after="40"/>
+        <w:jc w:val="center"/>
+      </w:pPr>
+      <w:r>
+        <w:drawing>
+          <wp:inline>
+            <wp:extent cx="6048000" cy="3403808"/>
+            <wp:effectExtent b="0" l="0" r="0" t="0"/>
+            <wp:docPr descr="Şekil 1 — Sistem mimarisi" title="" id="30" name="Picture"/>
+            <a:graphic>
+              <a:graphicData uri="http://schemas.openxmlformats.org/drawingml/2006/picture">
+                <pic:pic>
+                  <pic:nvPicPr>
+                    <pic:cNvPr descr="gorseller/akademik_duzen/sekil_1_sistem_mimarisi.png" id="31" name="Picture"/>
+                    <pic:cNvPicPr>
+                      <a:picLocks noChangeArrowheads="1" noChangeAspect="1"/>
+                    </pic:cNvPicPr>
+                  </pic:nvPicPr>
+                  <pic:blipFill>
+                    <a:blip r:embed="rId29"/>
+                    <a:stretch>
+                      <a:fillRect/>
+                    </a:stretch>
+                  </pic:blipFill>
+                  <pic:spPr bwMode="auto">
+                    <a:xfrm>
+                      <a:off x="0" y="0"/>
+                      <a:ext cx="6048000" cy="3403808"/>
+                    </a:xfrm>
+                    <a:prstGeom prst="rect">
+                      <a:avLst/>
+                    </a:prstGeom>
+                    <a:noFill/>
+                    <a:ln w="9525">
+                      <a:noFill/>
+                      <a:headEnd/>
+                      <a:tailEnd/>
+                    </a:ln>
+                  </pic:spPr>
+                </pic:pic>
+              </a:graphicData>
+            </a:graphic>
+          </wp:inline>
+        </w:drawing>
+      </w:r>
+    </w:p>
     <w:p>
       <w:pPr>
         <w:pStyle w:val="Caption"/>
@@ -1447,11 +1614,11 @@
         <w:t xml:space="preserve"> </w:t>
       </w:r>
       <w:r>
-        <w:t xml:space="preserve">Kullanıcı arayüzü, algılama, ESP32 ve motor sürme birimleri arasındaki veri akışı. ÜYZ desteğiyle hazırlanmış tasarım şemasıdır; simgeler temsilidir.</w:t>
+        <w:t xml:space="preserve">Kullanıcı arayüzü, algılama, ESP32 ve motor sürme birimleri arasındaki veri akışı. ÜYZ desteğiyle hazırlanmış işlevsel tasarım şemasıdır.</w:t>
       </w:r>
     </w:p>
-    <w:bookmarkEnd w:id="29"/>
-    <w:bookmarkStart w:id="30" w:name="konum-kestirimi-ve-rota-takibi"/>
+    <w:bookmarkEnd w:id="32"/>
+    <w:bookmarkStart w:id="33" w:name="konum-kestirimi-ve-rota-takibi"/>
     <w:p>
       <w:pPr>
         <w:pStyle w:val="Heading3"/>
@@ -1699,8 +1866,8 @@
         <w:t xml:space="preserve">Denetim döngüsü 20 Hz olarak kurulacak; beş sensörün tam taraması en az 5 Hz, görev telemetrisi 5 Hz olacak şekilde zamanlama düzenlenecektir. Sensörler ayrı kanallardan sıralı okunacaktır. Üretici durum kodlarına göre geçerli bir engel-yok çıktısı ile iletişim/ölçüm hatası ayrılacak; belirsiz veri boş yol kabul edilmeyecektir. Ölçüm zaman damgaları tutulacak; 250 ms’den eski veya geçersiz engel verisiyle hareket sürdürülemeyecektir. Tekerlek kayması ve odometrik sürüklenme, bağımsız ölçümle izlenecektir.</w:t>
       </w:r>
     </w:p>
-    <w:bookmarkEnd w:id="30"/>
-    <w:bookmarkStart w:id="31" w:name="kullanıcı-arayüzü-ve-haberleşme"/>
+    <w:bookmarkEnd w:id="33"/>
+    <w:bookmarkStart w:id="34" w:name="kullanıcı-arayüzü-ve-haberleşme"/>
     <w:p>
       <w:pPr>
         <w:pStyle w:val="Heading3"/>
@@ -1722,7 +1889,7 @@
         <w:pStyle w:val="BodyText"/>
       </w:pPr>
       <w:r>
-        <w:t xml:space="preserve">Rota JSON biçiminde HTTP üzerinden aktarılacak, durum ve komutlar WebSocket bağlantısıyla iletilecektir. ESP-IDF HTTP sunucusunun WebSocket desteği, bu haberleşme düzeninin teknik dayanağıdır (Espressif Systems, t.y.). Alan dışındaki noktalar ve sıfır uzunluklu ardışık parçalar yükleme sırasında reddedilecektir. Başlatma için rota kabulü, geçerli sensör verisi ve uygun besleme durumu aranacaktır.</w:t>
+        <w:t xml:space="preserve">Rota HTTP üzerinden araca aktarılacak; görev durumu ve komutlar WebSocket bağlantısıyla iletilecektir. ESP-IDF HTTP sunucusunun WebSocket desteği, bu haberleşme düzeninin teknik dayanağıdır (Espressif Systems, t.y.). Alan dışındaki noktalar ve sıfır uzunluklu ardışık parçalar yükleme sırasında reddedilecektir. Başlatma için rota kabulü, geçerli sensör verisi ve uygun besleme durumu aranacaktır.</w:t>
       </w:r>
     </w:p>
     <w:p>
@@ -1733,8 +1900,8 @@
         <w:t xml:space="preserve">Arayüzde tahmini konum, etkin waypoint, mesafe ölçümleri, görev durumu ve hata nedeni gösterilecektir. Hareket kararları araç üzerinde verilecek; kullanıcı rota yüklendikten sonra aracı elle yönlendirmeyecektir. Arayüz 0,5 saniyede bir bağlantı canlılık mesajı gönderecek; 1 saniye boyunca bu mesaj alınamazsa motorlar durdurulacaktır. Durdurma komutu veya hata sonrasında hareket, kendiliğinden yeniden başlamayacaktır. Şasi üzerindeki erişilebilir ana güç anahtarı, gerektiğinde motor beslemesini fiziksel olarak kesmek için kullanılacaktır.</w:t>
       </w:r>
     </w:p>
-    <w:bookmarkEnd w:id="31"/>
-    <w:bookmarkStart w:id="35" w:name="engel-algılama-kaçınma-ve-rotaya-dönüş"/>
+    <w:bookmarkEnd w:id="34"/>
+    <w:bookmarkStart w:id="38" w:name="engel-algılama-kaçınma-ve-rotaya-dönüş"/>
     <w:p>
       <w:pPr>
         <w:pStyle w:val="Heading3"/>
@@ -1857,20 +2024,20 @@
       <w:r>
         <w:drawing>
           <wp:inline>
-            <wp:extent cx="5070608" cy="6336000"/>
+            <wp:extent cx="6048000" cy="3782859"/>
             <wp:effectExtent b="0" l="0" r="0" t="0"/>
-            <wp:docPr descr="Şekil 2 — Kontrol akışı" title="" id="33" name="Picture"/>
+            <wp:docPr descr="Şekil 2 — Kontrol akışı" title="" id="36" name="Picture"/>
             <a:graphic>
               <a:graphicData uri="http://schemas.openxmlformats.org/drawingml/2006/picture">
                 <pic:pic>
                   <pic:nvPicPr>
-                    <pic:cNvPr descr="gorseller/danisman_sunumu/sekil_2_calisma_akisi.png" id="34" name="Picture"/>
+                    <pic:cNvPr descr="gorseller/akademik_duzen/sekil_2_calisma_akisi.png" id="37" name="Picture"/>
                     <pic:cNvPicPr>
                       <a:picLocks noChangeArrowheads="1" noChangeAspect="1"/>
                     </pic:cNvPicPr>
                   </pic:nvPicPr>
                   <pic:blipFill>
-                    <a:blip r:embed="rId32"/>
+                    <a:blip r:embed="rId35"/>
                     <a:stretch>
                       <a:fillRect/>
                     </a:stretch>
@@ -1878,7 +2045,7 @@
                   <pic:spPr bwMode="auto">
                     <a:xfrm>
                       <a:off x="0" y="0"/>
-                      <a:ext cx="5070608" cy="6336000"/>
+                      <a:ext cx="6048000" cy="3782859"/>
                     </a:xfrm>
                     <a:prstGeom prst="rect">
                       <a:avLst/>
@@ -1935,8 +2102,8 @@
         <w:t xml:space="preserve">bağlantıları kontrol döngüsüne dönüşü gösterir. ÜYZ desteğiyle hazırlanmış tasarım şemasıdır.</w:t>
       </w:r>
     </w:p>
-    <w:bookmarkEnd w:id="35"/>
-    <w:bookmarkStart w:id="39" w:name="deney-alanı-koşullar-ve-uygulama-sırası"/>
+    <w:bookmarkEnd w:id="38"/>
+    <w:bookmarkStart w:id="42" w:name="deney-alanı-koşullar-ve-uygulama-sırası"/>
     <w:p>
       <w:pPr>
         <w:pStyle w:val="Heading3"/>
@@ -1984,6 +2151,14 @@
         <w:jc w:val="left"/>
         <w:tblLayout w:type="fixed"/>
         <w:tblLook w:firstRow="1" w:lastRow="0" w:firstColumn="0" w:lastColumn="0" w:noHBand="0" w:noVBand="0" w:val="0020"/>
+        <w:tblBorders>
+          <w:top w:val="single" w:sz="4" w:color="879CAE"/>
+          <w:left w:val="single" w:sz="4" w:color="879CAE"/>
+          <w:bottom w:val="single" w:sz="4" w:color="879CAE"/>
+          <w:right w:val="single" w:sz="4" w:color="879CAE"/>
+          <w:insideH w:val="single" w:sz="4" w:color="879CAE"/>
+          <w:insideV w:val="single" w:sz="4" w:color="879CAE"/>
+        </w:tblBorders>
       </w:tblPr>
       <w:tblGrid>
         <w:gridCol w:w="624"/>
@@ -2433,20 +2608,20 @@
       <w:r>
         <w:drawing>
           <wp:inline>
-            <wp:extent cx="6048000" cy="4031999"/>
+            <wp:extent cx="6048000" cy="5531706"/>
             <wp:effectExtent b="0" l="0" r="0" t="0"/>
-            <wp:docPr descr="Şekil 3 — Deney düzeni" title="" id="37" name="Picture"/>
+            <wp:docPr descr="Şekil 3 — Deney düzeni" title="" id="40" name="Picture"/>
             <a:graphic>
               <a:graphicData uri="http://schemas.openxmlformats.org/drawingml/2006/picture">
                 <pic:pic>
                   <pic:nvPicPr>
-                    <pic:cNvPr descr="gorseller/danisman_sunumu/sekil_3_deney_alani.png" id="38" name="Picture"/>
+                    <pic:cNvPr descr="gorseller/akademik_duzen/sekil_3_deney_alani.png" id="41" name="Picture"/>
                     <pic:cNvPicPr>
                       <a:picLocks noChangeArrowheads="1" noChangeAspect="1"/>
                     </pic:cNvPicPr>
                   </pic:nvPicPr>
                   <pic:blipFill>
-                    <a:blip r:embed="rId36"/>
+                    <a:blip r:embed="rId39"/>
                     <a:stretch>
                       <a:fillRect/>
                     </a:stretch>
@@ -2454,7 +2629,7 @@
                   <pic:spPr bwMode="auto">
                     <a:xfrm>
                       <a:off x="0" y="0"/>
-                      <a:ext cx="6048000" cy="4031999"/>
+                      <a:ext cx="6048000" cy="5531706"/>
                     </a:xfrm>
                     <a:prstGeom prst="rect">
                       <a:avLst/>
@@ -2490,11 +2665,11 @@
         <w:t xml:space="preserve"> </w:t>
       </w:r>
       <w:r>
-        <w:t xml:space="preserve">Ölçeksiz şema: yerel koordinatlı deney alanı, waypoint rotası ve engelden kaçınmanın temsili gösterimi. Kesin deney koordinatları Bölüm 2.6’daki metin ve tabloda tanımlanmıştır. Çizilen kaçınma eğrisi ölçüm veya simülasyon sonucu değildir. Şema ÜYZ desteğiyle hazırlanmıştır.</w:t>
+        <w:t xml:space="preserve">Planlanan dört deney koşulunun koordinatlara göre çizilmiş geometrisi. Kesikli çizgi A–B–C referans rotasını; gri kare, 30 × 30 cm tabanlı engeli gösterir. Koordinatlar Bölüm 2.6 ile aynıdır. Bu çizim planlanan düzeneği gösterir; deney veya simülasyon sonucu değildir.</w:t>
       </w:r>
     </w:p>
-    <w:bookmarkEnd w:id="39"/>
-    <w:bookmarkStart w:id="40" w:name="bağımsız-ölçüm-ve-başarı-ölçütleri"/>
+    <w:bookmarkEnd w:id="42"/>
+    <w:bookmarkStart w:id="43" w:name="bağımsız-ölçüm-ve-başarı-ölçütleri"/>
     <w:p>
       <w:pPr>
         <w:pStyle w:val="Heading3"/>
@@ -2534,6 +2709,14 @@
         <w:jc w:val="left"/>
         <w:tblLayout w:type="fixed"/>
         <w:tblLook w:firstRow="1" w:lastRow="0" w:firstColumn="0" w:lastColumn="0" w:noHBand="0" w:noVBand="0" w:val="0020"/>
+        <w:tblBorders>
+          <w:top w:val="single" w:sz="4" w:color="879CAE"/>
+          <w:left w:val="single" w:sz="4" w:color="879CAE"/>
+          <w:bottom w:val="single" w:sz="4" w:color="879CAE"/>
+          <w:right w:val="single" w:sz="4" w:color="879CAE"/>
+          <w:insideH w:val="single" w:sz="4" w:color="879CAE"/>
+          <w:insideV w:val="single" w:sz="4" w:color="879CAE"/>
+        </w:tblBorders>
       </w:tblPr>
       <w:tblGrid>
         <w:gridCol w:w="2098"/>
@@ -2991,8 +3174,8 @@
         <w:t xml:space="preserve">Waypoint ve rotaya dönüş için 10 cm, tüm hareket boyunca sağlanmış bir izleme hatası olarak yorumlanmayacaktır. Bir uzaklığın 10 cm sınırını karşıladığına ilişkin başarı kararı, ölçülen uzaklık ile ilgili konum belirsizliği toplamının bu sınırı aşmamasıyla verilecektir. Eşik çevresinde belirsiz kalan olaylar ayrı işaretlenecek ve başarılı sayılmayacaktır. Yalnızca engel önünde durmak veya elle yönlendirilerek devam etmek otonom başarı kabul edilmeyecektir.</w:t>
       </w:r>
     </w:p>
-    <w:bookmarkEnd w:id="40"/>
-    <w:bookmarkStart w:id="41" w:name="X23893ee6904c0fe3ebada413d88c01dc06fa5fc"/>
+    <w:bookmarkEnd w:id="43"/>
+    <w:bookmarkStart w:id="44" w:name="X23893ee6904c0fe3ebada413d88c01dc06fa5fc"/>
     <w:p>
       <w:pPr>
         <w:pStyle w:val="Heading3"/>
@@ -3179,8 +3362,8 @@
         <w:t xml:space="preserve">Ham sensör verileri, enkoderler, konum kestirimi, durum geçişleri ve video dosyaları ortak deneme kimliğiyle ilişkilendirilecektir. Yazılım/parametre değişikliği gerekirse eski kayıtlar korunacak ve karşılaştırılan koşullar yeni sürümle yeniden yürütülecektir. Kabul eşikleri sonuç görüldükten sonra gevşetilmeyecektir. Bulgular, dört koşul ve sınırlı tekrar sayısı içinde betimsel olarak yorumlanacak; tüm ortamlara genellenen başarı veya istatistiksel anlamlılık iddiası kurulmayacaktır.</w:t>
       </w:r>
     </w:p>
-    <w:bookmarkEnd w:id="41"/>
-    <w:bookmarkStart w:id="42" w:name="ön-hazırlık-ve-uygulanabilirlik"/>
+    <w:bookmarkEnd w:id="44"/>
+    <w:bookmarkStart w:id="45" w:name="ön-hazırlık-ve-uygulanabilirlik"/>
     <w:p>
       <w:pPr>
         <w:pStyle w:val="Heading3"/>
@@ -3197,19 +3380,18 @@
         <w:t xml:space="preserve">Başvuru hazırlığında ilgili yayınlar ve teknik dokümanlar incelenmiş; sistem mimarisi, kontrol akışı, deney protokolü ve tahmini bütçe hazırlanmıştır. Fiziksel prototip, sensör/motor kalibrasyonu ve performans deneyleri proje kapsamında gerçekleştirilecektir. Benzer koordinat aktarımı ve gömülü kontrol uygulamaları (Iqbal vd., 2023; Rodrigues vd., 2026), yerel algıyla kaçınmaya ilişkin deneysel çalışma (Alajlan vd., 2017) ve hareket planlama çerçevesi (Hauser, t.y.-a) yöntem seçimlerine dayanak oluşturmaktadır. Bu kaynakların farklı donanımlardaki sonuçları önerilen araç için elde edilmiş sonuç sayılmayacaktır.</w:t>
       </w:r>
     </w:p>
-    <w:bookmarkEnd w:id="42"/>
-    <w:bookmarkEnd w:id="43"/>
-    <w:bookmarkStart w:id="47" w:name="proje-yönetimi"/>
+    <w:bookmarkEnd w:id="45"/>
+    <w:bookmarkEnd w:id="46"/>
+    <w:bookmarkStart w:id="50" w:name="proje-yönetimi"/>
     <w:p>
       <w:pPr>
         <w:pStyle w:val="Heading2"/>
-        <w:pageBreakBefore/>
       </w:pPr>
       <w:r>
         <w:t xml:space="preserve">3. PROJE YÖNETİMİ</w:t>
       </w:r>
     </w:p>
-    <w:bookmarkStart w:id="44" w:name="çalışma-takvimi"/>
+    <w:bookmarkStart w:id="47" w:name="çalışma-takvimi"/>
     <w:p>
       <w:pPr>
         <w:pStyle w:val="Heading3"/>
@@ -3233,6 +3415,14 @@
         <w:jc w:val="left"/>
         <w:tblLayout w:type="fixed"/>
         <w:tblLook w:firstRow="1" w:lastRow="0" w:firstColumn="0" w:lastColumn="0" w:noHBand="0" w:noVBand="0" w:val="0020"/>
+        <w:tblBorders>
+          <w:top w:val="single" w:sz="4" w:color="879CAE"/>
+          <w:left w:val="single" w:sz="4" w:color="879CAE"/>
+          <w:bottom w:val="single" w:sz="4" w:color="879CAE"/>
+          <w:right w:val="single" w:sz="4" w:color="879CAE"/>
+          <w:insideH w:val="single" w:sz="4" w:color="879CAE"/>
+          <w:insideV w:val="single" w:sz="4" w:color="879CAE"/>
+        </w:tblBorders>
       </w:tblPr>
       <w:tblGrid>
         <w:gridCol w:w="850"/>
@@ -3862,8 +4052,8 @@
         <w:t xml:space="preserve">Başarıya katkı toplamı %100’dür. İlk iki ayda donanım ve arayüz çalışmaları kısmen paralel yürütülecektir. Rota takibine, hareket kalibrasyonu ve rota aktarımı tamamlandıktan sonra geçilecektir. Kaçınma entegrasyonu ve ayar denemelerini, son sürümün sabitlenmesi ile altıncı aydaki deneyler izleyecektir. Literatür incelemesi, temin ve raporlama ilgili teknik faaliyetlere eşlik edecek; bağımsız iş paketi yapılmayacaktır.</w:t>
       </w:r>
     </w:p>
-    <w:bookmarkEnd w:id="44"/>
-    <w:bookmarkStart w:id="45" w:name="risk-yönetimi"/>
+    <w:bookmarkEnd w:id="47"/>
+    <w:bookmarkStart w:id="48" w:name="risk-yönetimi"/>
     <w:p>
       <w:pPr>
         <w:pStyle w:val="Heading3"/>
@@ -3879,6 +4069,14 @@
         <w:jc w:val="left"/>
         <w:tblLayout w:type="fixed"/>
         <w:tblLook w:firstRow="1" w:lastRow="0" w:firstColumn="0" w:lastColumn="0" w:noHBand="0" w:noVBand="0" w:val="0020"/>
+        <w:tblBorders>
+          <w:top w:val="single" w:sz="4" w:color="879CAE"/>
+          <w:left w:val="single" w:sz="4" w:color="879CAE"/>
+          <w:bottom w:val="single" w:sz="4" w:color="879CAE"/>
+          <w:right w:val="single" w:sz="4" w:color="879CAE"/>
+          <w:insideH w:val="single" w:sz="4" w:color="879CAE"/>
+          <w:insideV w:val="single" w:sz="4" w:color="879CAE"/>
+        </w:tblBorders>
       </w:tblPr>
       <w:tblGrid>
         <w:gridCol w:w="2324"/>
@@ -4336,8 +4534,8 @@
         <w:t xml:space="preserve">B planları algılama, otonom kaçınma ve rotaya dönüş hedeflerini koruyacaktır. Donanım veya yöntem değişikliği sürümlenecek; karşılaştırılan deney koşulları aynı son düzenekle yürütülecektir.</w:t>
       </w:r>
     </w:p>
-    <w:bookmarkEnd w:id="45"/>
-    <w:bookmarkStart w:id="46" w:name="araştırma-olanakları"/>
+    <w:bookmarkEnd w:id="48"/>
+    <w:bookmarkStart w:id="49" w:name="araştırma-olanakları"/>
     <w:p>
       <w:pPr>
         <w:pStyle w:val="Heading3"/>
@@ -4361,6 +4559,14 @@
         <w:jc w:val="left"/>
         <w:tblLayout w:type="fixed"/>
         <w:tblLook w:firstRow="1" w:lastRow="0" w:firstColumn="0" w:lastColumn="0" w:noHBand="0" w:noVBand="0" w:val="0020"/>
+        <w:tblBorders>
+          <w:top w:val="single" w:sz="4" w:color="879CAE"/>
+          <w:left w:val="single" w:sz="4" w:color="879CAE"/>
+          <w:bottom w:val="single" w:sz="4" w:color="879CAE"/>
+          <w:right w:val="single" w:sz="4" w:color="879CAE"/>
+          <w:insideH w:val="single" w:sz="4" w:color="879CAE"/>
+          <w:insideV w:val="single" w:sz="4" w:color="879CAE"/>
+        </w:tblBorders>
       </w:tblPr>
       <w:tblGrid>
         <w:gridCol w:w="2381"/>
@@ -4596,13 +4802,12 @@
         <w:t xml:space="preserve">Mevcut telefon ve lehim ekipmanı için yeni alım öngörülmemektedir. Tasarım, doğrulanmamış bir 3D yazıcı, özel imalat cihazı veya kurumsal robotik laboratuvarına erişim gerektirmeyecek biçimde, hazır mekanik parçalar ve basit bağlantı elemanlarıyla kurulacaktır.</w:t>
       </w:r>
     </w:p>
-    <w:bookmarkEnd w:id="46"/>
-    <w:bookmarkEnd w:id="47"/>
-    <w:bookmarkStart w:id="48" w:name="araştirma-önerisinin-yaygin-etkisi"/>
+    <w:bookmarkEnd w:id="49"/>
+    <w:bookmarkEnd w:id="50"/>
+    <w:bookmarkStart w:id="51" w:name="araştirma-önerisinin-yaygin-etkisi"/>
     <w:p>
       <w:pPr>
         <w:pStyle w:val="Heading2"/>
-        <w:pageBreakBefore/>
       </w:pPr>
       <w:r>
         <w:t xml:space="preserve">4. ARAŞTIRMA ÖNERİSİNİN YAYGIN ETKİSİ</w:t>
@@ -4623,6 +4828,14 @@
         <w:jc w:val="left"/>
         <w:tblLayout w:type="fixed"/>
         <w:tblLook w:firstRow="1" w:lastRow="0" w:firstColumn="0" w:lastColumn="0" w:noHBand="0" w:noVBand="0" w:val="0020"/>
+        <w:tblBorders>
+          <w:top w:val="single" w:sz="4" w:color="879CAE"/>
+          <w:left w:val="single" w:sz="4" w:color="879CAE"/>
+          <w:bottom w:val="single" w:sz="4" w:color="879CAE"/>
+          <w:right w:val="single" w:sz="4" w:color="879CAE"/>
+          <w:insideH w:val="single" w:sz="4" w:color="879CAE"/>
+          <w:insideV w:val="single" w:sz="4" w:color="879CAE"/>
+        </w:tblBorders>
       </w:tblPr>
       <w:tblGrid>
         <w:gridCol w:w="1928"/>
@@ -4956,8 +5169,8 @@
         <w:t xml:space="preserve">Paylaşılabilir yazılım, bağlantı bilgileri ve deney düzeni, proje için kullanılan GitHub deposunda sürümlenecektir. Veri paylaşımında kişiler veya mekâna ait tanımlayıcı görüntüler ayıklanacak, bilimsel değerlendirme için gerekli araç/alan verileri korunacaktır. Çıktıların, yürütücünün gömülü kontrol, arayüz geliştirme ve deneysel analiz becerilerine katkı sağlaması beklenmektedir. Yayın veya sunum, elde edilecek bulguların niteliğine göre değerlendirilecektir.</w:t>
       </w:r>
     </w:p>
-    <w:bookmarkEnd w:id="48"/>
-    <w:bookmarkStart w:id="49" w:name="belirtmek-istenen-diğer-konular"/>
+    <w:bookmarkEnd w:id="51"/>
+    <w:bookmarkStart w:id="52" w:name="belirtmek-istenen-diğer-konular"/>
     <w:p>
       <w:pPr>
         <w:pStyle w:val="Heading2"/>
@@ -4979,11 +5192,11 @@
         <w:pStyle w:val="BodyText"/>
       </w:pPr>
       <w:r>
-        <w:t xml:space="preserve">Önerinin hazırlanmasında ChatGPT/Codex araçlarından kaynak inceleme desteği, metin düzenleme ve belge üretimi; image_gen aracından üç tasarım şemasının hazırlanması için yararlanılmıştır. Bilimsel içerik, kaynaklar ve proje kararlarının sorumluluğu yürütücüye aittir; akademik danışmanın kontrolüne sunulmaktadır. Görseller tasarım şemalarıdır; üretilmiş prototip veya elde edilmiş deney sonucu göstermez.</w:t>
+        <w:t xml:space="preserve">Önerinin hazırlanmasında ChatGPT/Codex araçlarından kaynak inceleme desteği, metin düzenleme ve belge üretimi; image_gen aracından sistem ve kontrol akışı şemalarının hazırlanması; Matplotlib aracından planlanan deney geometrisinin koordinatlardan çizilmesi için yararlanılmıştır. Bilimsel içeriğin doğruluğu, kaynakların uygunluğu ve araştırma yönteminin uygulanmasına ilişkin sorumluluk proje yürütücüsüne ve akademik danışmana aittir. Görseller tasarım şemalarıdır; üretilmiş prototip veya elde edilmiş deney sonucu göstermez.</w:t>
       </w:r>
     </w:p>
-    <w:bookmarkEnd w:id="49"/>
-    <w:bookmarkStart w:id="51" w:name="ekler"/>
+    <w:bookmarkEnd w:id="52"/>
+    <w:bookmarkStart w:id="54" w:name="ekler"/>
     <w:p>
       <w:pPr>
         <w:pStyle w:val="Heading2"/>
@@ -4992,7 +5205,7 @@
         <w:t xml:space="preserve">6. EKLER</w:t>
       </w:r>
     </w:p>
-    <w:bookmarkStart w:id="50" w:name="ek-1.-gerekçeli-bütçe"/>
+    <w:bookmarkStart w:id="53" w:name="ek-1.-gerekçeli-bütçe"/>
     <w:p>
       <w:pPr>
         <w:pStyle w:val="Heading3"/>
@@ -5029,6 +5242,14 @@
         <w:jc w:val="left"/>
         <w:tblLayout w:type="fixed"/>
         <w:tblLook w:firstRow="1" w:lastRow="0" w:firstColumn="0" w:lastColumn="0" w:noHBand="0" w:noVBand="0" w:val="0020"/>
+        <w:tblBorders>
+          <w:top w:val="single" w:sz="4" w:color="879CAE"/>
+          <w:left w:val="single" w:sz="4" w:color="879CAE"/>
+          <w:bottom w:val="single" w:sz="4" w:color="879CAE"/>
+          <w:right w:val="single" w:sz="4" w:color="879CAE"/>
+          <w:insideH w:val="single" w:sz="4" w:color="879CAE"/>
+          <w:insideV w:val="single" w:sz="4" w:color="879CAE"/>
+        </w:tblBorders>
       </w:tblPr>
       <w:tblGrid>
         <w:gridCol w:w="4819"/>
@@ -6997,9 +7218,9 @@
         <w:t xml:space="preserve">Mevcut telefon ve lehim ekipmanı yeniden bütçelenmemiştir. Hazır kitte bulunan parçalar ikinci kez alınmayacak; tedarik, Bölüm 2.2’de tanımlanan işlevsel uyum şartlarına göre yapılacaktır.</w:t>
       </w:r>
     </w:p>
-    <w:bookmarkEnd w:id="50"/>
-    <w:bookmarkEnd w:id="51"/>
-    <w:bookmarkStart w:id="59" w:name="kaynaklar"/>
+    <w:bookmarkEnd w:id="53"/>
+    <w:bookmarkEnd w:id="54"/>
+    <w:bookmarkStart w:id="62" w:name="kaynaklar"/>
     <w:p>
       <w:pPr>
         <w:pStyle w:val="Heading2"/>
@@ -7050,7 +7271,7 @@
       <w:r>
         <w:t xml:space="preserve"> </w:t>
       </w:r>
-      <w:hyperlink r:id="rId52">
+      <w:hyperlink r:id="rId55">
         <w:r>
           <w:rPr>
             <w:rStyle w:val="Hyperlink"/>
@@ -7103,7 +7324,7 @@
       <w:r>
         <w:t xml:space="preserve"> </w:t>
       </w:r>
-      <w:hyperlink r:id="rId53">
+      <w:hyperlink r:id="rId56">
         <w:r>
           <w:rPr>
             <w:rStyle w:val="Hyperlink"/>
@@ -7156,7 +7377,7 @@
       <w:r>
         <w:t xml:space="preserve"> </w:t>
       </w:r>
-      <w:hyperlink r:id="rId54">
+      <w:hyperlink r:id="rId57">
         <w:r>
           <w:rPr>
             <w:rStyle w:val="Hyperlink"/>
@@ -7209,7 +7430,7 @@
       <w:r>
         <w:t xml:space="preserve"> </w:t>
       </w:r>
-      <w:hyperlink r:id="rId55">
+      <w:hyperlink r:id="rId58">
         <w:r>
           <w:rPr>
             <w:rStyle w:val="Hyperlink"/>
@@ -7262,7 +7483,7 @@
       <w:r>
         <w:t xml:space="preserve"> </w:t>
       </w:r>
-      <w:hyperlink r:id="rId56">
+      <w:hyperlink r:id="rId59">
         <w:r>
           <w:rPr>
             <w:rStyle w:val="Hyperlink"/>
@@ -7315,7 +7536,7 @@
       <w:r>
         <w:t xml:space="preserve"> </w:t>
       </w:r>
-      <w:hyperlink r:id="rId57">
+      <w:hyperlink r:id="rId60">
         <w:r>
           <w:rPr>
             <w:rStyle w:val="Hyperlink"/>
@@ -7368,7 +7589,7 @@
       <w:r>
         <w:t xml:space="preserve"> </w:t>
       </w:r>
-      <w:hyperlink r:id="rId58">
+      <w:hyperlink r:id="rId61">
         <w:r>
           <w:rPr>
             <w:rStyle w:val="Hyperlink"/>
@@ -7380,8 +7601,8 @@
         <w:t xml:space="preserve">.</w:t>
       </w:r>
     </w:p>
-    <w:bookmarkEnd w:id="59"/>
-    <w:bookmarkEnd w:id="60"/>
+    <w:bookmarkEnd w:id="62"/>
+    <w:bookmarkEnd w:id="63"/>
     <w:sectPr>
       <w:headerReference r:id="rId9" w:type="default"/>
       <w:footerReference r:id="rId10" w:type="default"/>
@@ -7404,14 +7625,8 @@
   <w:p>
     <w:pPr>
       <w:pStyle w:val="Footer"/>
-      <w:jc w:val="center"/>
+      <w:jc w:val="right"/>
     </w:pPr>
-    <w:r>
-      <w:rPr>
-        <w:sz w:val="16"/>
-      </w:rPr>
-      <w:t xml:space="preserve">Ahmet Talha Arslan  ·  </w:t>
-    </w:r>
     <w:fldSimple w:instr="PAGE"/>
   </w:p>
 </w:ftr>
@@ -7441,13 +7656,20 @@
   <w:p>
     <w:pPr>
       <w:pStyle w:val="Header"/>
+      <w:jc w:val="center"/>
+      <w:pBdr>
+        <w:bottom w:val="single" w:sz="5" w:space="10" w:color="879CAE"/>
+      </w:pBdr>
     </w:pPr>
     <w:r>
       <w:rPr>
+        <w:b/>
         <w:color w:val="64748B"/>
         <w:sz w:val="16"/>
       </w:rPr>
-      <w:t>TÜBİTAK 2209-A  |  Araştırma önerisi</w:t>
+      <w:t>2209-A ÜNİVERSİTE ÖĞRENCİLERİ ARAŞTIRMA PROJELERİ DESTEKLEME PROGRAMI</w:t>
+      <w:br/>
+      <w:t>ARAŞTIRMA ÖNERİSİ</w:t>
     </w:r>
   </w:p>
 </w:hdr>
@@ -8121,11 +8343,11 @@
     <w:rsid w:val="00FC693F"/>
     <w:pPr>
       <w:widowControl/>
-      <w:spacing w:after="120" w:line="269" w:lineRule="auto"/>
+      <w:spacing w:after="80" w:line="252" w:lineRule="auto"/>
     </w:pPr>
     <w:rPr>
-      <w:rFonts w:ascii="Times New Roman" w:hAnsi="Times New Roman"/>
-      <w:sz w:val="22"/>
+      <w:rFonts w:ascii="Arial" w:hAnsi="Arial"/>
+      <w:sz w:val="20"/>
     </w:rPr>
   </w:style>
   <w:style w:styleId="Header" w:type="paragraph">
@@ -8183,7 +8405,7 @@
     <w:pPr>
       <w:keepNext/>
       <w:keepLines/>
-      <w:spacing w:after="120" w:before="240"/>
+      <w:spacing w:after="80" w:before="180"/>
       <w:outlineLvl w:val="0"/>
     </w:pPr>
     <w:rPr>
@@ -8191,7 +8413,7 @@
       <w:b/>
       <w:bCs/>
       <w:color w:val="183A57"/>
-      <w:sz w:val="34"/>
+      <w:sz w:val="44"/>
       <w:szCs w:val="28"/>
     </w:rPr>
   </w:style>
@@ -8207,7 +8429,7 @@
     <w:pPr>
       <w:keepNext/>
       <w:keepLines/>
-      <w:spacing w:after="120" w:before="240"/>
+      <w:spacing w:after="80" w:before="180"/>
       <w:outlineLvl w:val="1"/>
     </w:pPr>
     <w:rPr>
@@ -8215,7 +8437,7 @@
       <w:b/>
       <w:bCs/>
       <w:color w:val="183A57"/>
-      <w:sz w:val="28"/>
+      <w:sz w:val="24"/>
       <w:szCs w:val="26"/>
     </w:rPr>
   </w:style>
@@ -8231,7 +8453,7 @@
     <w:pPr>
       <w:keepNext/>
       <w:keepLines/>
-      <w:spacing w:after="120" w:before="240"/>
+      <w:spacing w:after="80" w:before="180"/>
       <w:outlineLvl w:val="2"/>
     </w:pPr>
     <w:rPr>
@@ -8239,7 +8461,7 @@
       <w:b/>
       <w:bCs/>
       <w:color w:val="183A57"/>
-      <w:sz w:val="23"/>
+      <w:sz w:val="21"/>
     </w:rPr>
   </w:style>
   <w:style w:styleId="Heading4" w:type="paragraph">
@@ -8919,12 +9141,12 @@
       <w:spacing w:line="240" w:lineRule="auto"/>
     </w:pPr>
     <w:rPr>
-      <w:rFonts w:ascii="Times New Roman" w:hAnsi="Times New Roman"/>
+      <w:rFonts w:ascii="Arial" w:hAnsi="Arial"/>
       <w:b/>
       <w:bCs/>
       <w:i w:val="0"/>
       <w:color w:val="475569"/>
-      <w:sz w:val="18"/>
+      <w:sz w:val="17"/>
       <w:szCs w:val="18"/>
     </w:rPr>
   </w:style>

</xml_diff>

<commit_message>
2209-A araştırma yöntemini kaynaklar ve mantıksal ön çalışmayla güçlendir
</commit_message>
<xml_diff>
--- a/docs/2209-A/ARASTIRMA_ONERISI.docx
+++ b/docs/2209-A/ARASTIRMA_ONERISI.docx
@@ -55,7 +55,7 @@
         </w:drawing>
       </w:r>
     </w:p>
-    <w:bookmarkStart w:id="63" w:name="tübitak-2209-a"/>
+    <w:bookmarkStart w:id="66" w:name="tübitak-2209-a"/>
     <w:p>
       <w:pPr>
         <w:pStyle w:val="Heading1"/>
@@ -123,7 +123,7 @@
           <w:color w:val="203E5C"/>
           <w:sz w:val="28"/>
         </w:rPr>
-        <w:t xml:space="preserve">Kullanıcı tarafından belirlenen rota bilgisine göre hareket eden otonom araç tasarımı</w:t>
+        <w:t xml:space="preserve">Kullanıcı tanımlı rotada sabit engelden kaçınma ve rotaya yeniden katılma: küçük ölçekli bir kara aracında deneysel değerlendirme</w:t>
       </w:r>
     </w:p>
     <w:p>
@@ -400,7 +400,7 @@
               <w:rPr>
                 <w:sz w:val="19"/>
               </w:rPr>
-              <w:t xml:space="preserve">Kullanıcı tarafından belirlenen rota bilgisine göre hareket eden otonom araç tasarımı</w:t>
+              <w:t xml:space="preserve">Kullanıcı tanımlı rotada sabit engelden kaçınma ve rotaya yeniden katılma: küçük ölçekli bir kara aracında deneysel değerlendirme</w:t>
             </w:r>
           </w:p>
         </w:tc>
@@ -734,7 +734,7 @@
               <w:rPr>
                 <w:sz w:val="20"/>
               </w:rPr>
-              <w:t xml:space="preserve">Düz zeminde 3 × 3 metrelik kontrollü alanda, engelsiz referans ve üç sabit engel yerleşimi değerlendirilecektir. Her koşulda 10 tekrar olmak üzere toplam 40 geçerli deneme yapılacaktır. Her engelli koşulda en az 8/10 denemede temas öncesi algılama, çarpışmasız kaçınma, rotaya dönüş ve hedefe ulaşmanın birlikte sağlanması hedeflenmektedir. Waypoint erişimi ve rotaya dönüş için 10 cm tolerans, görev tamamlama için 120 saniye üst sınırı kullanılacaktır. Hareket, mevcut telefonla alınacak sabit görüntü kaydı üzerinden bağımsız olarak değerlendirilecektir. Başarı oranları, tamamlanma süreleri ve rota izleme hataları raporlanacaktır.</w:t>
+              <w:t xml:space="preserve">Düz zeminde 3 × 3 metrelik kontrollü alanda, engelsiz referans ve üç sabit engel yerleşimi değerlendirilecektir. Her koşulda 10 tekrar olmak üzere toplam 40 geçerli deneme yapılacaktır. Her engelli koşulda en az 8/10 denemede temas öncesi algılama, çarpışmasız kaçınma, rotaya dönüş ve hedefe ulaşmanın birlikte sağlanması hedeflenmektedir. Waypoint erişimi ve rotaya dönüş için 10 cm tolerans, görev tamamlama için 120 saniye üst sınırı kullanılacaktır. Hareket, mevcut telefonla alınacak sabit görüntü kaydı üzerinden bağımsız olarak değerlendirilecektir. Başarı oranları güven aralıklarıyla, tamamlanma süreleri ve rota izleme hatalarıyla birlikte raporlanacaktır. Ön çalışmada altı sentetik senaryoyla durum makinesinin geçiş ve durdurma mantığı kontrol edilmiştir.</w:t>
             </w:r>
           </w:p>
           <w:p>
@@ -746,7 +746,7 @@
               <w:rPr>
                 <w:sz w:val="20"/>
               </w:rPr>
-              <w:t xml:space="preserve">Altı aylık çalışma, donanım ve kalibrasyon, arayüz, rota takibi, engelden kaçınma ile deney ve analizden oluşan beş iş paketinde yürütülecektir. Beklenen çıktılar bir araç prototipi, rota arayüzü, deney kayıt kümesi ve sürümlenmiş yazılım ile teknik dokümantasyondur. Çalışmanın, gömülü kontrol ve mobil robotik alanında deneysel bir eğitim ve geliştirme altyapısı oluşturması beklenmektedir.</w:t>
+              <w:t xml:space="preserve">Altı aylık çalışma, donanım ve kalibrasyon, arayüz, rota takibi, engelden kaçınma ile deney, analiz ve raporlamadan oluşan beş iş paketinde yürütülecektir. Beklenen çıktılar bir araç prototipi, rota arayüzü, deney kayıt kümesi ve sürümlenmiş yazılım ile teknik dokümantasyondur. Çalışmanın, gömülü kontrol ve mobil robotik alanında deneysel bir eğitim ve geliştirme altyapısı oluşturması beklenmektedir.</w:t>
             </w:r>
           </w:p>
           <w:p>
@@ -822,7 +822,15 @@
         <w:pStyle w:val="BodyText"/>
       </w:pPr>
       <w:r>
-        <w:t xml:space="preserve">İki tekerleği bağımsız sürülen araçlarda, tekerlek hareketleri kullanılarak aracın doğrusal hareketi ve yönelimi hesaplanabilir (Dellaert ve Hutchinson, t.y.). Bununla birlikte tekerlek kayması ve dönüşlerdeki hatalar konum hesabını etkileyebilir. Yerel mesafe bilgisiyle çalışan Bug türü yöntemler ise tüm engellerin haritası önceden bilinmeden hedefe ilerleme ve engel çevresini izleme davranışlarını ele almaktadır. Bu yöntemlerin fiziksel bir araçta uygulanmasında araç boyutu, algılama kapsamı ve konum hatası dikkate alınmalıdır (Hauser, t.y.-a).</w:t>
+        <w:t xml:space="preserve">İki tekerleği bağımsız sürülen araçlarda, tekerlek hareketleri kullanılarak aracın doğrusal hareketi ve yönelimi hesaplanabilir (Corke, 2017). Bununla birlikte tekerlek kayması ve dönüşlerdeki hatalar konum hesabını etkileyebilir. Yerel mesafe bilgisiyle çalışan Bug türü yöntemler ise tüm engellerin haritası önceden bilinmeden hedefe ilerleme ve engel çevresini izleme davranışlarını ele almaktadır. Bu yöntemlerin fiziksel bir araçta uygulanmasında araç boyutu, algılama kapsamı ve konum hatası dikkate alınmalıdır (Lumelsky ve Stepanov, 1987; Corke, 2017).</w:t>
+      </w:r>
+    </w:p>
+    <w:p>
+      <w:pPr>
+        <w:pStyle w:val="BodyText"/>
+      </w:pPr>
+      <w:r>
+        <w:t xml:space="preserve">Depo ve lojistikte kullanılan mobil araçlarda, tanımlı bir görevin engel sonrasında sürdürülebilmesi önemli bir işlevdir. Bu çalışma, aynı problemi küçük ölçekli bir prototipte ele alarak gömülü kontrol ve mobil robotik eğitiminde kullanılabilecek, deneyleri tekrarlanabilir bir platform oluşturmayı hedeflemektedir. Elde edilecek bulgular, kontrollü derslik koşulları için yorumlanacaktır.</w:t>
       </w:r>
     </w:p>
     <w:p>
@@ -862,7 +870,7 @@
           <w:b/>
           <w:bCs/>
         </w:rPr>
-        <w:t xml:space="preserve">Araştırma sorusu ve beklenen katkı</w:t>
+        <w:t xml:space="preserve">Araştırma boşluğu</w:t>
       </w:r>
     </w:p>
     <w:p>
@@ -870,25 +878,7 @@
         <w:pStyle w:val="BodyText"/>
       </w:pPr>
       <w:r>
-        <w:t xml:space="preserve">Araştırma sorusu,</w:t>
-      </w:r>
-      <w:r>
-        <w:t xml:space="preserve"> </w:t>
-      </w:r>
-      <w:r>
-        <w:t xml:space="preserve">“</w:t>
-      </w:r>
-      <w:r>
-        <w:t xml:space="preserve">Sabit engelin rota üzerindeki yeri, kullanıcı tanımlı waypoint rotasını izleyen bir kara aracının engeli algılama, çarpışmadan kaçınma ve rotaya yeniden katılma başarısını nasıl etkiler?</w:t>
-      </w:r>
-      <w:r>
-        <w:t xml:space="preserve">”</w:t>
-      </w:r>
-      <w:r>
-        <w:t xml:space="preserve"> </w:t>
-      </w:r>
-      <w:r>
-        <w:t xml:space="preserve">biçiminde belirlenmiştir. Aynı araç ve rota kullanılarak engelin düz bölümde, dönüş öncesinde ve dönüş sonrasında bulunması karşılaştırılacaktır. Engelsiz koşul, temel rota takibini değerlendirmek için referans alınacaktır.</w:t>
+        <w:t xml:space="preserve">İncelenen uygulamalarda koordinat aktarımı ve zemin işaretleme (Iqbal vd., 2023), diferansiyel sürüşlü araçta yörünge takibi (Rodrigues vd., 2026) ve çoklu sensörle engelden kaçınma (Alajlan vd., 2017) farklı görevler ve deney düzenleri üzerinden değerlendirilmektedir. Bu projenin ele aldığı araştırma boşluğu, seçilen küçük ölçekli mimaride kullanıcı tanımlı rotaya engel sonrasında yeniden katılmanın hangi aşamalarda aksadığını ve engelin yerinin bu davranışı nasıl etkilediğini açıklayan deneysel veriye duyulan ihtiyaçtır. Bu amaçla algılama, kaçınma, dönüş ve görev tamamlama aynı protokolde ayrı kaydedilecek; sonuçlar bağımsız video ölçümü ve koşul başına tekrarlı denemelerle ilişkilendirilecektir. Böylece genel görev başarısının yanında, başarısızlığın oluştuğu aşamayı gösteren bir değerlendirme sağlanacaktır.</w:t>
       </w:r>
     </w:p>
     <w:p>
@@ -896,7 +886,63 @@
         <w:pStyle w:val="BodyText"/>
       </w:pPr>
       <w:r>
-        <w:t xml:space="preserve">Beklenen katkı, kullanıcı arayüzü ile ESP32 tabanlı hareket kontrolünü bütünleştiren bir prototipin geliştirilmesi ve başarının tek bir genel oran yerine algılama, kaçınma, rotaya dönüş ve görev tamamlama aşamalarında değerlendirilmesidir. Başarılı ve başarısız denemelerin birlikte incelenmesi, sistemin hangi koşullarda yeterli olduğunu ve hangi noktalarda geliştirme gerektirdiğini gösterecektir. Ölçümlerin güvenilir referanslarla kontrol edilmesi kalibrasyon yaklaşımına dayanmaktadır (Hauser, t.y.-b). Çalışmanın sonuçları, düz zemindeki 3 × 3 metrelik alan ve seçilen sabit engel koşullarıyla sınırlandırılacaktır.</w:t>
+        <w:rPr>
+          <w:b/>
+          <w:bCs/>
+        </w:rPr>
+        <w:t xml:space="preserve">Araştırma sorusu ve beklenen katkı</w:t>
+      </w:r>
+    </w:p>
+    <w:p>
+      <w:pPr>
+        <w:pStyle w:val="BodyText"/>
+      </w:pPr>
+      <w:r>
+        <w:t xml:space="preserve">Araştırma sorusu,</w:t>
+      </w:r>
+      <w:r>
+        <w:t xml:space="preserve"> </w:t>
+      </w:r>
+      <w:r>
+        <w:t xml:space="preserve">“</w:t>
+      </w:r>
+      <w:r>
+        <w:t xml:space="preserve">Sabit engelin rota üzerindeki yeri, kullanıcı tanımlı waypoint rotasını izleyen bir kara aracının engeli algılama, çarpışmadan kaçınma ve rotaya yeniden katılma başarısını nasıl etkiler?</w:t>
+      </w:r>
+      <w:r>
+        <w:t xml:space="preserve">”</w:t>
+      </w:r>
+      <w:r>
+        <w:t xml:space="preserve"> </w:t>
+      </w:r>
+      <w:r>
+        <w:t xml:space="preserve">biçiminde belirlenmiştir. Aynı araç ve rota kullanılarak engelin düz bölümde, dönüş öncesinde ve dönüş sonrasında bulunması karşılaştırılacaktır. Engelsiz koşul, temel rota takibini değerlendirmek için referans alınacaktır.</w:t>
+      </w:r>
+    </w:p>
+    <w:p>
+      <w:pPr>
+        <w:pStyle w:val="BodyText"/>
+      </w:pPr>
+      <w:r>
+        <w:rPr>
+          <w:b/>
+          <w:bCs/>
+        </w:rPr>
+        <w:t xml:space="preserve">Hipotez H1:</w:t>
+      </w:r>
+      <w:r>
+        <w:t xml:space="preserve"> </w:t>
+      </w:r>
+      <w:r>
+        <w:t xml:space="preserve">Planlanan geometride engelin rota üzerindeki uzak kenarı ile sıradaki waypoint arasındaki mesafe K1’de 0,70 m, K2’de 0,35 m ve K3’te 0,60 m’dir. Köşe waypoint’ine yaklaşımı temsil eden K2’de kullanılabilir mesafenin daha sınırlı olması nedeniyle birleşik görev başarı oranının K1 ve K3 koşullarından düşük olması beklenmektedir. Hipotez, koşul bazlı gözlenen oranlar ve güven aralıklarıyla değerlendirilecek; sınırlı tekrar sayısıyla kesin bir genelleme yapılmayacaktır.</w:t>
+      </w:r>
+    </w:p>
+    <w:p>
+      <w:pPr>
+        <w:pStyle w:val="BodyText"/>
+      </w:pPr>
+      <w:r>
+        <w:t xml:space="preserve">Beklenen katkı, kullanıcı arayüzü ile ESP32 tabanlı hareket kontrolünü bütünleştiren bir prototipin geliştirilmesi ve başarının tek bir genel oran yerine algılama, kaçınma, rotaya dönüş ve görev tamamlama aşamalarında değerlendirilmesidir. Başarılı ve başarısız denemelerin birlikte incelenmesi, sistemin hangi koşullarda yeterli olduğunu ve hangi noktalarda geliştirme gerektirdiğini gösterecektir. Ölçümlerin güvenilir referanslarla kontrol edilmesi kalibrasyon yaklaşımına dayanmaktadır (Corke, 2017). Çalışmanın sonuçları, düz zemindeki 3 × 3 metrelik alan ve seçilen sabit engel koşullarıyla sınırlandırılacaktır.</w:t>
       </w:r>
     </w:p>
     <w:bookmarkEnd w:id="25"/>
@@ -1007,7 +1053,7 @@
     </w:p>
     <w:bookmarkEnd w:id="26"/>
     <w:bookmarkEnd w:id="27"/>
-    <w:bookmarkStart w:id="46" w:name="yöntem"/>
+    <w:bookmarkStart w:id="49" w:name="yöntem"/>
     <w:p>
       <w:pPr>
         <w:pStyle w:val="Heading2"/>
@@ -1038,7 +1084,7 @@
         <w:pStyle w:val="BodyText"/>
       </w:pPr>
       <w:r>
-        <w:t xml:space="preserve">Donanım ve kalibrasyon İP1, arayüz ve haberleşme İP2, konum kestirimi ve rota takibi İP3, kaçınma ve rotaya dönüş İP4 kapsamında geliştirilecektir. Bütünleşik sistemin dört koşulda değerlendirilmesi ve veri analizi İP5 kapsamında yapılacaktır. Geliştirme/ayar denemeleri, nihai 40 değerlendirme denemesinden ayrı tutulacaktır.</w:t>
+        <w:t xml:space="preserve">Donanım ve kalibrasyon İP1, arayüz ve haberleşme İP2, konum kestirimi ve rota takibi İP3, kaçınma ve rotaya dönüş İP4 kapsamında geliştirilecektir. Bütünleşik sistemin dört koşulda değerlendirilmesi, veri analizi ve sonuçların raporlanması İP5 kapsamında yapılacaktır. Geliştirme/ayar denemeleri, nihai 40 değerlendirme denemesinden ayrı tutulacaktır.</w:t>
       </w:r>
     </w:p>
     <w:bookmarkEnd w:id="28"/>
@@ -1537,6 +1583,14 @@
       </w:pPr>
       <w:r>
         <w:t xml:space="preserve">Sensörlerin başlangıç yönleri ileri eksene göre 0°, ±45° ve ±90° olacaktır. Ön sensörler yaklaşan engeli, yan sensörler engel kenarındaki açıklığı izleyecektir. Montaj yüksekliği, ışınların deney engelini göreceği biçimde ayarlanacak; gerçek kapsama ve kör bölgeler kalibrasyon kaydına işlenecektir. Beş sensörün varlığı kesintisiz çevre algısı olarak yorumlanmayacaktır.</w:t>
+      </w:r>
+    </w:p>
+    <w:p>
+      <w:pPr>
+        <w:pStyle w:val="BodyText"/>
+      </w:pPr>
+      <w:r>
+        <w:t xml:space="preserve">ToF ölçümünün geçerliliği; hedef yüzeyi, ortam ışığı ve ölçüm süresine bağlı olarak kontrol edilecektir. Referans ToF bileşeninin veri sayfası, farklı yansıtıcılık ve aydınlatma koşulları için ayrı menzil ve doğruluk değerleri vermektedir (STMicroelectronics, 2024). Bu nedenle üretici tablosundaki bir değer doğrudan aracın doğruluğu kabul edilmeyecek; seçilen taşıyıcı ve deney engeli için tekrarlı mesafe kontrolleri yapılacaktır.</w:t>
       </w:r>
     </w:p>
     <w:p>
@@ -1632,7 +1686,7 @@
         <w:pStyle w:val="FirstParagraph"/>
       </w:pPr>
       <w:r>
-        <w:t xml:space="preserve">Tekerlek yarıçapları, iki tekerlek arasındaki açıklık ve çıkış mili devri başına sayılan enkoder kenarı sayısı kalibrasyonla kaydedilecektir. Motor mili/çıkış mili çözünürlüğü ve sayım yöntemi birbirinden ayrılacaktır. Diferansiyel sürüş kinematiğiyle tekerlek hareketlerinden göreli konum ve yön hesaplanacaktır (Dellaert ve Hutchinson, t.y.).</w:t>
+        <w:t xml:space="preserve">Tekerlek yarıçapları, iki tekerlek arasındaki açıklık ve çıkış mili devri başına sayılan enkoder kenarı sayısı kalibrasyonla kaydedilecektir. Motor mili/çıkış mili çözünürlüğü ve sayım yöntemi birbirinden ayrılacaktır. Diferansiyel sürüş kinematiğiyle tekerlek hareketlerinden göreli konum ve yön hesaplanacaktır (Corke, 2017).</w:t>
       </w:r>
     </w:p>
     <w:p>
@@ -1863,7 +1917,15 @@
         <w:pStyle w:val="BodyText"/>
       </w:pPr>
       <w:r>
-        <w:t xml:space="preserve">Denetim döngüsü 20 Hz olarak kurulacak; beş sensörün tam taraması en az 5 Hz, görev telemetrisi 5 Hz olacak şekilde zamanlama düzenlenecektir. Sensörler ayrı kanallardan sıralı okunacaktır. Üretici durum kodlarına göre geçerli bir engel-yok çıktısı ile iletişim/ölçüm hatası ayrılacak; belirsiz veri boş yol kabul edilmeyecektir. Ölçüm zaman damgaları tutulacak; 250 ms’den eski veya geçersiz engel verisiyle hareket sürdürülemeyecektir. Tekerlek kayması ve odometrik sürüklenme, bağımsız ölçümle izlenecektir.</w:t>
+        <w:t xml:space="preserve">Denetim döngüsü 20 Hz, beş sensörün tam taraması en az 5 Hz ve görev telemetrisi 5 Hz olacak şekilde planlanmıştır. Sensör başına yaklaşık 33 ms ölçüm bütçesinde beşli tarama 165 ms tutacak; kanal seçimi ve veri işleme için 35 ms ayrılarak toplam tarama hedefi 200 ms olacaktır. Referans bileşende belirtilen 33 ms ölçüm bütçesi bu başlangıç planına dayanak oluşturmaktadır (STMicroelectronics, 2024). 250 ms veri yaşı sınırı, 200 ms taramaya 20 Hz denetimin bir periyodu olan 50 ms’nin eklenmesiyle belirlenmiştir. Bunlar ölçülmüş gecikmeler değil, zamanlama tasarım hedefleridir. Ölçüm başlangıcı zaman damgalanacak; veri yaşı her denetim adımında kontrol edilecektir. Eşik aşımı en geç sonraki 50 ms’lik adımda durdurmaya dönüşeceğinden, durma mesafesi hesabında 300 ms’lik toplam veri yaşı/tepki bütçesi dikkate alınacaktır.</w:t>
+      </w:r>
+    </w:p>
+    <w:p>
+      <w:pPr>
+        <w:pStyle w:val="BodyText"/>
+      </w:pPr>
+      <w:r>
+        <w:t xml:space="preserve">Sensörler ayrı kanallardan sıralı okunacaktır. Tamamlanan her sensör ölçümü, tam taramanın sonunu beklemeden denetleyiciye ayrı olarak aktarılacaktır. Üretici durum kodlarına göre ölçüm sonucu ve iletişim/ölçüm hatası ayrılacak; belirsiz veri boş yol kabul edilmeyecektir. Gerçek tarama ve tepki süreleri montaj sonrasında kaydedilecek; 200 ms tarama hedefi sağlanmadan nihai deneylere başlanmayacaktır. Tekerlek kayması ve odometrik sürüklenme bağımsız ölçümle izlenecektir.</w:t>
       </w:r>
     </w:p>
     <w:bookmarkEnd w:id="33"/>
@@ -1889,7 +1951,7 @@
         <w:pStyle w:val="BodyText"/>
       </w:pPr>
       <w:r>
-        <w:t xml:space="preserve">Rota HTTP üzerinden araca aktarılacak; görev durumu ve komutlar WebSocket bağlantısıyla iletilecektir. ESP-IDF HTTP sunucusunun WebSocket desteği, bu haberleşme düzeninin teknik dayanağıdır (Espressif Systems, t.y.). Alan dışındaki noktalar ve sıfır uzunluklu ardışık parçalar yükleme sırasında reddedilecektir. Başlatma için rota kabulü, geçerli sensör verisi ve uygun besleme durumu aranacaktır.</w:t>
+        <w:t xml:space="preserve">Rota HTTP üzerinden araca aktarılacak; görev durumu ve komutlar WebSocket bağlantısıyla iletilecektir. Alan dışındaki noktalar ve sıfır uzunluklu ardışık parçalar yükleme sırasında reddedilecektir. Başlatma için rota kabulü, geçerli sensör verisi ve uygun besleme durumu aranacaktır.</w:t>
       </w:r>
     </w:p>
     <w:p>
@@ -1915,7 +1977,7 @@
         <w:pStyle w:val="FirstParagraph"/>
       </w:pPr>
       <w:r>
-        <w:t xml:space="preserve">Kaçınma, Bug 2 yaklaşımının engel kenarını izleme ve hedef doğrultusuna yeniden katılma mantığından yararlanan bir durum makinesiyle gerçekleştirilecektir (Hauser, t.y.-a). Temel durumlar bekleme, rota izleme, engel yaklaşımı/durma, kenar izleme, rotaya dönüş doğrulama, görev tamamlandı ve hata/durdurma olacaktır.</w:t>
+        <w:t xml:space="preserve">Kaçınma, Bug 2 yaklaşımının engel kenarını izleme ve hedef doğrultusuna yeniden katılma mantığından yararlanan bir durum makinesiyle gerçekleştirilecektir (Lumelsky ve Stepanov, 1987; Corke, 2017). Temel durumlar bekleme, rota izleme, engel yaklaşımı/durma, kenar izleme, rotaya dönüş doğrulama, görev tamamlandı ve hata/durdurma olacaktır.</w:t>
       </w:r>
     </w:p>
     <w:p>
@@ -1923,7 +1985,7 @@
         <w:pStyle w:val="BodyText"/>
       </w:pPr>
       <w:r>
-        <w:t xml:space="preserve">Engel algılama eşiği, sensörün araç gövdesine göre ofseti, algılama/karar gecikmesinde alınan yol, ölçülen durma mesafesi ve 5 cm açıklık payından türetilecektir. Gövde ön sınırı esas alındığında eşik en az 20 cm olacaktır; kalibrasyon daha büyük mesafe gerektirirse artırılacaktır. Böylece sensörün bildirdiği uzaklık doğrudan gövde açıklığı sayılmayacaktır. Bu ayar tüm nihai deneylerde sabit tutulacaktır.</w:t>
+        <w:t xml:space="preserve">Engel algılama eşiği, sensörün araç gövdesine göre ofseti, 300 ms veri yaşı/tepki bütçesinde alınan yol, ölçülen durma mesafesi ve 5 cm açıklık payından türetilecektir. Gövde ön sınırı esas alındığında eşik en az 20 cm olacaktır; kalibrasyon daha büyük mesafe gerektirirse artırılacaktır. Böylece sensörün bildirdiği uzaklık doğrudan gövde açıklığı sayılmayacaktır. Bu ayar tüm nihai deneylerde sabit tutulacaktır.</w:t>
       </w:r>
     </w:p>
     <w:p>
@@ -2117,7 +2179,7 @@
         <w:pStyle w:val="FirstParagraph"/>
       </w:pPr>
       <w:r>
-        <w:t xml:space="preserve">Deneyler düz, kuru, kaymayan zeminde ayrılacak 3 × 3 metrelik kontrollü bir iç mekân alanında yürütülecektir. Bir köşe yerel koordinat sisteminin başlangıcı olacak; metre birimindeki rota</w:t>
+        <w:t xml:space="preserve">Deneylerin Konya Teknik Üniversitesi Elektrik-Elektronik Mühendisliği Bölümünde kullanımına izin verilecek bir derslikte kurulacak, düz ve kuru zeminli 3 × 3 metrelik kontrollü deney alanında yürütülmesi planlanmaktadır. Bir köşe yerel koordinat sisteminin başlangıcı olacak; metre birimindeki rota</w:t>
       </w:r>
       <w:r>
         <w:t xml:space="preserve"> </w:t>
@@ -2683,7 +2745,7 @@
         <w:pStyle w:val="FirstParagraph"/>
       </w:pPr>
       <w:r>
-        <w:t xml:space="preserve">Aracın hareketi, yürütücünün mevcut telefonuyla en az 1080p ve 30 kare/saniye sabit görüntü kaydına alınacaktır. Telefonun konumu tüm alanı ve araç işaretini görecek biçimde kurulacaktır. Kamera konum bilgisi araç denetleyicisine verilmeyecek; bağımsız değerlendirme için kullanılacaktır.</w:t>
+        <w:t xml:space="preserve">Aracın hareketi, yürütücünün mevcut telefonuyla en az 1080p ve 30 kare/saniye sabit görüntü kaydına alınacaktır. Telefonun yaklaşık 3,0 m yükseklikte, optik ekseni alan merkezine yönelmiş sabit bir düzeneğe yerleştirilmesi planlanmaktadır. Gerçek montaj yüksekliği ölçülüp kaydedilecek; tüm 3 × 3 metrelik alanın ve araç işaretinin görüntülendiği kurulumda doğrulanacaktır. Kamera konum bilgisi araç denetleyicisine verilmeyecek; bağımsız değerlendirme için kullanılacaktır.</w:t>
       </w:r>
     </w:p>
     <w:p>
@@ -2691,7 +2753,7 @@
         <w:pStyle w:val="BodyText"/>
       </w:pPr>
       <w:r>
-        <w:t xml:space="preserve">Görüntü–metre dönüşümü, ölçülmüş konumdaki en az altı referans noktayla kurulacak; dönüşümde kullanılmayan ve alanı kapsayan en az beş kontrol noktasıyla sınanacaktır. Mercek bozulması ve araç üzerindeki işaretin yüksekliğinden kaynaklanan perspektif hatası düzeltilecektir. İzleme işareti aks orta noktasının üstüne yerleştirilecek; görüntü dönüşümünde işaretin bulunduğu yükseklik düzlemi esas alınacaktır. Kontrol noktalarında en çok 2 cm konum hatası çalışma hedefi olarak kullanılacak, ölçülen kalibrasyon hatası ve dinamik izlemenin ek belirsizlikleri ayrıca raporlanacaktır. Güvenilir referanslarla ölçüm doğrulama yaklaşımı, kalibrasyon çerçevesine dayanmaktadır (Hauser, t.y.-b).</w:t>
+        <w:t xml:space="preserve">Görüntü–metre dönüşümü, ölçülmüş konumdaki en az altı referans noktayla kurulacak; dönüşümde kullanılmayan ve alanı kapsayan en az beş kontrol noktasıyla sınanacaktır. Mercek bozulması ve araç üzerindeki işaretin yüksekliğinden kaynaklanan perspektif hatası düzeltilecektir. İzleme işareti aks orta noktasının üstüne yerleştirilecek; görüntü dönüşümünde işaretin bulunduğu yükseklik düzlemi esas alınacaktır. Kontrol noktalarında en çok 2 cm konum hatası çalışma hedefi olarak kullanılacak, ölçülen kalibrasyon hatası ve dinamik izlemenin ek belirsizlikleri ayrıca raporlanacaktır. Güvenilir referanslarla ölçüm doğrulama yaklaşımı, kalibrasyon çerçevesine dayanmaktadır (Corke, 2017).</w:t>
       </w:r>
     </w:p>
     <w:p>
@@ -3190,6 +3252,14 @@
       </w:pPr>
       <w:r>
         <w:t xml:space="preserve">Algılama, kaçınma, rotaya dönüş ve görev tamamlama oranları her koşulda ayrı hesaplanacaktır. Payda, ilgili koşuldaki tüm geçerli denemeler olacaktır; sonraki aşamaya ulaşamayan denemeler bu aşamanın paydasından çıkarılmayacaktır. Engelsiz koşulda engel aşamaları uygulanmaz olarak kaydedilecek; görev başarısı ve yanlış engel uyarıları raporlanacaktır.</w:t>
+      </w:r>
+    </w:p>
+    <w:p>
+      <w:pPr>
+        <w:pStyle w:val="BodyText"/>
+      </w:pPr>
+      <w:r>
+        <w:t xml:space="preserve">Her başarı oranı, başarılı deneme sayısı/geçerli deneme sayısı ve yüzdeyle birlikte %95 Wilson skor güven aralığıyla verilecektir (Wilson, 1927). Bu aralıklar, koşul içindeki denemelerin Bernoulli modeliyle özetlenmesine dayanacak; aynı araçta tekrardan kaynaklanabilecek bağımlılık ve koşul başına 10 denemenin getirdiği belirsizlik yorumda belirtilecektir.</w:t>
       </w:r>
     </w:p>
     <w:p>
@@ -3363,13 +3433,13 @@
       </w:r>
     </w:p>
     <w:bookmarkEnd w:id="44"/>
-    <w:bookmarkStart w:id="45" w:name="ön-hazırlık-ve-uygulanabilirlik"/>
+    <w:bookmarkStart w:id="48" w:name="ön-çalışma-ve-uygulanabilirlik"/>
     <w:p>
       <w:pPr>
         <w:pStyle w:val="Heading3"/>
       </w:pPr>
       <w:r>
-        <w:t xml:space="preserve">2.9. Ön hazırlık ve uygulanabilirlik</w:t>
+        <w:t xml:space="preserve">2.9. Ön çalışma ve uygulanabilirlik</w:t>
       </w:r>
     </w:p>
     <w:p>
@@ -3377,21 +3447,564 @@
         <w:pStyle w:val="FirstParagraph"/>
       </w:pPr>
       <w:r>
-        <w:t xml:space="preserve">Başvuru hazırlığında ilgili yayınlar ve teknik dokümanlar incelenmiş; sistem mimarisi, kontrol akışı, deney protokolü ve tahmini bütçe hazırlanmıştır. Fiziksel prototip, sensör/motor kalibrasyonu ve performans deneyleri proje kapsamında gerçekleştirilecektir. Benzer koordinat aktarımı ve gömülü kontrol uygulamaları (Iqbal vd., 2023; Rodrigues vd., 2026), yerel algıyla kaçınmaya ilişkin deneysel çalışma (Alajlan vd., 2017) ve hareket planlama çerçevesi (Hauser, t.y.-a) yöntem seçimlerine dayanak oluşturmaktadır. Bu kaynakların farklı donanımlardaki sonuçları önerilen araç için elde edilmiş sonuç sayılmayacaktır.</w:t>
+        <w:t xml:space="preserve">Durum makinesinin geçiş ve durdurma mantığı için 50 ms adımlı bir ayrık zaman benzetimi hazırlanmış ve çalıştırılmıştır. Altı sentetik senaryoda rota izleme, kaçınma, dönüş doğrulama ve hata nedeniyle durdurma davranışları kontrol edilmiştir. Girdiler kontrollü olarak üretilmiştir; araç kinematiği, tekerlek kayması ve ToF sensör fiziği bu ön çalışmada modellenmemiştir.</w:t>
       </w:r>
     </w:p>
-    <w:bookmarkEnd w:id="45"/>
-    <w:bookmarkEnd w:id="46"/>
-    <w:bookmarkStart w:id="50" w:name="proje-yönetimi"/>
+    <w:tbl>
+      <w:tblPr>
+        <w:tblStyle w:val="TableGrid"/>
+        <w:tblW w:type="pct" w:w="5000"/>
+        <w:jc w:val="left"/>
+        <w:tblLayout w:type="fixed"/>
+        <w:tblLook w:firstRow="1" w:lastRow="0" w:firstColumn="0" w:lastColumn="0" w:noHBand="0" w:noVBand="0" w:val="0020"/>
+        <w:tblBorders>
+          <w:top w:val="single" w:sz="4" w:color="879CAE"/>
+          <w:left w:val="single" w:sz="4" w:color="879CAE"/>
+          <w:bottom w:val="single" w:sz="4" w:color="879CAE"/>
+          <w:right w:val="single" w:sz="4" w:color="879CAE"/>
+          <w:insideH w:val="single" w:sz="4" w:color="879CAE"/>
+          <w:insideV w:val="single" w:sz="4" w:color="879CAE"/>
+        </w:tblBorders>
+      </w:tblPr>
+      <w:tblGrid>
+        <w:gridCol w:w="964"/>
+        <w:gridCol w:w="4422"/>
+        <w:gridCol w:w="4252"/>
+      </w:tblGrid>
+      <w:tr>
+        <w:trPr>
+          <w:tblHeader w:val="on"/>
+          <w:tblHeader/>
+          <w:cantSplit/>
+        </w:trPr>
+        <w:tc>
+          <w:tcPr>
+            <w:tcW w:type="dxa" w:w="964"/>
+            <w:vAlign w:val="top"/>
+            <w:shd w:fill="EAF1F7"/>
+          </w:tcPr>
+          <w:p>
+            <w:pPr>
+              <w:pStyle w:val="Compact"/>
+              <w:spacing w:after="60" w:line="252" w:lineRule="auto"/>
+              <w:jc w:val="left"/>
+            </w:pPr>
+            <w:r>
+              <w:rPr>
+                <w:b/>
+                <w:sz w:val="19"/>
+              </w:rPr>
+              <w:t xml:space="preserve">Senaryo</w:t>
+            </w:r>
+          </w:p>
+        </w:tc>
+        <w:tc>
+          <w:tcPr>
+            <w:tcW w:type="dxa" w:w="4422"/>
+            <w:vAlign w:val="top"/>
+            <w:shd w:fill="EAF1F7"/>
+          </w:tcPr>
+          <w:p>
+            <w:pPr>
+              <w:pStyle w:val="Compact"/>
+              <w:spacing w:after="60" w:line="252" w:lineRule="auto"/>
+              <w:jc w:val="left"/>
+            </w:pPr>
+            <w:r>
+              <w:rPr>
+                <w:b/>
+                <w:sz w:val="19"/>
+              </w:rPr>
+              <w:t xml:space="preserve">Sınanan davranış</w:t>
+            </w:r>
+          </w:p>
+        </w:tc>
+        <w:tc>
+          <w:tcPr>
+            <w:tcW w:type="dxa" w:w="4252"/>
+            <w:vAlign w:val="top"/>
+            <w:shd w:fill="EAF1F7"/>
+          </w:tcPr>
+          <w:p>
+            <w:pPr>
+              <w:pStyle w:val="Compact"/>
+              <w:spacing w:after="60" w:line="252" w:lineRule="auto"/>
+              <w:jc w:val="left"/>
+            </w:pPr>
+            <w:r>
+              <w:rPr>
+                <w:b/>
+                <w:sz w:val="19"/>
+              </w:rPr>
+              <w:t xml:space="preserve">Çalıştırma sonucu</w:t>
+            </w:r>
+          </w:p>
+        </w:tc>
+      </w:tr>
+      <w:tr>
+        <w:trPr>
+          <w:cantSplit/>
+        </w:trPr>
+        <w:tc>
+          <w:tcPr>
+            <w:tcW w:type="dxa" w:w="964"/>
+            <w:vAlign w:val="top"/>
+          </w:tcPr>
+          <w:p>
+            <w:pPr>
+              <w:pStyle w:val="Compact"/>
+              <w:spacing w:after="60" w:line="252" w:lineRule="auto"/>
+              <w:jc w:val="left"/>
+            </w:pPr>
+            <w:r>
+              <w:rPr>
+                <w:sz w:val="19"/>
+              </w:rPr>
+              <w:t xml:space="preserve">S1</w:t>
+            </w:r>
+          </w:p>
+        </w:tc>
+        <w:tc>
+          <w:tcPr>
+            <w:tcW w:type="dxa" w:w="4422"/>
+            <w:vAlign w:val="top"/>
+          </w:tcPr>
+          <w:p>
+            <w:pPr>
+              <w:pStyle w:val="Compact"/>
+              <w:spacing w:after="60" w:line="252" w:lineRule="auto"/>
+              <w:jc w:val="left"/>
+            </w:pPr>
+            <w:r>
+              <w:rPr>
+                <w:sz w:val="19"/>
+              </w:rPr>
+              <w:t xml:space="preserve">Engelsiz görev ve hedefte 2 saniye durma</w:t>
+            </w:r>
+          </w:p>
+        </w:tc>
+        <w:tc>
+          <w:tcPr>
+            <w:tcW w:type="dxa" w:w="4252"/>
+            <w:vAlign w:val="top"/>
+          </w:tcPr>
+          <w:p>
+            <w:pPr>
+              <w:pStyle w:val="Compact"/>
+              <w:spacing w:after="60" w:line="252" w:lineRule="auto"/>
+              <w:jc w:val="left"/>
+            </w:pPr>
+            <w:r>
+              <w:rPr>
+                <w:sz w:val="19"/>
+              </w:rPr>
+              <w:t xml:space="preserve">Beklenen tamamlanma geçişi sağlandı.</w:t>
+            </w:r>
+          </w:p>
+        </w:tc>
+      </w:tr>
+      <w:tr>
+        <w:trPr>
+          <w:cantSplit/>
+        </w:trPr>
+        <w:tc>
+          <w:tcPr>
+            <w:tcW w:type="dxa" w:w="964"/>
+            <w:vAlign w:val="top"/>
+          </w:tcPr>
+          <w:p>
+            <w:pPr>
+              <w:pStyle w:val="Compact"/>
+              <w:spacing w:after="60" w:line="252" w:lineRule="auto"/>
+              <w:jc w:val="left"/>
+            </w:pPr>
+            <w:r>
+              <w:rPr>
+                <w:sz w:val="19"/>
+              </w:rPr>
+              <w:t xml:space="preserve">S2</w:t>
+            </w:r>
+          </w:p>
+        </w:tc>
+        <w:tc>
+          <w:tcPr>
+            <w:tcW w:type="dxa" w:w="4422"/>
+            <w:vAlign w:val="top"/>
+          </w:tcPr>
+          <w:p>
+            <w:pPr>
+              <w:pStyle w:val="Compact"/>
+              <w:spacing w:after="60" w:line="252" w:lineRule="auto"/>
+              <w:jc w:val="left"/>
+            </w:pPr>
+            <w:r>
+              <w:rPr>
+                <w:sz w:val="19"/>
+              </w:rPr>
+              <w:t xml:space="preserve">Engel, kenar izleme ve süre/ilerleme koşullarıyla dönüş</w:t>
+            </w:r>
+          </w:p>
+        </w:tc>
+        <w:tc>
+          <w:tcPr>
+            <w:tcW w:type="dxa" w:w="4252"/>
+            <w:vAlign w:val="top"/>
+          </w:tcPr>
+          <w:p>
+            <w:pPr>
+              <w:pStyle w:val="Compact"/>
+              <w:spacing w:after="60" w:line="252" w:lineRule="auto"/>
+              <w:jc w:val="left"/>
+            </w:pPr>
+            <w:r>
+              <w:rPr>
+                <w:sz w:val="19"/>
+              </w:rPr>
+              <w:t xml:space="preserve">Dönüş 5. saniyede doğrulandı; sentetik görev 9. saniyede tamamlandı.</w:t>
+            </w:r>
+          </w:p>
+        </w:tc>
+      </w:tr>
+      <w:tr>
+        <w:trPr>
+          <w:cantSplit/>
+        </w:trPr>
+        <w:tc>
+          <w:tcPr>
+            <w:tcW w:type="dxa" w:w="964"/>
+            <w:vAlign w:val="top"/>
+          </w:tcPr>
+          <w:p>
+            <w:pPr>
+              <w:pStyle w:val="Compact"/>
+              <w:spacing w:after="60" w:line="252" w:lineRule="auto"/>
+              <w:jc w:val="left"/>
+            </w:pPr>
+            <w:r>
+              <w:rPr>
+                <w:sz w:val="19"/>
+              </w:rPr>
+              <w:t xml:space="preserve">S3</w:t>
+            </w:r>
+          </w:p>
+        </w:tc>
+        <w:tc>
+          <w:tcPr>
+            <w:tcW w:type="dxa" w:w="4422"/>
+            <w:vAlign w:val="top"/>
+          </w:tcPr>
+          <w:p>
+            <w:pPr>
+              <w:pStyle w:val="Compact"/>
+              <w:spacing w:after="60" w:line="252" w:lineRule="auto"/>
+              <w:jc w:val="left"/>
+            </w:pPr>
+            <w:r>
+              <w:rPr>
+                <w:sz w:val="19"/>
+              </w:rPr>
+              <w:t xml:space="preserve">Hedefe ilerleme olmadan dönüş bandına girme</w:t>
+            </w:r>
+          </w:p>
+        </w:tc>
+        <w:tc>
+          <w:tcPr>
+            <w:tcW w:type="dxa" w:w="4252"/>
+            <w:vAlign w:val="top"/>
+          </w:tcPr>
+          <w:p>
+            <w:pPr>
+              <w:pStyle w:val="Compact"/>
+              <w:spacing w:after="60" w:line="252" w:lineRule="auto"/>
+              <w:jc w:val="left"/>
+            </w:pPr>
+            <w:r>
+              <w:rPr>
+                <w:sz w:val="19"/>
+              </w:rPr>
+              <w:t xml:space="preserve">Rota takibine erken dönüş engellendi.</w:t>
+            </w:r>
+          </w:p>
+        </w:tc>
+      </w:tr>
+      <w:tr>
+        <w:trPr>
+          <w:cantSplit/>
+        </w:trPr>
+        <w:tc>
+          <w:tcPr>
+            <w:tcW w:type="dxa" w:w="964"/>
+            <w:vAlign w:val="top"/>
+          </w:tcPr>
+          <w:p>
+            <w:pPr>
+              <w:pStyle w:val="Compact"/>
+              <w:spacing w:after="60" w:line="252" w:lineRule="auto"/>
+              <w:jc w:val="left"/>
+            </w:pPr>
+            <w:r>
+              <w:rPr>
+                <w:sz w:val="19"/>
+              </w:rPr>
+              <w:t xml:space="preserve">S4</w:t>
+            </w:r>
+          </w:p>
+        </w:tc>
+        <w:tc>
+          <w:tcPr>
+            <w:tcW w:type="dxa" w:w="4422"/>
+            <w:vAlign w:val="top"/>
+          </w:tcPr>
+          <w:p>
+            <w:pPr>
+              <w:pStyle w:val="Compact"/>
+              <w:spacing w:after="60" w:line="252" w:lineRule="auto"/>
+              <w:jc w:val="left"/>
+            </w:pPr>
+            <w:r>
+              <w:rPr>
+                <w:sz w:val="19"/>
+              </w:rPr>
+              <w:t xml:space="preserve">Güncellenmeyen sensör zaman damgası</w:t>
+            </w:r>
+          </w:p>
+        </w:tc>
+        <w:tc>
+          <w:tcPr>
+            <w:tcW w:type="dxa" w:w="4252"/>
+            <w:vAlign w:val="top"/>
+          </w:tcPr>
+          <w:p>
+            <w:pPr>
+              <w:pStyle w:val="Compact"/>
+              <w:spacing w:after="60" w:line="252" w:lineRule="auto"/>
+              <w:jc w:val="left"/>
+            </w:pPr>
+            <w:r>
+              <w:rPr>
+                <w:sz w:val="19"/>
+              </w:rPr>
+              <w:t xml:space="preserve">250 ms sınırının aşılmasını izleyen adımda durdurma üretildi.</w:t>
+            </w:r>
+          </w:p>
+        </w:tc>
+      </w:tr>
+      <w:tr>
+        <w:trPr>
+          <w:cantSplit/>
+        </w:trPr>
+        <w:tc>
+          <w:tcPr>
+            <w:tcW w:type="dxa" w:w="964"/>
+            <w:vAlign w:val="top"/>
+          </w:tcPr>
+          <w:p>
+            <w:pPr>
+              <w:pStyle w:val="Compact"/>
+              <w:spacing w:after="60" w:line="252" w:lineRule="auto"/>
+              <w:jc w:val="left"/>
+            </w:pPr>
+            <w:r>
+              <w:rPr>
+                <w:sz w:val="19"/>
+              </w:rPr>
+              <w:t xml:space="preserve">S5</w:t>
+            </w:r>
+          </w:p>
+        </w:tc>
+        <w:tc>
+          <w:tcPr>
+            <w:tcW w:type="dxa" w:w="4422"/>
+            <w:vAlign w:val="top"/>
+          </w:tcPr>
+          <w:p>
+            <w:pPr>
+              <w:pStyle w:val="Compact"/>
+              <w:spacing w:after="60" w:line="252" w:lineRule="auto"/>
+              <w:jc w:val="left"/>
+            </w:pPr>
+            <w:r>
+              <w:rPr>
+                <w:sz w:val="19"/>
+              </w:rPr>
+              <w:t xml:space="preserve">Bir saniye canlılık mesajı alınamaması</w:t>
+            </w:r>
+          </w:p>
+        </w:tc>
+        <w:tc>
+          <w:tcPr>
+            <w:tcW w:type="dxa" w:w="4252"/>
+            <w:vAlign w:val="top"/>
+          </w:tcPr>
+          <w:p>
+            <w:pPr>
+              <w:pStyle w:val="Compact"/>
+              <w:spacing w:after="60" w:line="252" w:lineRule="auto"/>
+              <w:jc w:val="left"/>
+            </w:pPr>
+            <w:r>
+              <w:rPr>
+                <w:sz w:val="19"/>
+              </w:rPr>
+              <w:t xml:space="preserve">Bağlantı kaybı nedeniyle durdurma üretildi.</w:t>
+            </w:r>
+          </w:p>
+        </w:tc>
+      </w:tr>
+      <w:tr>
+        <w:trPr>
+          <w:cantSplit/>
+        </w:trPr>
+        <w:tc>
+          <w:tcPr>
+            <w:tcW w:type="dxa" w:w="964"/>
+            <w:vAlign w:val="top"/>
+          </w:tcPr>
+          <w:p>
+            <w:pPr>
+              <w:pStyle w:val="Compact"/>
+              <w:spacing w:after="60" w:line="252" w:lineRule="auto"/>
+              <w:jc w:val="left"/>
+            </w:pPr>
+            <w:r>
+              <w:rPr>
+                <w:sz w:val="19"/>
+              </w:rPr>
+              <w:t xml:space="preserve">S6</w:t>
+            </w:r>
+          </w:p>
+        </w:tc>
+        <w:tc>
+          <w:tcPr>
+            <w:tcW w:type="dxa" w:w="4422"/>
+            <w:vAlign w:val="top"/>
+          </w:tcPr>
+          <w:p>
+            <w:pPr>
+              <w:pStyle w:val="Compact"/>
+              <w:spacing w:after="60" w:line="252" w:lineRule="auto"/>
+              <w:jc w:val="left"/>
+            </w:pPr>
+            <w:r>
+              <w:rPr>
+                <w:sz w:val="19"/>
+              </w:rPr>
+              <w:t xml:space="preserve">Görevin 120 saniyeyi doldurması</w:t>
+            </w:r>
+          </w:p>
+        </w:tc>
+        <w:tc>
+          <w:tcPr>
+            <w:tcW w:type="dxa" w:w="4252"/>
+            <w:vAlign w:val="top"/>
+          </w:tcPr>
+          <w:p>
+            <w:pPr>
+              <w:pStyle w:val="Compact"/>
+              <w:spacing w:after="60" w:line="252" w:lineRule="auto"/>
+              <w:jc w:val="left"/>
+            </w:pPr>
+            <w:r>
+              <w:rPr>
+                <w:sz w:val="19"/>
+              </w:rPr>
+              <w:t xml:space="preserve">Süre sınırında durdurma üretildi.</w:t>
+            </w:r>
+          </w:p>
+        </w:tc>
+      </w:tr>
+    </w:tbl>
     <w:p>
       <w:pPr>
+        <w:pStyle w:val="BodyText"/>
+      </w:pPr>
+      <w:r>
+        <w:t xml:space="preserve">Altı senaryodaki mantıksal kontroller beklenen sonuçları vermiştir. Şekil 4, S2 senaryosunun üretilen durum kaydını göstermektedir. Bu ön çalışma kontrol akışının uygulanabilirliğine ilişkin bir yazılım doğrulamasıdır; fiziksel araçta 8/10 görev başarısının veya 10 cm konum hedefinin sağlandığını göstermez. Fiziksel prototip, kalibrasyon ve bağımsız video deneyleri proje kapsamında gerçekleştirilecektir. Kaynak kod ve sentetik kayıtlar proje deposunda ön çalışma verisi olarak ayrı tutulmaktadır.</w:t>
+      </w:r>
+    </w:p>
+    <w:p>
+      <w:pPr>
+        <w:pStyle w:val="BodyText"/>
+        <w:keepNext/>
+        <w:spacing w:after="40"/>
+        <w:jc w:val="center"/>
+      </w:pPr>
+      <w:r>
+        <w:drawing>
+          <wp:inline>
+            <wp:extent cx="6048000" cy="2323316"/>
+            <wp:effectExtent b="0" l="0" r="0" t="0"/>
+            <wp:docPr descr="Şekil 4 — Durum makinesi ön çalışması" title="" id="46" name="Picture"/>
+            <a:graphic>
+              <a:graphicData uri="http://schemas.openxmlformats.org/drawingml/2006/picture">
+                <pic:pic>
+                  <pic:nvPicPr>
+                    <pic:cNvPr descr="gorseller/akademik_duzen/sekil_4_on_calisma.png" id="47" name="Picture"/>
+                    <pic:cNvPicPr>
+                      <a:picLocks noChangeArrowheads="1" noChangeAspect="1"/>
+                    </pic:cNvPicPr>
+                  </pic:nvPicPr>
+                  <pic:blipFill>
+                    <a:blip r:embed="rId45"/>
+                    <a:stretch>
+                      <a:fillRect/>
+                    </a:stretch>
+                  </pic:blipFill>
+                  <pic:spPr bwMode="auto">
+                    <a:xfrm>
+                      <a:off x="0" y="0"/>
+                      <a:ext cx="6048000" cy="2323316"/>
+                    </a:xfrm>
+                    <a:prstGeom prst="rect">
+                      <a:avLst/>
+                    </a:prstGeom>
+                    <a:noFill/>
+                    <a:ln w="9525">
+                      <a:noFill/>
+                      <a:headEnd/>
+                      <a:tailEnd/>
+                    </a:ln>
+                  </pic:spPr>
+                </pic:pic>
+              </a:graphicData>
+            </a:graphic>
+          </wp:inline>
+        </w:drawing>
+      </w:r>
+    </w:p>
+    <w:p>
+      <w:pPr>
+        <w:pStyle w:val="Caption"/>
+        <w:keepNext w:val="0"/>
+        <w:keepLines/>
+      </w:pPr>
+      <w:r>
+        <w:rPr>
+          <w:b/>
+          <w:bCs/>
+        </w:rPr>
+        <w:t xml:space="preserve">Şekil 4.</w:t>
+      </w:r>
+      <w:r>
+        <w:t xml:space="preserve"> </w:t>
+      </w:r>
+      <w:r>
+        <w:t xml:space="preserve">Çalıştırılan S2 mantıksal benzetiminde elde edilen durum geçişleri. Engel ve konum koşulları sentetik girdilerdir; grafik fiziksel rota, sensör doğruluğu veya deneysel araç performansı göstermez.</w:t>
+      </w:r>
+    </w:p>
+    <w:bookmarkEnd w:id="48"/>
+    <w:bookmarkEnd w:id="49"/>
+    <w:bookmarkStart w:id="53" w:name="proje-yönetimi"/>
+    <w:p>
+      <w:pPr>
         <w:pStyle w:val="Heading2"/>
+        <w:pageBreakBefore/>
       </w:pPr>
       <w:r>
         <w:t xml:space="preserve">3. PROJE YÖNETİMİ</w:t>
       </w:r>
     </w:p>
-    <w:bookmarkStart w:id="47" w:name="çalışma-takvimi"/>
+    <w:bookmarkStart w:id="50" w:name="çalışma-takvimi"/>
     <w:p>
       <w:pPr>
         <w:pStyle w:val="Heading3"/>
@@ -3962,7 +4575,7 @@
               <w:rPr>
                 <w:sz w:val="19"/>
               </w:rPr>
-              <w:t xml:space="preserve">6. ay</w:t>
+              <w:t xml:space="preserve">5–6. ay</w:t>
             </w:r>
           </w:p>
         </w:tc>
@@ -3981,7 +4594,7 @@
               <w:rPr>
                 <w:sz w:val="19"/>
               </w:rPr>
-              <w:t xml:space="preserve">İP5 — Kontrollü deney ve performans analizi</w:t>
+              <w:t xml:space="preserve">İP5 — Kontrollü deney, analiz ve sonuçların raporlanması</w:t>
             </w:r>
           </w:p>
         </w:tc>
@@ -4019,7 +4632,7 @@
               <w:rPr>
                 <w:sz w:val="19"/>
               </w:rPr>
-              <w:t xml:space="preserve">Toplam 40 geçerli deneme; her engelli koşulda en az 8/10 birleşik başarı hedefinin değerlendirilmesi; süre, hata ve başarısızlık analizinin tamamlanması.</w:t>
+              <w:t xml:space="preserve">Toplam 40 geçerli deneme; her engelli koşulda en az 8/10 birleşik başarı hedefinin değerlendirilmesi; süre, hata ve başarısızlık analizleri ile sonuç raporunun tamamlanması.</w:t>
             </w:r>
           </w:p>
         </w:tc>
@@ -4049,11 +4662,11 @@
         <w:pStyle w:val="BodyText"/>
       </w:pPr>
       <w:r>
-        <w:t xml:space="preserve">Başarıya katkı toplamı %100’dür. İlk iki ayda donanım ve arayüz çalışmaları kısmen paralel yürütülecektir. Rota takibine, hareket kalibrasyonu ve rota aktarımı tamamlandıktan sonra geçilecektir. Kaçınma entegrasyonu ve ayar denemelerini, son sürümün sabitlenmesi ile altıncı aydaki deneyler izleyecektir. Literatür incelemesi, temin ve raporlama ilgili teknik faaliyetlere eşlik edecek; bağımsız iş paketi yapılmayacaktır.</w:t>
+        <w:t xml:space="preserve">Başarıya katkı toplamı %100’dür. İlk iki ayda donanım ve arayüz çalışmaları kısmen paralel yürütülecektir. Rota takibine, hareket kalibrasyonu ve rota aktarımı tamamlandıktan sonra geçilecektir. Beşinci ayda veri işleme araçları, kayıt/analiz şablonları ve raporun yöntem bölümü hazırlanacaktır. Kaçınma entegrasyonu ve ayar denemelerini, son sürümün sabitlenmesi ile altıncı aydaki 40 geçerli deney izleyecektir. Deney sonuçları geldikçe analiz ve sonuç raporu birlikte tamamlanacaktır. Literatür incelemesi, temin ve raporlama ilgili teknik faaliyetlere eşlik edecek; bağımsız iş paketi yapılmayacaktır.</w:t>
       </w:r>
     </w:p>
-    <w:bookmarkEnd w:id="47"/>
-    <w:bookmarkStart w:id="48" w:name="risk-yönetimi"/>
+    <w:bookmarkEnd w:id="50"/>
+    <w:bookmarkStart w:id="51" w:name="risk-yönetimi"/>
     <w:p>
       <w:pPr>
         <w:pStyle w:val="Heading3"/>
@@ -4534,8 +5147,8 @@
         <w:t xml:space="preserve">B planları algılama, otonom kaçınma ve rotaya dönüş hedeflerini koruyacaktır. Donanım veya yöntem değişikliği sürümlenecek; karşılaştırılan deney koşulları aynı son düzenekle yürütülecektir.</w:t>
       </w:r>
     </w:p>
-    <w:bookmarkEnd w:id="48"/>
-    <w:bookmarkStart w:id="49" w:name="araştırma-olanakları"/>
+    <w:bookmarkEnd w:id="51"/>
+    <w:bookmarkStart w:id="52" w:name="araştırma-olanakları"/>
     <w:p>
       <w:pPr>
         <w:pStyle w:val="Heading3"/>
@@ -4549,7 +5162,7 @@
         <w:pStyle w:val="FirstParagraph"/>
       </w:pPr>
       <w:r>
-        <w:t xml:space="preserve">Araştırma Konya Teknik Üniversitesi Elektrik-Elektronik Mühendisliği kapsamında, yürütücü ve akademik danışmanın bilimsel çalışması olarak yürütülecektir. Kurumsal laboratuvar veya cihaz tahsisi bu çalışma planında dayanak alınmamış; gerekli altyapı kişisel kaynaklar ve proje bütçesiyle tanımlanmıştır. Çalışma için gerekli 3 × 3 metrelik kontrollü alan, düz zemin ve tüm alanın sabit görüntülenmesi koşullarına göre düzenlenecektir.</w:t>
+        <w:t xml:space="preserve">Araştırma Konya Teknik Üniversitesi Elektrik-Elektronik Mühendisliği kapsamında, yürütücü ve akademik danışmanın bilimsel çalışması olarak yürütülecektir. Planlanan deney yeri, Konya Teknik Üniversitesi Elektrik-Elektronik Mühendisliği Bölümünde bir derslikte kurulacak 3 × 3 metrelik İKA deney alanıdır. Derslik içinde 3 × 3 metrelik düz zeminli alan ayrılacak; kullanım zamanı ders programına ve bölümün iznine göre düzenlenecektir. Diğer altyapı kişisel kaynaklar ve proje bütçesiyle sağlanacaktır.</w:t>
       </w:r>
     </w:p>
     <w:tbl>
@@ -4640,7 +5253,7 @@
               <w:rPr>
                 <w:sz w:val="19"/>
               </w:rPr>
-              <w:t xml:space="preserve">Yürütücünün mevcut lehim ekipmanı</w:t>
+              <w:t xml:space="preserve">Üniversitede kullanımı planlanan derslik</w:t>
             </w:r>
           </w:p>
         </w:tc>
@@ -4659,7 +5272,7 @@
               <w:rPr>
                 <w:sz w:val="19"/>
               </w:rPr>
-              <w:t xml:space="preserve">Elektronik bağlantı ve araç montajı</w:t>
+              <w:t xml:space="preserve">3 × 3 metrelik deney alanının kurulması; bölüm izni ve uygun zamanlama ile kullanım</w:t>
             </w:r>
           </w:p>
         </w:tc>
@@ -4683,7 +5296,7 @@
               <w:rPr>
                 <w:sz w:val="19"/>
               </w:rPr>
-              <w:t xml:space="preserve">Yürütücünün mevcut telefonu</w:t>
+              <w:t xml:space="preserve">Yürütücünün mevcut lehim ekipmanı</w:t>
             </w:r>
           </w:p>
         </w:tc>
@@ -4702,7 +5315,7 @@
               <w:rPr>
                 <w:sz w:val="19"/>
               </w:rPr>
-              <w:t xml:space="preserve">Bağımsız deney videosu ve ölçüm kaydı</w:t>
+              <w:t xml:space="preserve">Elektronik bağlantı ve araç montajı</w:t>
             </w:r>
           </w:p>
         </w:tc>
@@ -4726,7 +5339,7 @@
               <w:rPr>
                 <w:sz w:val="19"/>
               </w:rPr>
-              <w:t xml:space="preserve">Proje bütçesinden sağlanacak kontrol, algılama ve hareket bileşenleri</w:t>
+              <w:t xml:space="preserve">Yürütücünün mevcut telefonu</w:t>
             </w:r>
           </w:p>
         </w:tc>
@@ -4745,7 +5358,7 @@
               <w:rPr>
                 <w:sz w:val="19"/>
               </w:rPr>
-              <w:t xml:space="preserve">Araç prototipinin kurulması</w:t>
+              <w:t xml:space="preserve">Bağımsız deney videosu ve ölçüm kaydı</w:t>
             </w:r>
           </w:p>
         </w:tc>
@@ -4769,6 +5382,49 @@
               <w:rPr>
                 <w:sz w:val="19"/>
               </w:rPr>
+              <w:t xml:space="preserve">Proje bütçesinden sağlanacak kontrol, algılama ve hareket bileşenleri</w:t>
+            </w:r>
+          </w:p>
+        </w:tc>
+        <w:tc>
+          <w:tcPr>
+            <w:tcW w:type="dxa" w:w="7257"/>
+            <w:vAlign w:val="top"/>
+          </w:tcPr>
+          <w:p>
+            <w:pPr>
+              <w:pStyle w:val="Compact"/>
+              <w:spacing w:after="60" w:line="252" w:lineRule="auto"/>
+              <w:jc w:val="left"/>
+            </w:pPr>
+            <w:r>
+              <w:rPr>
+                <w:sz w:val="19"/>
+              </w:rPr>
+              <w:t xml:space="preserve">Araç prototipinin kurulması</w:t>
+            </w:r>
+          </w:p>
+        </w:tc>
+      </w:tr>
+      <w:tr>
+        <w:trPr>
+          <w:cantSplit/>
+        </w:trPr>
+        <w:tc>
+          <w:tcPr>
+            <w:tcW w:type="dxa" w:w="2381"/>
+            <w:vAlign w:val="top"/>
+          </w:tcPr>
+          <w:p>
+            <w:pPr>
+              <w:pStyle w:val="Compact"/>
+              <w:spacing w:after="60" w:line="252" w:lineRule="auto"/>
+              <w:jc w:val="left"/>
+            </w:pPr>
+            <w:r>
+              <w:rPr>
+                <w:sz w:val="19"/>
+              </w:rPr>
               <w:t xml:space="preserve">Proje bütçesinden sağlanacak multimetre, uzunluk ölçüm aracı, telefon sabitleme ve işaretleme malzemesi</w:t>
             </w:r>
           </w:p>
@@ -4802,9 +5458,9 @@
         <w:t xml:space="preserve">Mevcut telefon ve lehim ekipmanı için yeni alım öngörülmemektedir. Tasarım, doğrulanmamış bir 3D yazıcı, özel imalat cihazı veya kurumsal robotik laboratuvarına erişim gerektirmeyecek biçimde, hazır mekanik parçalar ve basit bağlantı elemanlarıyla kurulacaktır.</w:t>
       </w:r>
     </w:p>
-    <w:bookmarkEnd w:id="49"/>
-    <w:bookmarkEnd w:id="50"/>
-    <w:bookmarkStart w:id="51" w:name="araştirma-önerisinin-yaygin-etkisi"/>
+    <w:bookmarkEnd w:id="52"/>
+    <w:bookmarkEnd w:id="53"/>
+    <w:bookmarkStart w:id="54" w:name="araştirma-önerisinin-yaygin-etkisi"/>
     <w:p>
       <w:pPr>
         <w:pStyle w:val="Heading2"/>
@@ -5012,7 +5668,7 @@
               <w:rPr>
                 <w:sz w:val="19"/>
               </w:rPr>
-              <w:t xml:space="preserve">Bir deney protokolü, 40 geçerli denemeye ait kayıt kümesi ve performans değerlendirmesi</w:t>
+              <w:t xml:space="preserve">Bir deney protokolü, 40 geçerli denemeye ait kayıt kümesi, performans değerlendirmesi ve bir ulusal bildiri başvurusu</w:t>
             </w:r>
           </w:p>
         </w:tc>
@@ -5031,7 +5687,7 @@
               <w:rPr>
                 <w:sz w:val="19"/>
               </w:rPr>
-              <w:t xml:space="preserve">Engel yerleşimine göre başarı aşamaları, süre ve hata davranışlarının incelenmesi; uygun bulguların danışmanla bilimsel sunuma dönüştürülmesi</w:t>
+              <w:t xml:space="preserve">Engel yerleşimine göre başarı aşamaları, süre ve hata davranışlarının incelenmesi; bulguların bir ulusal bilimsel toplantıya bildiri olarak gönderilmesi</w:t>
             </w:r>
           </w:p>
         </w:tc>
@@ -5074,7 +5730,7 @@
               <w:rPr>
                 <w:sz w:val="19"/>
               </w:rPr>
-              <w:t xml:space="preserve">Bir sürümlenmiş araç/arayüz yazılımı ve teknik dokümantasyon paketi</w:t>
+              <w:t xml:space="preserve">Uygun açık kaynak lisansıyla yayımlanan bir araç/arayüz yazılımı ve teknik dokümantasyon deposu</w:t>
             </w:r>
           </w:p>
         </w:tc>
@@ -5166,11 +5822,11 @@
         <w:pStyle w:val="BodyText"/>
       </w:pPr>
       <w:r>
-        <w:t xml:space="preserve">Paylaşılabilir yazılım, bağlantı bilgileri ve deney düzeni, proje için kullanılan GitHub deposunda sürümlenecektir. Veri paylaşımında kişiler veya mekâna ait tanımlayıcı görüntüler ayıklanacak, bilimsel değerlendirme için gerekli araç/alan verileri korunacaktır. Çıktıların, yürütücünün gömülü kontrol, arayüz geliştirme ve deneysel analiz becerilerine katkı sağlaması beklenmektedir. Yayın veya sunum, elde edilecek bulguların niteliğine göre değerlendirilecektir.</w:t>
+        <w:t xml:space="preserve">Paylaşılabilir yazılım, bağlantı bilgileri ve deney düzeni, proje için kullanılan GitHub deposunda sürümlenecektir. Veri paylaşımında kişiler veya mekâna ait tanımlayıcı görüntüler ayıklanacak, bilimsel değerlendirme için gerekli araç/alan verileri korunacaktır. Çıktıların, yürütücünün gömülü kontrol, arayüz geliştirme ve deneysel analiz becerilerine katkı sağlaması beklenmektedir. Proje sonunda bulguları içeren bir bildiri metni hazırlanarak bir ulusal bilimsel toplantıya gönderilmesi hedeflenmektedir. Kodlar, deney protokolü ve paylaşılabilir kayıtlar açık kaynak proje deposunda yayımlanacaktır.</w:t>
       </w:r>
     </w:p>
-    <w:bookmarkEnd w:id="51"/>
-    <w:bookmarkStart w:id="52" w:name="belirtmek-istenen-diğer-konular"/>
+    <w:bookmarkEnd w:id="54"/>
+    <w:bookmarkStart w:id="55" w:name="belirtmek-istenen-diğer-konular"/>
     <w:p>
       <w:pPr>
         <w:pStyle w:val="Heading2"/>
@@ -5184,7 +5840,7 @@
         <w:pStyle w:val="FirstParagraph"/>
       </w:pPr>
       <w:r>
-        <w:t xml:space="preserve">Araştırma düz zemindeki sabit engellerle sınırlandırılmıştır. Hareketli engeller, gerçek coğrafi harita/GPS kullanımı ve farklı zemin türleri ileride ele alınabilecek geliştirme alanlarıdır. Bu sınırlandırma, altı aylık sürede bütünleşik davranışın tekrarlı deneylerle incelenmesine odaklanmayı sağlayacaktır.</w:t>
+        <w:t xml:space="preserve">Çalışma düz zemin ve sabit engellerle sınırlandırılmıştır. Hareketli engeller ve coğrafi harita tabanlı kullanım ileri çalışmaların konusudur.</w:t>
       </w:r>
     </w:p>
     <w:p>
@@ -5192,20 +5848,21 @@
         <w:pStyle w:val="BodyText"/>
       </w:pPr>
       <w:r>
-        <w:t xml:space="preserve">Önerinin hazırlanmasında ChatGPT/Codex araçlarından kaynak inceleme desteği, metin düzenleme ve belge üretimi; image_gen aracından sistem ve kontrol akışı şemalarının hazırlanması; Matplotlib aracından planlanan deney geometrisinin koordinatlardan çizilmesi için yararlanılmıştır. Bilimsel içeriğin doğruluğu, kaynakların uygunluğu ve araştırma yönteminin uygulanmasına ilişkin sorumluluk proje yürütücüsüne ve akademik danışmana aittir. Görseller tasarım şemalarıdır; üretilmiş prototip veya elde edilmiş deney sonucu göstermez.</w:t>
+        <w:t xml:space="preserve">Metin hazırlama ve düzenleme, kaynak inceleme desteği ve ön çalışma kodu için üretken yapay zekâ araçları; şemalar için görsel üretim araçları; koordinat ve ön çalışma grafikleri için bilimsel bir grafik kütüphanesi kullanılmıştır. İçerik ve kaynakların sorumluluğu yürütücü ile akademik danışmana aittir. Şekil 1–3 planlanan tasarımı, Şekil 4 sentetik girdili mantıksal ön çalışmayı göstermektedir. Fiziksel araç deneyi sonucu sunulmamaktadır.</w:t>
       </w:r>
     </w:p>
-    <w:bookmarkEnd w:id="52"/>
-    <w:bookmarkStart w:id="54" w:name="ekler"/>
+    <w:bookmarkEnd w:id="55"/>
+    <w:bookmarkStart w:id="57" w:name="ekler"/>
     <w:p>
       <w:pPr>
         <w:pStyle w:val="Heading2"/>
+        <w:pageBreakBefore/>
       </w:pPr>
       <w:r>
         <w:t xml:space="preserve">6. EKLER</w:t>
       </w:r>
     </w:p>
-    <w:bookmarkStart w:id="53" w:name="ek-1.-gerekçeli-bütçe"/>
+    <w:bookmarkStart w:id="56" w:name="ek-1.-gerekçeli-bütçe"/>
     <w:p>
       <w:pPr>
         <w:pStyle w:val="Heading3"/>
@@ -7218,9 +7875,9 @@
         <w:t xml:space="preserve">Mevcut telefon ve lehim ekipmanı yeniden bütçelenmemiştir. Hazır kitte bulunan parçalar ikinci kez alınmayacak; tedarik, Bölüm 2.2’de tanımlanan işlevsel uyum şartlarına göre yapılacaktır.</w:t>
       </w:r>
     </w:p>
-    <w:bookmarkEnd w:id="53"/>
-    <w:bookmarkEnd w:id="54"/>
-    <w:bookmarkStart w:id="62" w:name="kaynaklar"/>
+    <w:bookmarkEnd w:id="56"/>
+    <w:bookmarkEnd w:id="57"/>
+    <w:bookmarkStart w:id="65" w:name="kaynaklar"/>
     <w:p>
       <w:pPr>
         <w:pStyle w:val="Heading2"/>
@@ -7271,7 +7928,7 @@
       <w:r>
         <w:t xml:space="preserve"> </w:t>
       </w:r>
-      <w:hyperlink r:id="rId55">
+      <w:hyperlink r:id="rId58">
         <w:r>
           <w:rPr>
             <w:rStyle w:val="Hyperlink"/>
@@ -7291,22 +7948,7 @@
         </w:numPr>
       </w:pPr>
       <w:r>
-        <w:t xml:space="preserve">Dellaert, F., Hutchinson, S. t.y.</w:t>
-      </w:r>
-      <w:r>
-        <w:t xml:space="preserve"> </w:t>
-      </w:r>
-      <w:r>
-        <w:t xml:space="preserve">“</w:t>
-      </w:r>
-      <w:r>
-        <w:t xml:space="preserve">Motion Model for the Differential Drive Robot</w:t>
-      </w:r>
-      <w:r>
-        <w:t xml:space="preserve">”</w:t>
-      </w:r>
-      <w:r>
-        <w:t xml:space="preserve">.</w:t>
+        <w:t xml:space="preserve">Corke, P. 2017.</w:t>
       </w:r>
       <w:r>
         <w:t xml:space="preserve"> </w:t>
@@ -7316,169 +7958,10 @@
           <w:i/>
           <w:iCs/>
         </w:rPr>
-        <w:t xml:space="preserve">Introduction to Robotics and Perception</w:t>
-      </w:r>
-      <w:r>
-        <w:t xml:space="preserve">, Bölüm 5.2. İnternet adresi:</w:t>
-      </w:r>
-      <w:r>
-        <w:t xml:space="preserve"> </w:t>
-      </w:r>
-      <w:hyperlink r:id="rId56">
-        <w:r>
-          <w:rPr>
-            <w:rStyle w:val="Hyperlink"/>
-          </w:rPr>
-          <w:t xml:space="preserve">https://github.com/gtbook/robotics/blob/main/S52_diffdrive_actions.ipynb</w:t>
-        </w:r>
-      </w:hyperlink>
-      <w:r>
-        <w:t xml:space="preserve">. Son erişim tarihi: 21 Ekim 2026.</w:t>
-      </w:r>
-    </w:p>
-    <w:p>
-      <w:pPr>
-        <w:numPr>
-          <w:ilvl w:val="0"/>
-          <w:numId w:val="1003"/>
-        </w:numPr>
-      </w:pPr>
-      <w:r>
-        <w:t xml:space="preserve">Espressif Systems. t.y.</w:t>
-      </w:r>
-      <w:r>
-        <w:t xml:space="preserve"> </w:t>
-      </w:r>
-      <w:r>
-        <w:t xml:space="preserve">“</w:t>
-      </w:r>
-      <w:r>
-        <w:t xml:space="preserve">HTTP Server</w:t>
-      </w:r>
-      <w:r>
-        <w:t xml:space="preserve">”</w:t>
-      </w:r>
-      <w:r>
-        <w:t xml:space="preserve">.</w:t>
-      </w:r>
-      <w:r>
-        <w:t xml:space="preserve"> </w:t>
-      </w:r>
-      <w:r>
-        <w:rPr>
-          <w:i/>
-          <w:iCs/>
-        </w:rPr>
-        <w:t xml:space="preserve">ESP-IDF Programming Guide</w:t>
-      </w:r>
-      <w:r>
-        <w:t xml:space="preserve">, v5.5.1. İnternet adresi:</w:t>
-      </w:r>
-      <w:r>
-        <w:t xml:space="preserve"> </w:t>
-      </w:r>
-      <w:hyperlink r:id="rId57">
-        <w:r>
-          <w:rPr>
-            <w:rStyle w:val="Hyperlink"/>
-          </w:rPr>
-          <w:t xml:space="preserve">https://github.com/espressif/esp-idf/blob/v5.5.1/docs/en/api-reference/protocols/esp_http_server.rst</w:t>
-        </w:r>
-      </w:hyperlink>
-      <w:r>
-        <w:t xml:space="preserve">. Son erişim tarihi: 21 Ekim 2026.</w:t>
-      </w:r>
-    </w:p>
-    <w:p>
-      <w:pPr>
-        <w:numPr>
-          <w:ilvl w:val="0"/>
-          <w:numId w:val="1003"/>
-        </w:numPr>
-      </w:pPr>
-      <w:r>
-        <w:t xml:space="preserve">Hauser, K. t.y.-a.</w:t>
-      </w:r>
-      <w:r>
-        <w:t xml:space="preserve"> </w:t>
-      </w:r>
-      <w:r>
-        <w:t xml:space="preserve">“</w:t>
-      </w:r>
-      <w:r>
-        <w:t xml:space="preserve">Motion planning in simple geometric spaces</w:t>
-      </w:r>
-      <w:r>
-        <w:t xml:space="preserve">”</w:t>
-      </w:r>
-      <w:r>
-        <w:t xml:space="preserve">.</w:t>
-      </w:r>
-      <w:r>
-        <w:t xml:space="preserve"> </w:t>
-      </w:r>
-      <w:r>
-        <w:rPr>
-          <w:i/>
-          <w:iCs/>
-        </w:rPr>
-        <w:t xml:space="preserve">Robotic Systems</w:t>
-      </w:r>
-      <w:r>
-        <w:t xml:space="preserve">, Bölüm 9. İnternet adresi:</w:t>
-      </w:r>
-      <w:r>
-        <w:t xml:space="preserve"> </w:t>
-      </w:r>
-      <w:hyperlink r:id="rId58">
-        <w:r>
-          <w:rPr>
-            <w:rStyle w:val="Hyperlink"/>
-          </w:rPr>
-          <w:t xml:space="preserve">https://github.com/krishauser/RoboticSystemsBook/blob/master/GeometricMotionPlanning.ipynb</w:t>
-        </w:r>
-      </w:hyperlink>
-      <w:r>
-        <w:t xml:space="preserve">. Son erişim tarihi: 21 Ekim 2026.</w:t>
-      </w:r>
-    </w:p>
-    <w:p>
-      <w:pPr>
-        <w:numPr>
-          <w:ilvl w:val="0"/>
-          <w:numId w:val="1003"/>
-        </w:numPr>
-      </w:pPr>
-      <w:r>
-        <w:t xml:space="preserve">Hauser, K. t.y.-b.</w:t>
-      </w:r>
-      <w:r>
-        <w:t xml:space="preserve"> </w:t>
-      </w:r>
-      <w:r>
-        <w:t xml:space="preserve">“</w:t>
-      </w:r>
-      <w:r>
-        <w:t xml:space="preserve">Calibration</w:t>
-      </w:r>
-      <w:r>
-        <w:t xml:space="preserve">”</w:t>
-      </w:r>
-      <w:r>
-        <w:t xml:space="preserve">.</w:t>
-      </w:r>
-      <w:r>
-        <w:t xml:space="preserve"> </w:t>
-      </w:r>
-      <w:r>
-        <w:rPr>
-          <w:i/>
-          <w:iCs/>
-        </w:rPr>
-        <w:t xml:space="preserve">Robotic Systems</w:t>
-      </w:r>
-      <w:r>
-        <w:t xml:space="preserve">, Bölüm 22. İnternet adresi:</w:t>
+        <w:t xml:space="preserve">Robotics, Vision and Control</w:t>
+      </w:r>
+      <w:r>
+        <w:t xml:space="preserve">. 2. baskı. Springer International Publishing. ISBN: 978-3-319-54413-7. DOI:</w:t>
       </w:r>
       <w:r>
         <w:t xml:space="preserve"> </w:t>
@@ -7488,11 +7971,11 @@
           <w:rPr>
             <w:rStyle w:val="Hyperlink"/>
           </w:rPr>
-          <w:t xml:space="preserve">https://github.com/krishauser/RoboticSystemsBook/blob/master/Calibration.ipynb</w:t>
+          <w:t xml:space="preserve">https://doi.org/10.1007/978-3-319-54413-7</w:t>
         </w:r>
       </w:hyperlink>
       <w:r>
-        <w:t xml:space="preserve">. Son erişim tarihi: 21 Ekim 2026.</w:t>
+        <w:t xml:space="preserve">.</w:t>
       </w:r>
     </w:p>
     <w:p>
@@ -7556,6 +8039,59 @@
         </w:numPr>
       </w:pPr>
       <w:r>
+        <w:t xml:space="preserve">Lumelsky, V. J., Stepanov, A. A. 1987.</w:t>
+      </w:r>
+      <w:r>
+        <w:t xml:space="preserve"> </w:t>
+      </w:r>
+      <w:r>
+        <w:t xml:space="preserve">“</w:t>
+      </w:r>
+      <w:r>
+        <w:t xml:space="preserve">Path-planning strategies for a point mobile automaton moving amidst unknown obstacles of arbitrary shape</w:t>
+      </w:r>
+      <w:r>
+        <w:t xml:space="preserve">”</w:t>
+      </w:r>
+      <w:r>
+        <w:t xml:space="preserve">,</w:t>
+      </w:r>
+      <w:r>
+        <w:t xml:space="preserve"> </w:t>
+      </w:r>
+      <w:r>
+        <w:rPr>
+          <w:i/>
+          <w:iCs/>
+        </w:rPr>
+        <w:t xml:space="preserve">Algorithmica</w:t>
+      </w:r>
+      <w:r>
+        <w:t xml:space="preserve">, 2, 403–430. DOI:</w:t>
+      </w:r>
+      <w:r>
+        <w:t xml:space="preserve"> </w:t>
+      </w:r>
+      <w:hyperlink r:id="rId61">
+        <w:r>
+          <w:rPr>
+            <w:rStyle w:val="Hyperlink"/>
+          </w:rPr>
+          <w:t xml:space="preserve">https://doi.org/10.1007/BF01840369</w:t>
+        </w:r>
+      </w:hyperlink>
+      <w:r>
+        <w:t xml:space="preserve">.</w:t>
+      </w:r>
+    </w:p>
+    <w:p>
+      <w:pPr>
+        <w:numPr>
+          <w:ilvl w:val="0"/>
+          <w:numId w:val="1003"/>
+        </w:numPr>
+      </w:pPr>
+      <w:r>
         <w:t xml:space="preserve">Rodrigues, V. O. B., Silva, G. A. A., Pugliese, L. F., Silva, W. W. A. G., Monte-Mor, J. A., Karolak, D. B., Gomides, L. M., Braga, R. A. S. 2026.</w:t>
       </w:r>
       <w:r>
@@ -7589,7 +8125,7 @@
       <w:r>
         <w:t xml:space="preserve"> </w:t>
       </w:r>
-      <w:hyperlink r:id="rId61">
+      <w:hyperlink r:id="rId62">
         <w:r>
           <w:rPr>
             <w:rStyle w:val="Hyperlink"/>
@@ -7601,8 +8137,99 @@
         <w:t xml:space="preserve">.</w:t>
       </w:r>
     </w:p>
-    <w:bookmarkEnd w:id="62"/>
-    <w:bookmarkEnd w:id="63"/>
+    <w:p>
+      <w:pPr>
+        <w:numPr>
+          <w:ilvl w:val="0"/>
+          <w:numId w:val="1003"/>
+        </w:numPr>
+      </w:pPr>
+      <w:r>
+        <w:t xml:space="preserve">STMicroelectronics. 2024.</w:t>
+      </w:r>
+      <w:r>
+        <w:t xml:space="preserve"> </w:t>
+      </w:r>
+      <w:r>
+        <w:rPr>
+          <w:i/>
+          <w:iCs/>
+        </w:rPr>
+        <w:t xml:space="preserve">VL53L0X: Time-of-Flight ranging sensor</w:t>
+      </w:r>
+      <w:r>
+        <w:t xml:space="preserve">. Veri sayfası DS11555, Rev. 6, Haziran 2024, Bölüm 6, s. 21–24. İnternet adresi:</w:t>
+      </w:r>
+      <w:r>
+        <w:t xml:space="preserve"> </w:t>
+      </w:r>
+      <w:hyperlink r:id="rId63">
+        <w:r>
+          <w:rPr>
+            <w:rStyle w:val="Hyperlink"/>
+          </w:rPr>
+          <w:t xml:space="preserve">https://www.st.com/resource/en/datasheet/vl53l0x.pdf</w:t>
+        </w:r>
+      </w:hyperlink>
+      <w:r>
+        <w:t xml:space="preserve">. Son erişim tarihi: 22 Ekim 2026.</w:t>
+      </w:r>
+    </w:p>
+    <w:p>
+      <w:pPr>
+        <w:numPr>
+          <w:ilvl w:val="0"/>
+          <w:numId w:val="1003"/>
+        </w:numPr>
+      </w:pPr>
+      <w:r>
+        <w:t xml:space="preserve">Wilson, E. B. 1927.</w:t>
+      </w:r>
+      <w:r>
+        <w:t xml:space="preserve"> </w:t>
+      </w:r>
+      <w:r>
+        <w:t xml:space="preserve">“</w:t>
+      </w:r>
+      <w:r>
+        <w:t xml:space="preserve">Probable Inference, the Law of Succession, and Statistical Inference</w:t>
+      </w:r>
+      <w:r>
+        <w:t xml:space="preserve">”</w:t>
+      </w:r>
+      <w:r>
+        <w:t xml:space="preserve">,</w:t>
+      </w:r>
+      <w:r>
+        <w:t xml:space="preserve"> </w:t>
+      </w:r>
+      <w:r>
+        <w:rPr>
+          <w:i/>
+          <w:iCs/>
+        </w:rPr>
+        <w:t xml:space="preserve">Journal of the American Statistical Association</w:t>
+      </w:r>
+      <w:r>
+        <w:t xml:space="preserve">, 22(158), 209–212. DOI:</w:t>
+      </w:r>
+      <w:r>
+        <w:t xml:space="preserve"> </w:t>
+      </w:r>
+      <w:hyperlink r:id="rId64">
+        <w:r>
+          <w:rPr>
+            <w:rStyle w:val="Hyperlink"/>
+          </w:rPr>
+          <w:t xml:space="preserve">https://doi.org/10.1080/01621459.1927.10502953</w:t>
+        </w:r>
+      </w:hyperlink>
+      <w:r>
+        <w:t xml:space="preserve">.</w:t>
+      </w:r>
+    </w:p>
+    <w:bookmarkEnd w:id="65"/>
+    <w:bookmarkEnd w:id="66"/>
     <w:sectPr>
       <w:headerReference r:id="rId9" w:type="default"/>
       <w:footerReference r:id="rId10" w:type="default"/>

</xml_diff>

<commit_message>
2209-A raporunda kaynak, erişim ve zamanlama risklerini netleştir
</commit_message>
<xml_diff>
--- a/docs/2209-A/ARASTIRMA_ONERISI.docx
+++ b/docs/2209-A/ARASTIRMA_ONERISI.docx
@@ -55,7 +55,7 @@
         </w:drawing>
       </w:r>
     </w:p>
-    <w:bookmarkStart w:id="66" w:name="tübitak-2209-a"/>
+    <w:bookmarkStart w:id="68" w:name="tübitak-2209-a"/>
     <w:p>
       <w:pPr>
         <w:pStyle w:val="Heading1"/>
@@ -722,7 +722,7 @@
               <w:rPr>
                 <w:sz w:val="20"/>
               </w:rPr>
-              <w:t xml:space="preserve">Sistem; ESP32 kontrol birimi, bağımsız sürülen iki enkoderli motor ve beş sabit uçuş süresi (ToF) mesafe sensöründen oluşacaktır. Bilgisayar öncelikli, telefondan da erişilebilir web arayüzünde yerel koordinatlarla sıralı ara rota noktaları (waypoint) tanımlanacaktır. Enkoder tabanlı konum kestirimi ve mesafe ölçümleriyle hareket kontrol edilecek; engelden kaçınma ve rotaya yeniden katılma, Bug 2 yaklaşımından yararlanan bir durum makinesiyle gerçekleştirilecektir.</w:t>
+              <w:t xml:space="preserve">Sistem; kablosuz haberleşmeli bir mikrodenetleyici, bağımsız sürülen iki enkoderli motor ve beş sabit uçuş süresi (ToF) mesafe sensöründen oluşacaktır. Bilgisayar öncelikli, telefondan da erişilebilir web arayüzünde yerel koordinatlarla sıralı ara rota noktaları (waypoint) tanımlanacaktır. Enkoder tabanlı konum kestirimi ve mesafe ölçümleriyle hareket kontrol edilecek; engelden kaçınma ve rotaya yeniden katılma, Bug 2 yaklaşımından yararlanan bir durum makinesiyle gerçekleştirilecektir.</w:t>
             </w:r>
           </w:p>
           <w:p>
@@ -746,7 +746,7 @@
               <w:rPr>
                 <w:sz w:val="20"/>
               </w:rPr>
-              <w:t xml:space="preserve">Altı aylık çalışma, donanım ve kalibrasyon, arayüz, rota takibi, engelden kaçınma ile deney, analiz ve raporlamadan oluşan beş iş paketinde yürütülecektir. Beklenen çıktılar bir araç prototipi, rota arayüzü, deney kayıt kümesi ve sürümlenmiş yazılım ile teknik dokümantasyondur. Çalışmanın, gömülü kontrol ve mobil robotik alanında deneysel bir eğitim ve geliştirme altyapısı oluşturması beklenmektedir.</w:t>
+              <w:t xml:space="preserve">Altı aylık çalışma, donanım ve kalibrasyon, arayüz, rota takibi, engelden kaçınma ile deney, analiz ve raporlamadan oluşan dört iş paketinde yürütülecektir. Beklenen çıktılar bir araç prototipi, rota arayüzü, deney kayıt kümesi ve sürümlenmiş yazılım ile teknik dokümantasyondur. Çalışmanın, gömülü kontrol ve mobil robotik alanında deneysel bir eğitim ve geliştirme altyapısı oluşturması beklenmektedir.</w:t>
             </w:r>
           </w:p>
           <w:p>
@@ -830,7 +830,7 @@
         <w:pStyle w:val="BodyText"/>
       </w:pPr>
       <w:r>
-        <w:t xml:space="preserve">Depo ve lojistikte kullanılan mobil araçlarda, tanımlı bir görevin engel sonrasında sürdürülebilmesi önemli bir işlevdir. Bu çalışma, aynı problemi küçük ölçekli bir prototipte ele alarak gömülü kontrol ve mobil robotik eğitiminde kullanılabilecek, deneyleri tekrarlanabilir bir platform oluşturmayı hedeflemektedir. Elde edilecek bulgular, kontrollü derslik koşulları için yorumlanacaktır.</w:t>
+        <w:t xml:space="preserve">Örneğin, depo veya lojistik alanında tanımlı bir rota boyunca yük taşıması planlanan küçük bir araçta, sabit engel sonrasında göreve devam etme davranışı bir uygulama senaryosu olarak ele alınabilir. Bu çalışma, aynı problemi küçük ölçekli bir prototipte ele alarak gömülü kontrol ve mobil robotik eğitiminde kullanılabilecek, deneyleri tekrarlanabilir bir platform oluşturmayı hedeflemektedir. Elde edilecek bulgular, kontrollü derslik koşulları için yorumlanacaktır.</w:t>
       </w:r>
     </w:p>
     <w:p>
@@ -858,7 +858,7 @@
         <w:pStyle w:val="BodyText"/>
       </w:pPr>
       <w:r>
-        <w:t xml:space="preserve">Iqbal vd. (2023), koordinatların bir uygulamadan ESP32 tabanlı mobil robota aktarılmasını içeren bir sistem sunmuştur. Rodrigues vd. (2026), enkoderler, dış kamera temelli konum bilgisi ve ESP32 kontrol katmanını içeren küçük bir robotta yörünge takibini değerlendirmiştir. Bu çalışmalar, rota bilgisinin aktarılması ve hareket kontrolünün kurulması için örnek oluşturmaktadır. Bu projede ise arayüzden verilen rota, enkoder tabanlı konum hesabı ve yerel engel algılama bir araya getirilecek; engelden sonra aynı rotaya dönme davranışı incelenecektir.</w:t>
+        <w:t xml:space="preserve">Iqbal vd. (2023), koordinatların bir uygulamadan kablosuz bağlantılı mobil robota aktarılmasını içeren bir sistem sunmuştur. Rodrigues vd. (2026), enkoderler, dış kamera temelli konum bilgisi ve gömülü kontrol katmanını içeren küçük bir robotta yörünge takibini değerlendirmiştir. Bu çalışmalar, rota bilgisinin aktarılması ve hareket kontrolünün kurulması için örnek oluşturmaktadır. Bu projede ise arayüzden verilen rota, enkoder tabanlı konum hesabı ve yerel engel algılama bir araya getirilecek; engelden sonra aynı rotaya dönme davranışı incelenecektir.</w:t>
       </w:r>
     </w:p>
     <w:p>
@@ -942,7 +942,7 @@
         <w:pStyle w:val="BodyText"/>
       </w:pPr>
       <w:r>
-        <w:t xml:space="preserve">Beklenen katkı, kullanıcı arayüzü ile ESP32 tabanlı hareket kontrolünü bütünleştiren bir prototipin geliştirilmesi ve başarının tek bir genel oran yerine algılama, kaçınma, rotaya dönüş ve görev tamamlama aşamalarında değerlendirilmesidir. Başarılı ve başarısız denemelerin birlikte incelenmesi, sistemin hangi koşullarda yeterli olduğunu ve hangi noktalarda geliştirme gerektirdiğini gösterecektir. Ölçümlerin güvenilir referanslarla kontrol edilmesi kalibrasyon yaklaşımına dayanmaktadır (Corke, 2017). Çalışmanın sonuçları, düz zemindeki 3 × 3 metrelik alan ve seçilen sabit engel koşullarıyla sınırlandırılacaktır.</w:t>
+        <w:t xml:space="preserve">Beklenen katkı, kullanıcı arayüzü ile gömülü hareket kontrolünü bütünleştiren bir prototipin geliştirilmesi ve başarının tek bir genel oran yerine algılama, kaçınma, rotaya dönüş ve görev tamamlama aşamalarında değerlendirilmesidir. Başarılı ve başarısız denemelerin birlikte incelenmesi, sistemin hangi koşullarda yeterli olduğunu ve hangi noktalarda geliştirme gerektirdiğini gösterecektir. Enkoder tabanlı konumda sistematik ve sistematik olmayan hata kaynaklarının ayrılması, kalibrasyon ile bağımsız değerlendirmeyi birlikte gerektirmektedir (Borenstein ve Feng, 1996). Çalışmanın sonuçları, düz zemindeki 3 × 3 metrelik alan ve seçilen sabit engel koşullarıyla sınırlandırılacaktır.</w:t>
       </w:r>
     </w:p>
     <w:bookmarkEnd w:id="25"/>
@@ -992,7 +992,7 @@
         </w:numPr>
       </w:pPr>
       <w:r>
-        <w:t xml:space="preserve">İki enkoderli motor, beş sabit ToF sensörü ve ESP32’yi bütünleştirmek; tekerlek hareketi, dönüş, sensör kapsaması ve durma davranışı için kalibrasyon kayıtları oluşturmak.</w:t>
+        <w:t xml:space="preserve">İki enkoderli motor, beş sabit ToF sensörü ve mikrodenetleyiciyi bütünleştirmek; tekerlek hareketi, dönüş, sensör kapsaması ve durma davranışı için kalibrasyon kayıtları oluşturmak.</w:t>
       </w:r>
     </w:p>
     <w:p>
@@ -1084,7 +1084,7 @@
         <w:pStyle w:val="BodyText"/>
       </w:pPr>
       <w:r>
-        <w:t xml:space="preserve">Donanım ve kalibrasyon İP1, arayüz ve haberleşme İP2, konum kestirimi ve rota takibi İP3, kaçınma ve rotaya dönüş İP4 kapsamında geliştirilecektir. Bütünleşik sistemin dört koşulda değerlendirilmesi, veri analizi ve sonuçların raporlanması İP5 kapsamında yapılacaktır. Geliştirme/ayar denemeleri, nihai 40 değerlendirme denemesinden ayrı tutulacaktır.</w:t>
+        <w:t xml:space="preserve">Donanım, kalibrasyon, arayüz ve haberleşme İP1; konum kestirimi ve rota takibi İP2; kaçınma ve rotaya dönüş İP3 kapsamında geliştirilecektir. Bütünleşik sistemin dört koşulda değerlendirilmesi, veri analizi ve sonuçların raporlanması İP4 kapsamında yapılacaktır. Geliştirme/ayar denemeleri, nihai 40 değerlendirme denemesinden ayrı tutulacaktır.</w:t>
       </w:r>
     </w:p>
     <w:bookmarkEnd w:id="28"/>
@@ -1110,7 +1110,7 @@
         <w:pStyle w:val="BodyText"/>
       </w:pPr>
       <w:r>
-        <w:t xml:space="preserve">ESP32, enkoderleri okuyacak, mesafe ölçümlerini işleyecek, hareket kararlarını verecek ve motorları sürecektir. Bileşenler aşağıdaki işlevsel gereksinimlerle temin edilecektir. Ticari ürün kodu yerine bu gereksinimlerin esas alınması, eşdeğer ürünlerle aynı araştırma yönteminin uygulanmasını sağlayacaktır.</w:t>
+        <w:t xml:space="preserve">Kontrol birimi için ESP32 ailesinden bir mikrodenetleyici kullanılacaktır. Bu birim enkoderleri okuyacak, mesafe ölçümlerini işleyecek, hareket kararlarını verecek ve motorları sürecektir. Satın alınacak kart, sensör taşıyıcısı ve mekanik parçalar aşağıdaki işlevsel gereksinimlere göre seçilecektir; literatürdeki referans bileşen belirli bir taşıyıcı ürünün satın alınma şartı değildir.</w:t>
       </w:r>
     </w:p>
     <w:tbl>
@@ -1223,7 +1223,7 @@
               <w:rPr>
                 <w:sz w:val="19"/>
               </w:rPr>
-              <w:t xml:space="preserve">ESP32 geliştirme kartı</w:t>
+              <w:t xml:space="preserve">Kablosuz haberleşmeli kontrol kartı</w:t>
             </w:r>
           </w:p>
         </w:tc>
@@ -1598,7 +1598,7 @@
         <w:pStyle w:val="BodyText"/>
       </w:pPr>
       <w:r>
-        <w:t xml:space="preserve">Motorlar ve kontrol elektroniği ayrı güç kablo dallarından beslenecek, ortak toprak referansı kullanılacaktır. Bataryanın ham gerilimi motorlara veya ESP32 giriş/çıkışlarına uygulanmayacaktır. Motor sürücüsü, regülatör, kablo ve koruma elemanları iki motorun birlikte kalkış/yük akımı esas alınarak boyutlandırılacaktır. Ürünlerin gerilim, akım, bağlantı ve şarj uyumu, montajın giriş kontrolünde veri sayfaları ve elektriksel kontrollerle doğrulanacaktır.</w:t>
+        <w:t xml:space="preserve">Motorlar ve kontrol elektroniği ayrı güç kablo dallarından beslenecek, ortak toprak referansı kullanılacaktır. Bataryanın ham gerilimi motorlara veya kontrol kartı giriş/çıkışlarına uygulanmayacaktır. Motor sürücüsü, regülatör, kablo ve koruma elemanları iki motorun birlikte kalkış/yük akımı esas alınarak boyutlandırılacaktır. Ürünlerin gerilim, akım, bağlantı ve şarj uyumu, montajın giriş kontrolünde veri sayfaları ve elektriksel kontrollerle doğrulanacaktır.</w:t>
       </w:r>
     </w:p>
     <w:p>
@@ -1668,7 +1668,7 @@
         <w:t xml:space="preserve"> </w:t>
       </w:r>
       <w:r>
-        <w:t xml:space="preserve">Kullanıcı arayüzü, algılama, ESP32 ve motor sürme birimleri arasındaki veri akışı. ÜYZ desteğiyle hazırlanmış işlevsel tasarım şemasıdır.</w:t>
+        <w:t xml:space="preserve">Kullanıcı arayüzü, algılama, mikrodenetleyici ve motor sürme birimleri arasındaki veri akışı. ÜYZ desteğiyle hazırlanmış işlevsel tasarım şemasıdır.</w:t>
       </w:r>
     </w:p>
     <w:bookmarkEnd w:id="32"/>
@@ -1686,7 +1686,7 @@
         <w:pStyle w:val="FirstParagraph"/>
       </w:pPr>
       <w:r>
-        <w:t xml:space="preserve">Tekerlek yarıçapları, iki tekerlek arasındaki açıklık ve çıkış mili devri başına sayılan enkoder kenarı sayısı kalibrasyonla kaydedilecektir. Motor mili/çıkış mili çözünürlüğü ve sayım yöntemi birbirinden ayrılacaktır. Diferansiyel sürüş kinematiğiyle tekerlek hareketlerinden göreli konum ve yön hesaplanacaktır (Corke, 2017).</w:t>
+        <w:t xml:space="preserve">Tekerlek yarıçapları, iki tekerlek arasındaki açıklık ve çıkış mili devri başına sayılan enkoder kenarı sayısı kalibrasyonla kaydedilecektir. Motor mili/çıkış mili çözünürlüğü ve sayım yöntemi birbirinden ayrılacaktır. Diferansiyel sürüş kinematiğiyle tekerlek hareketlerinden göreli konum ve yön hesaplanacaktır (Corke, 2017). Tekerlek çapı ve aks açıklığı kaynaklı sistematik hatalar, düz ilerleme ve alan içine sığan saat yönü/saat yönü tersi kapalı yol tekrarlarıyla incelenecek; kayma gibi sistematik olmayan etkiler ayrıca kaydedilecektir (Borenstein ve Feng, 1996).</w:t>
       </w:r>
     </w:p>
     <w:p>
@@ -1925,7 +1925,7 @@
         <w:pStyle w:val="BodyText"/>
       </w:pPr>
       <w:r>
-        <w:t xml:space="preserve">Sensörler ayrı kanallardan sıralı okunacaktır. Tamamlanan her sensör ölçümü, tam taramanın sonunu beklemeden denetleyiciye ayrı olarak aktarılacaktır. Üretici durum kodlarına göre ölçüm sonucu ve iletişim/ölçüm hatası ayrılacak; belirsiz veri boş yol kabul edilmeyecektir. Gerçek tarama ve tepki süreleri montaj sonrasında kaydedilecek; 200 ms tarama hedefi sağlanmadan nihai deneylere başlanmayacaktır. Tekerlek kayması ve odometrik sürüklenme bağımsız ölçümle izlenecektir.</w:t>
+        <w:t xml:space="preserve">Sensörler ayrı kanallardan sıralı okunacaktır. Tamamlanan her sensör ölçümü, tam taramanın sonunu beklemeden denetleyiciye ayrı olarak aktarılacaktır. Üretici durum kodlarına göre ölçüm sonucu ve iletişim/ölçüm hatası ayrılacak; belirsiz veri boş yol kabul edilmeyecektir. Gerçek tarama ve tepki süreleri montaj sonrasında kaydedilecek; 200 ms tarama hedefi sağlanmadan nihai deneylere başlanmayacaktır. Hedef aşılırsa ölçüm alma ve veri aktarımı denetimi bloke etmeyen görevlerle düzenlenecek; üreticinin izin verdiği daha kısa ölçüm bütçesi, engel yüzeyindeki ölçüm geçerliliği yeniden sınanarak kullanılacaktır. Gerektiğinde aynı beşli düzeni ve zamanlama hedefini karşılayan eşdeğer bir ToF taşıyıcısı seçilecektir. Azalan ölçüm süresinin belirsizliği artırması halinde araç hızı da düşürülecek; bu işlem tek başına tarama süresini kısaltan bir çözüm sayılmayacaktır. Beş sensör, 250 ms veri yaşı sınırı ve 120 saniye görev hedefi korunacak; nihai parametreler tüm koşullar için deneylerden önce sabitlenecektir. Tekerlek kayması ve odometrik sürüklenme bağımsız ölçümle izlenecektir.</w:t>
       </w:r>
     </w:p>
     <w:bookmarkEnd w:id="33"/>
@@ -1943,7 +1943,7 @@
         <w:pStyle w:val="FirstParagraph"/>
       </w:pPr>
       <w:r>
-        <w:t xml:space="preserve">Arayüz HTML, CSS ve JavaScript ile hazırlanacak; ESP32’nin oluşturacağı yerel Wi-Fi ağı üzerinden bilgisayar ve telefon tarayıcısında açılacaktır. Kullanıcı, metre ölçekli kareli alan üzerinde başlangıç konumu/yönünü ve waypoint’leri sıralı belirleyecektir. Koordinatların yerel olması, çizilen rotanın deney alanıyla doğrudan ilişkilendirilmesini sağlayacaktır.</w:t>
+        <w:t xml:space="preserve">Arayüz HTML, CSS ve JavaScript ile hazırlanacak; kontrol kartının oluşturacağı yerel kablosuz ağ üzerinden bilgisayar ve telefon tarayıcısında açılacaktır. Kullanıcı, metre ölçekli kareli alan üzerinde başlangıç konumu/yönünü ve waypoint’leri sıralı belirleyecektir. Koordinatların yerel olması, çizilen rotanın deney alanıyla doğrudan ilişkilendirilmesini sağlayacaktır.</w:t>
       </w:r>
     </w:p>
     <w:p>
@@ -2073,7 +2073,7 @@
         <w:pStyle w:val="FirstParagraph"/>
       </w:pPr>
       <w:r>
-        <w:t xml:space="preserve">İdeal Bug 2 algoritmasının tamlık özellikleri bu fiziksel uyarlama için garanti edilmeyecektir. Kaçınma başlangıç bölgesinden en az 20 cm uzaklaştıktan sonra bu konumun 10 cm çevresine hedefe ilerleme sağlayamadan geri dönme, döngü şüphesi olarak kaydedilecektir. Çarpışma, alan sınırına çıkma, geçersiz sensör verisi, haberleşme kaybı veya 120 saniye süre aşımında görev durdurulacaktır. Durdurma nedeni, deney sonucu ve günlük kaydıyla ilişkilendirilecektir; döngü kaydı ortamda hiçbir geçerli yol bulunmadığı biçiminde yorumlanmayacaktır.</w:t>
+        <w:t xml:space="preserve">İdeal Bug 2 algoritmasının tamlık özellikleri bu fiziksel uyarlama için garanti edilmeyecektir. Kaçınma başlangıç bölgesinden en az 20 cm uzaklaştıktan sonra bu konumun 10 cm çevresine hedefe ilerleme sağlayamadan geri dönme, döngü şüphesi olarak kaydedilecektir. Geçersiz sensör verisi, haberleşme kaybı ve 120 saniye süre aşımı araç üzerinde durdurma üretecektir. Deney gözlemcisi fiziksel temas veya alan sınırı ihlali görürse arayüzden ya da ana güç anahtarından denemeyi durduracak; bu müdahale başarısız deneme olarak kaydedilecektir. Ayrı bir temas sensörüyle otomatik çarpışma algılama iddia edilmemektedir. Durdurma nedeni, deney sonucu ve günlük kaydıyla ilişkilendirilecektir; döngü kaydı ortamda hiçbir geçerli yol bulunmadığı biçiminde yorumlanmayacaktır.</w:t>
       </w:r>
     </w:p>
     <w:p>
@@ -2179,7 +2179,7 @@
         <w:pStyle w:val="FirstParagraph"/>
       </w:pPr>
       <w:r>
-        <w:t xml:space="preserve">Deneylerin Konya Teknik Üniversitesi Elektrik-Elektronik Mühendisliği Bölümünde kullanımına izin verilecek bir derslikte kurulacak, düz ve kuru zeminli 3 × 3 metrelik kontrollü deney alanında yürütülmesi planlanmaktadır. Bir köşe yerel koordinat sisteminin başlangıcı olacak; metre birimindeki rota</w:t>
+        <w:t xml:space="preserve">Konya Teknik Üniversitesi Elektrik-Elektronik Mühendisliği Bölümünde derslik kullanımı için bölümden teyit alınmıştır. Deneylerin bu derslikte kurulacak, düz ve kuru zeminli 3 × 3 metrelik kontrollü alanda yürütülmesi planlanmaktadır. Bir köşe yerel koordinat sisteminin başlangıcı olacak; metre birimindeki rota</w:t>
       </w:r>
       <w:r>
         <w:t xml:space="preserve"> </w:t>
@@ -2745,7 +2745,7 @@
         <w:pStyle w:val="FirstParagraph"/>
       </w:pPr>
       <w:r>
-        <w:t xml:space="preserve">Aracın hareketi, yürütücünün mevcut telefonuyla en az 1080p ve 30 kare/saniye sabit görüntü kaydına alınacaktır. Telefonun yaklaşık 3,0 m yükseklikte, optik ekseni alan merkezine yönelmiş sabit bir düzeneğe yerleştirilmesi planlanmaktadır. Gerçek montaj yüksekliği ölçülüp kaydedilecek; tüm 3 × 3 metrelik alanın ve araç işaretinin görüntülendiği kurulumda doğrulanacaktır. Kamera konum bilgisi araç denetleyicisine verilmeyecek; bağımsız değerlendirme için kullanılacaktır.</w:t>
+        <w:t xml:space="preserve">Aracın hareketi, yürütücünün mevcut telefonuyla en az 1080p ve 30 kare/saniye sabit görüntü kaydına alınacaktır. Başlangıç montaj yüksekliği yaklaşık 3,0 m olarak planlanmakta; bu değerin tek başına yeterli görüş alanı sağladığı varsayılmamaktadır. Dersliğin tavan yüksekliği ve kullanılabilir sabitleme noktası ölçülecek, alan merkezine yönelmiş kamerada 3 × 3 metrelik alanın çevresinde görüntü payı bırakılacaktır. Alan sığmazsa, mevcut telefonda bulunması halinde geniş açı modu ve bozulma düzeltmesi kullanılacak; bu seçenek yoksa veya doğruluk hedefini karşılamazsa güvenli montaj yüksekliği/konumu değiştirilecek ya da aynı boyuttaki alan daha uygun tavan ve sabitleme olanağı bulunan başka bir kapalı mekâna taşınacaktır. Alan küçültülmeyecek; seçilen mercek modu, gerçek montaj yüksekliği ve kontrol noktası hataları kaydedilecektir. Kamera konum bilgisi araç denetleyicisine verilmeyecek; bağımsız değerlendirme için kullanılacaktır.</w:t>
       </w:r>
     </w:p>
     <w:p>
@@ -2753,7 +2753,7 @@
         <w:pStyle w:val="BodyText"/>
       </w:pPr>
       <w:r>
-        <w:t xml:space="preserve">Görüntü–metre dönüşümü, ölçülmüş konumdaki en az altı referans noktayla kurulacak; dönüşümde kullanılmayan ve alanı kapsayan en az beş kontrol noktasıyla sınanacaktır. Mercek bozulması ve araç üzerindeki işaretin yüksekliğinden kaynaklanan perspektif hatası düzeltilecektir. İzleme işareti aks orta noktasının üstüne yerleştirilecek; görüntü dönüşümünde işaretin bulunduğu yükseklik düzlemi esas alınacaktır. Kontrol noktalarında en çok 2 cm konum hatası çalışma hedefi olarak kullanılacak, ölçülen kalibrasyon hatası ve dinamik izlemenin ek belirsizlikleri ayrıca raporlanacaktır. Güvenilir referanslarla ölçüm doğrulama yaklaşımı, kalibrasyon çerçevesine dayanmaktadır (Corke, 2017).</w:t>
+        <w:t xml:space="preserve">Görüntü–metre dönüşümü, ölçülmüş konumdaki en az altı referans noktayla kurulacak; dönüşümde kullanılmayan ve alanı kapsayan en az beş kontrol noktasıyla sınanacaktır. İç kamera parametreleri ve mercek bozulması, farklı açılardan alınan düzlemsel kalibrasyon örüntüsü görüntüleriyle kestirilecektir (Zhang, 2000). Araç üzerindeki işaretin yüksekliğinden kaynaklanan perspektif hatası da düzeltilecektir. İzleme işareti aks orta noktasının üstüne yerleştirilecek; görüntü dönüşümünde işaretin bulunduğu yükseklik düzlemi esas alınacaktır. Kontrol noktalarında en çok 2 cm konum hatası çalışma hedefi olarak kullanılacak, ölçülen kalibrasyon hatası ve dinamik izlemenin ek belirsizlikleri ayrıca raporlanacaktır. Kalibrasyonda kullanılan noktalarla bağımsız kontrol noktaları ayrı tutulacak; mercek modu ve montaj değişirse kalibrasyon tekrarlanacaktır.</w:t>
       </w:r>
     </w:p>
     <w:p>
@@ -3998,7 +3998,6 @@
     <w:p>
       <w:pPr>
         <w:pStyle w:val="Heading2"/>
-        <w:pageBreakBefore/>
       </w:pPr>
       <w:r>
         <w:t xml:space="preserve">3. PROJE YÖNETİMİ</w:t>
@@ -4059,6 +4058,7 @@
           <w:p>
             <w:pPr>
               <w:pStyle w:val="Compact"/>
+              <w:keepNext/>
               <w:spacing w:after="60" w:line="252" w:lineRule="auto"/>
               <w:jc w:val="left"/>
             </w:pPr>
@@ -4080,6 +4080,7 @@
           <w:p>
             <w:pPr>
               <w:pStyle w:val="Compact"/>
+              <w:keepNext/>
               <w:spacing w:after="60" w:line="252" w:lineRule="auto"/>
               <w:jc w:val="left"/>
             </w:pPr>
@@ -4101,6 +4102,7 @@
           <w:p>
             <w:pPr>
               <w:pStyle w:val="Compact"/>
+              <w:keepNext/>
               <w:spacing w:after="60" w:line="252" w:lineRule="auto"/>
               <w:jc w:val="left"/>
             </w:pPr>
@@ -4122,6 +4124,7 @@
           <w:p>
             <w:pPr>
               <w:pStyle w:val="Compact"/>
+              <w:keepNext/>
               <w:spacing w:after="60" w:line="252" w:lineRule="auto"/>
               <w:jc w:val="left"/>
             </w:pPr>
@@ -4143,6 +4146,7 @@
           <w:p>
             <w:pPr>
               <w:pStyle w:val="Compact"/>
+              <w:keepNext/>
               <w:spacing w:after="60" w:line="252" w:lineRule="auto"/>
               <w:jc w:val="left"/>
             </w:pPr>
@@ -4168,6 +4172,7 @@
           <w:p>
             <w:pPr>
               <w:pStyle w:val="Compact"/>
+              <w:keepNext/>
               <w:spacing w:after="60" w:line="252" w:lineRule="auto"/>
               <w:jc w:val="left"/>
             </w:pPr>
@@ -4187,14 +4192,15 @@
           <w:p>
             <w:pPr>
               <w:pStyle w:val="Compact"/>
-              <w:spacing w:after="60" w:line="252" w:lineRule="auto"/>
-              <w:jc w:val="left"/>
-            </w:pPr>
-            <w:r>
-              <w:rPr>
-                <w:sz w:val="19"/>
-              </w:rPr>
-              <w:t xml:space="preserve">İP1 — Donanım entegrasyonu ve kalibrasyon</w:t>
+              <w:keepNext/>
+              <w:spacing w:after="60" w:line="252" w:lineRule="auto"/>
+              <w:jc w:val="left"/>
+            </w:pPr>
+            <w:r>
+              <w:rPr>
+                <w:sz w:val="19"/>
+              </w:rPr>
+              <w:t xml:space="preserve">İP1 — Donanım, kalibrasyon, arayüz ve haberleşme</w:t>
             </w:r>
           </w:p>
         </w:tc>
@@ -4206,6 +4212,7 @@
           <w:p>
             <w:pPr>
               <w:pStyle w:val="Compact"/>
+              <w:keepNext/>
               <w:spacing w:after="60" w:line="252" w:lineRule="auto"/>
               <w:jc w:val="left"/>
             </w:pPr>
@@ -4225,14 +4232,15 @@
           <w:p>
             <w:pPr>
               <w:pStyle w:val="Compact"/>
-              <w:spacing w:after="60" w:line="252" w:lineRule="auto"/>
-              <w:jc w:val="left"/>
-            </w:pPr>
-            <w:r>
-              <w:rPr>
-                <w:sz w:val="19"/>
-              </w:rPr>
-              <w:t xml:space="preserve">İki motor/enkoder ve beş sensörün çalışması; düz ilerleme, dönüş, sensör kapsaması ve durma mesafesi kayıtlarının tamamlanması.</w:t>
+              <w:keepNext/>
+              <w:spacing w:after="60" w:line="252" w:lineRule="auto"/>
+              <w:jc w:val="left"/>
+            </w:pPr>
+            <w:r>
+              <w:rPr>
+                <w:sz w:val="19"/>
+              </w:rPr>
+              <w:t xml:space="preserve">İki motor/enkoder ve beş sensörün çalışması; hareket, kapsama, durma ve kamera kalibrasyon kayıtları; rota aktarımı, telemetri ve bağlantı kaybında durdurmanın doğrulanması.</w:t>
             </w:r>
           </w:p>
         </w:tc>
@@ -4244,14 +4252,15 @@
           <w:p>
             <w:pPr>
               <w:pStyle w:val="Compact"/>
-              <w:spacing w:after="60" w:line="252" w:lineRule="auto"/>
-              <w:jc w:val="left"/>
-            </w:pPr>
-            <w:r>
-              <w:rPr>
-                <w:sz w:val="19"/>
-              </w:rPr>
-              <w:t xml:space="preserve">%20</w:t>
+              <w:keepNext/>
+              <w:spacing w:after="60" w:line="252" w:lineRule="auto"/>
+              <w:jc w:val="left"/>
+            </w:pPr>
+            <w:r>
+              <w:rPr>
+                <w:sz w:val="19"/>
+              </w:rPr>
+              <w:t xml:space="preserve">%35</w:t>
             </w:r>
           </w:p>
         </w:tc>
@@ -4268,14 +4277,15 @@
           <w:p>
             <w:pPr>
               <w:pStyle w:val="Compact"/>
-              <w:spacing w:after="60" w:line="252" w:lineRule="auto"/>
-              <w:jc w:val="left"/>
-            </w:pPr>
-            <w:r>
-              <w:rPr>
-                <w:sz w:val="19"/>
-              </w:rPr>
-              <w:t xml:space="preserve">1–2. ay</w:t>
+              <w:keepNext/>
+              <w:spacing w:after="60" w:line="252" w:lineRule="auto"/>
+              <w:jc w:val="left"/>
+            </w:pPr>
+            <w:r>
+              <w:rPr>
+                <w:sz w:val="19"/>
+              </w:rPr>
+              <w:t xml:space="preserve">3. ay</w:t>
             </w:r>
           </w:p>
         </w:tc>
@@ -4287,14 +4297,15 @@
           <w:p>
             <w:pPr>
               <w:pStyle w:val="Compact"/>
-              <w:spacing w:after="60" w:line="252" w:lineRule="auto"/>
-              <w:jc w:val="left"/>
-            </w:pPr>
-            <w:r>
-              <w:rPr>
-                <w:sz w:val="19"/>
-              </w:rPr>
-              <w:t xml:space="preserve">İP2 — Arayüz ve haberleşme</w:t>
+              <w:keepNext/>
+              <w:spacing w:after="60" w:line="252" w:lineRule="auto"/>
+              <w:jc w:val="left"/>
+            </w:pPr>
+            <w:r>
+              <w:rPr>
+                <w:sz w:val="19"/>
+              </w:rPr>
+              <w:t xml:space="preserve">İP2 — Konum kestirimi ve rota takibi</w:t>
             </w:r>
           </w:p>
         </w:tc>
@@ -4306,6 +4317,7 @@
           <w:p>
             <w:pPr>
               <w:pStyle w:val="Compact"/>
+              <w:keepNext/>
               <w:spacing w:after="60" w:line="252" w:lineRule="auto"/>
               <w:jc w:val="left"/>
             </w:pPr>
@@ -4325,14 +4337,15 @@
           <w:p>
             <w:pPr>
               <w:pStyle w:val="Compact"/>
-              <w:spacing w:after="60" w:line="252" w:lineRule="auto"/>
-              <w:jc w:val="left"/>
-            </w:pPr>
-            <w:r>
-              <w:rPr>
-                <w:sz w:val="19"/>
-              </w:rPr>
-              <w:t xml:space="preserve">Rota oluşturma/aktarma, başlatma/durdurma ve telemetri işlevlerinin bilgisayar ve telefon tarayıcısında doğrulanması; bağlantı kaybında durdurma.</w:t>
+              <w:keepNext/>
+              <w:spacing w:after="60" w:line="252" w:lineRule="auto"/>
+              <w:jc w:val="left"/>
+            </w:pPr>
+            <w:r>
+              <w:rPr>
+                <w:sz w:val="19"/>
+              </w:rPr>
+              <w:t xml:space="preserve">A–B–C waypoint sırasının engelsiz ayar denemelerinde izlenmesi; 10 cm erişim ölçütünün ve bağımsız konum kaydının kontrolü.</w:t>
             </w:r>
           </w:p>
         </w:tc>
@@ -4344,14 +4357,15 @@
           <w:p>
             <w:pPr>
               <w:pStyle w:val="Compact"/>
-              <w:spacing w:after="60" w:line="252" w:lineRule="auto"/>
-              <w:jc w:val="left"/>
-            </w:pPr>
-            <w:r>
-              <w:rPr>
-                <w:sz w:val="19"/>
-              </w:rPr>
-              <w:t xml:space="preserve">%15</w:t>
+              <w:keepNext/>
+              <w:spacing w:after="60" w:line="252" w:lineRule="auto"/>
+              <w:jc w:val="left"/>
+            </w:pPr>
+            <w:r>
+              <w:rPr>
+                <w:sz w:val="19"/>
+              </w:rPr>
+              <w:t xml:space="preserve">%20</w:t>
             </w:r>
           </w:p>
         </w:tc>
@@ -4368,14 +4382,15 @@
           <w:p>
             <w:pPr>
               <w:pStyle w:val="Compact"/>
-              <w:spacing w:after="60" w:line="252" w:lineRule="auto"/>
-              <w:jc w:val="left"/>
-            </w:pPr>
-            <w:r>
-              <w:rPr>
-                <w:sz w:val="19"/>
-              </w:rPr>
-              <w:t xml:space="preserve">3. ay</w:t>
+              <w:keepNext/>
+              <w:spacing w:after="60" w:line="252" w:lineRule="auto"/>
+              <w:jc w:val="left"/>
+            </w:pPr>
+            <w:r>
+              <w:rPr>
+                <w:sz w:val="19"/>
+              </w:rPr>
+              <w:t xml:space="preserve">4–5. ay</w:t>
             </w:r>
           </w:p>
         </w:tc>
@@ -4387,14 +4402,15 @@
           <w:p>
             <w:pPr>
               <w:pStyle w:val="Compact"/>
-              <w:spacing w:after="60" w:line="252" w:lineRule="auto"/>
-              <w:jc w:val="left"/>
-            </w:pPr>
-            <w:r>
-              <w:rPr>
-                <w:sz w:val="19"/>
-              </w:rPr>
-              <w:t xml:space="preserve">İP3 — Konum kestirimi ve rota takibi</w:t>
+              <w:keepNext/>
+              <w:spacing w:after="60" w:line="252" w:lineRule="auto"/>
+              <w:jc w:val="left"/>
+            </w:pPr>
+            <w:r>
+              <w:rPr>
+                <w:sz w:val="19"/>
+              </w:rPr>
+              <w:t xml:space="preserve">İP3 — Engel algılama, kaçınma ve rotaya dönüş</w:t>
             </w:r>
           </w:p>
         </w:tc>
@@ -4406,6 +4422,7 @@
           <w:p>
             <w:pPr>
               <w:pStyle w:val="Compact"/>
+              <w:keepNext/>
               <w:spacing w:after="60" w:line="252" w:lineRule="auto"/>
               <w:jc w:val="left"/>
             </w:pPr>
@@ -4425,14 +4442,15 @@
           <w:p>
             <w:pPr>
               <w:pStyle w:val="Compact"/>
-              <w:spacing w:after="60" w:line="252" w:lineRule="auto"/>
-              <w:jc w:val="left"/>
-            </w:pPr>
-            <w:r>
-              <w:rPr>
-                <w:sz w:val="19"/>
-              </w:rPr>
-              <w:t xml:space="preserve">A–B–C waypoint sırasının engelsiz ayar denemelerinde izlenmesi; 10 cm erişim ölçütünün ve bağımsız konum kaydının kontrolü.</w:t>
+              <w:keepNext/>
+              <w:spacing w:after="60" w:line="252" w:lineRule="auto"/>
+              <w:jc w:val="left"/>
+            </w:pPr>
+            <w:r>
+              <w:rPr>
+                <w:sz w:val="19"/>
+              </w:rPr>
+              <w:t xml:space="preserve">Durum geçişleri, açıklık ve dönüş kurallarının bütünleştirilmesi; tarama süresi ve durdurma kontrolleri; nihai yazılım ve parametre sürümünün sabitlenmesi.</w:t>
             </w:r>
           </w:p>
         </w:tc>
@@ -4444,14 +4462,15 @@
           <w:p>
             <w:pPr>
               <w:pStyle w:val="Compact"/>
-              <w:spacing w:after="60" w:line="252" w:lineRule="auto"/>
-              <w:jc w:val="left"/>
-            </w:pPr>
-            <w:r>
-              <w:rPr>
-                <w:sz w:val="19"/>
-              </w:rPr>
-              <w:t xml:space="preserve">%20</w:t>
+              <w:keepNext/>
+              <w:spacing w:after="60" w:line="252" w:lineRule="auto"/>
+              <w:jc w:val="left"/>
+            </w:pPr>
+            <w:r>
+              <w:rPr>
+                <w:sz w:val="19"/>
+              </w:rPr>
+              <w:t xml:space="preserve">%30</w:t>
             </w:r>
           </w:p>
         </w:tc>
@@ -4468,14 +4487,15 @@
           <w:p>
             <w:pPr>
               <w:pStyle w:val="Compact"/>
-              <w:spacing w:after="60" w:line="252" w:lineRule="auto"/>
-              <w:jc w:val="left"/>
-            </w:pPr>
-            <w:r>
-              <w:rPr>
-                <w:sz w:val="19"/>
-              </w:rPr>
-              <w:t xml:space="preserve">4–5. ay</w:t>
+              <w:keepNext w:val="0"/>
+              <w:spacing w:after="60" w:line="252" w:lineRule="auto"/>
+              <w:jc w:val="left"/>
+            </w:pPr>
+            <w:r>
+              <w:rPr>
+                <w:sz w:val="19"/>
+              </w:rPr>
+              <w:t xml:space="preserve">6. ay</w:t>
             </w:r>
           </w:p>
         </w:tc>
@@ -4487,14 +4507,15 @@
           <w:p>
             <w:pPr>
               <w:pStyle w:val="Compact"/>
-              <w:spacing w:after="60" w:line="252" w:lineRule="auto"/>
-              <w:jc w:val="left"/>
-            </w:pPr>
-            <w:r>
-              <w:rPr>
-                <w:sz w:val="19"/>
-              </w:rPr>
-              <w:t xml:space="preserve">İP4 — Engel algılama, kaçınma ve rotaya dönüş</w:t>
+              <w:keepNext w:val="0"/>
+              <w:spacing w:after="60" w:line="252" w:lineRule="auto"/>
+              <w:jc w:val="left"/>
+            </w:pPr>
+            <w:r>
+              <w:rPr>
+                <w:sz w:val="19"/>
+              </w:rPr>
+              <w:t xml:space="preserve">İP4 — Kontrollü deney, analiz ve sonuçların raporlanması</w:t>
             </w:r>
           </w:p>
         </w:tc>
@@ -4506,6 +4527,7 @@
           <w:p>
             <w:pPr>
               <w:pStyle w:val="Compact"/>
+              <w:keepNext w:val="0"/>
               <w:spacing w:after="60" w:line="252" w:lineRule="auto"/>
               <w:jc w:val="left"/>
             </w:pPr>
@@ -4525,14 +4547,15 @@
           <w:p>
             <w:pPr>
               <w:pStyle w:val="Compact"/>
-              <w:spacing w:after="60" w:line="252" w:lineRule="auto"/>
-              <w:jc w:val="left"/>
-            </w:pPr>
-            <w:r>
-              <w:rPr>
-                <w:sz w:val="19"/>
-              </w:rPr>
-              <w:t xml:space="preserve">Durum geçişleri, açıklık ve dönüş kurallarının bütünleştirilmesi; ayar kayıtlarıyla nihai yazılım ve parametre sürümünün sabitlenmesi.</w:t>
+              <w:keepNext w:val="0"/>
+              <w:spacing w:after="60" w:line="252" w:lineRule="auto"/>
+              <w:jc w:val="left"/>
+            </w:pPr>
+            <w:r>
+              <w:rPr>
+                <w:sz w:val="19"/>
+              </w:rPr>
+              <w:t xml:space="preserve">Toplam 40 geçerli deneme; her engelli koşulda en az 8/10 birleşik başarı hedefinin değerlendirilmesi; süre/hata analizi ve sonuç raporunun tamamlanması.</w:t>
             </w:r>
           </w:p>
         </w:tc>
@@ -4544,106 +4567,7 @@
           <w:p>
             <w:pPr>
               <w:pStyle w:val="Compact"/>
-              <w:spacing w:after="60" w:line="252" w:lineRule="auto"/>
-              <w:jc w:val="left"/>
-            </w:pPr>
-            <w:r>
-              <w:rPr>
-                <w:sz w:val="19"/>
-              </w:rPr>
-              <w:t xml:space="preserve">%30</w:t>
-            </w:r>
-          </w:p>
-        </w:tc>
-      </w:tr>
-      <w:tr>
-        <w:trPr>
-          <w:cantSplit/>
-        </w:trPr>
-        <w:tc>
-          <w:tcPr>
-            <w:tcW w:type="dxa" w:w="850"/>
-            <w:vAlign w:val="top"/>
-          </w:tcPr>
-          <w:p>
-            <w:pPr>
-              <w:pStyle w:val="Compact"/>
-              <w:spacing w:after="60" w:line="252" w:lineRule="auto"/>
-              <w:jc w:val="left"/>
-            </w:pPr>
-            <w:r>
-              <w:rPr>
-                <w:sz w:val="19"/>
-              </w:rPr>
-              <w:t xml:space="preserve">5–6. ay</w:t>
-            </w:r>
-          </w:p>
-        </w:tc>
-        <w:tc>
-          <w:tcPr>
-            <w:tcW w:type="dxa" w:w="2041"/>
-            <w:vAlign w:val="top"/>
-          </w:tcPr>
-          <w:p>
-            <w:pPr>
-              <w:pStyle w:val="Compact"/>
-              <w:spacing w:after="60" w:line="252" w:lineRule="auto"/>
-              <w:jc w:val="left"/>
-            </w:pPr>
-            <w:r>
-              <w:rPr>
-                <w:sz w:val="19"/>
-              </w:rPr>
-              <w:t xml:space="preserve">İP5 — Kontrollü deney, analiz ve sonuçların raporlanması</w:t>
-            </w:r>
-          </w:p>
-        </w:tc>
-        <w:tc>
-          <w:tcPr>
-            <w:tcW w:type="dxa" w:w="1361"/>
-            <w:vAlign w:val="top"/>
-          </w:tcPr>
-          <w:p>
-            <w:pPr>
-              <w:pStyle w:val="Compact"/>
-              <w:spacing w:after="60" w:line="252" w:lineRule="auto"/>
-              <w:jc w:val="left"/>
-            </w:pPr>
-            <w:r>
-              <w:rPr>
-                <w:sz w:val="19"/>
-              </w:rPr>
-              <w:t xml:space="preserve">Ahmet Talha Arslan</w:t>
-            </w:r>
-          </w:p>
-        </w:tc>
-        <w:tc>
-          <w:tcPr>
-            <w:tcW w:type="dxa" w:w="4592"/>
-            <w:vAlign w:val="top"/>
-          </w:tcPr>
-          <w:p>
-            <w:pPr>
-              <w:pStyle w:val="Compact"/>
-              <w:spacing w:after="60" w:line="252" w:lineRule="auto"/>
-              <w:jc w:val="left"/>
-            </w:pPr>
-            <w:r>
-              <w:rPr>
-                <w:sz w:val="19"/>
-              </w:rPr>
-              <w:t xml:space="preserve">Toplam 40 geçerli deneme; her engelli koşulda en az 8/10 birleşik başarı hedefinin değerlendirilmesi; süre, hata ve başarısızlık analizleri ile sonuç raporunun tamamlanması.</w:t>
-            </w:r>
-          </w:p>
-        </w:tc>
-        <w:tc>
-          <w:tcPr>
-            <w:tcW w:type="dxa" w:w="794"/>
-            <w:vAlign w:val="top"/>
-          </w:tcPr>
-          <w:p>
-            <w:pPr>
-              <w:pStyle w:val="Compact"/>
+              <w:keepNext w:val="0"/>
               <w:spacing w:after="60" w:line="252" w:lineRule="auto"/>
               <w:jc w:val="left"/>
             </w:pPr>
@@ -4662,7 +4586,7 @@
         <w:pStyle w:val="BodyText"/>
       </w:pPr>
       <w:r>
-        <w:t xml:space="preserve">Başarıya katkı toplamı %100’dür. İlk iki ayda donanım ve arayüz çalışmaları kısmen paralel yürütülecektir. Rota takibine, hareket kalibrasyonu ve rota aktarımı tamamlandıktan sonra geçilecektir. Beşinci ayda veri işleme araçları, kayıt/analiz şablonları ve raporun yöntem bölümü hazırlanacaktır. Kaçınma entegrasyonu ve ayar denemelerini, son sürümün sabitlenmesi ile altıncı aydaki 40 geçerli deney izleyecektir. Deney sonuçları geldikçe analiz ve sonuç raporu birlikte tamamlanacaktır. Literatür incelemesi, temin ve raporlama ilgili teknik faaliyetlere eşlik edecek; bağımsız iş paketi yapılmayacaktır.</w:t>
+        <w:t xml:space="preserve">Başarıya katkı toplamı %100, ardışık iş paketlerinin toplam süresi altı aydır. İlk iki ayın donanım ve arayüz faaliyetleri tek bütünleştirme paketi içinde yürütülecektir. Rota takibine, hareket kalibrasyonu ve rota aktarımı tamamlandıktan sonra geçilecektir. Beşinci ayda kaçınma geliştirmesine eşlik eden veri işleme araçları, kayıt/analiz şablonları ve raporun yöntem bölümü hazırlanacaktır. Son sürümün sabitlenmesini altıncı aydaki 40 geçerli deney izleyecek; analiz ve sonuç raporu deneylerle birlikte tamamlanacaktır. Literatür incelemesi, temin ve raporlama ilgili teknik faaliyetlere eşlik edecek; bağımsız iş paketi yapılmayacaktır.</w:t>
       </w:r>
     </w:p>
     <w:bookmarkEnd w:id="50"/>
@@ -4823,7 +4747,7 @@
               <w:rPr>
                 <w:sz w:val="19"/>
               </w:rPr>
-              <w:t xml:space="preserve">1, 3, 4</w:t>
+              <w:t xml:space="preserve">1, 2, 3</w:t>
             </w:r>
           </w:p>
         </w:tc>
@@ -4885,7 +4809,7 @@
               <w:rPr>
                 <w:sz w:val="19"/>
               </w:rPr>
-              <w:t xml:space="preserve">1, 4</w:t>
+              <w:t xml:space="preserve">1, 3</w:t>
             </w:r>
           </w:p>
         </w:tc>
@@ -4947,7 +4871,7 @@
               <w:rPr>
                 <w:sz w:val="19"/>
               </w:rPr>
-              <w:t xml:space="preserve">4, 5</w:t>
+              <w:t xml:space="preserve">3, 4</w:t>
             </w:r>
           </w:p>
         </w:tc>
@@ -5009,7 +4933,7 @@
               <w:rPr>
                 <w:sz w:val="19"/>
               </w:rPr>
-              <w:t xml:space="preserve">1, 4</w:t>
+              <w:t xml:space="preserve">1, 3</w:t>
             </w:r>
           </w:p>
         </w:tc>
@@ -5052,7 +4976,7 @@
               <w:rPr>
                 <w:sz w:val="19"/>
               </w:rPr>
-              <w:t xml:space="preserve">Sabitleme, yükseklik düzlemi, mercek düzeltmesi ve kontrol noktaları iyileştirilecektir. Gerekirse yine bağımsız kalan başka bir sabit görüntüleme düzeni kurulacak; yalnız ölçülebilen kapsam raporlanacaktır.</w:t>
+              <w:t xml:space="preserve">Tavan yüksekliği, görüş alanı ve sabitleme kontrol edilecektir. Mevcutsa geniş açı modu ve bozulma düzeltmesi; değilse daha yüksek/uygun montaj veya başka kapalı alan kullanılacaktır. 3 × 3 m alan ve bağımsız ölçüm korunacak; kalibrasyon tekrarlanacaktır.</w:t>
             </w:r>
           </w:p>
         </w:tc>
@@ -5071,7 +4995,7 @@
               <w:rPr>
                 <w:sz w:val="19"/>
               </w:rPr>
-              <w:t xml:space="preserve">1, 5</w:t>
+              <w:t xml:space="preserve">1, 4</w:t>
             </w:r>
           </w:p>
         </w:tc>
@@ -5095,6 +5019,130 @@
               <w:rPr>
                 <w:sz w:val="19"/>
               </w:rPr>
+              <w:t xml:space="preserve">Deney alanına erişim</w:t>
+            </w:r>
+          </w:p>
+        </w:tc>
+        <w:tc>
+          <w:tcPr>
+            <w:tcW w:type="dxa" w:w="6463"/>
+            <w:vAlign w:val="top"/>
+          </w:tcPr>
+          <w:p>
+            <w:pPr>
+              <w:pStyle w:val="Compact"/>
+              <w:spacing w:after="60" w:line="252" w:lineRule="auto"/>
+              <w:jc w:val="left"/>
+            </w:pPr>
+            <w:r>
+              <w:rPr>
+                <w:sz w:val="19"/>
+              </w:rPr>
+              <w:t xml:space="preserve">Derslik kullanımı teyit edilmiş olsa da ders programı/kullanım değişikliği halinde, bölümle koordineli başka bir boş derslik veya yaya trafiğine kapatılabilen uygun kapalı koridor kullanılacaktır. Alan 3 × 3 m, düz ve kuru olacaktır; nihai karşılaştırmalar aynı alanda yeniden kalibrasyonla yürütülecektir.</w:t>
+            </w:r>
+          </w:p>
+        </w:tc>
+        <w:tc>
+          <w:tcPr>
+            <w:tcW w:type="dxa" w:w="850"/>
+            <w:vAlign w:val="top"/>
+          </w:tcPr>
+          <w:p>
+            <w:pPr>
+              <w:pStyle w:val="Compact"/>
+              <w:spacing w:after="60" w:line="252" w:lineRule="auto"/>
+              <w:jc w:val="left"/>
+            </w:pPr>
+            <w:r>
+              <w:rPr>
+                <w:sz w:val="19"/>
+              </w:rPr>
+              <w:t xml:space="preserve">1, 4</w:t>
+            </w:r>
+          </w:p>
+        </w:tc>
+      </w:tr>
+      <w:tr>
+        <w:trPr>
+          <w:cantSplit/>
+        </w:trPr>
+        <w:tc>
+          <w:tcPr>
+            <w:tcW w:type="dxa" w:w="2324"/>
+            <w:vAlign w:val="top"/>
+          </w:tcPr>
+          <w:p>
+            <w:pPr>
+              <w:pStyle w:val="Compact"/>
+              <w:spacing w:after="60" w:line="252" w:lineRule="auto"/>
+              <w:jc w:val="left"/>
+            </w:pPr>
+            <w:r>
+              <w:rPr>
+                <w:sz w:val="19"/>
+              </w:rPr>
+              <w:t xml:space="preserve">Tam taramanın 200 ms’yi aşması</w:t>
+            </w:r>
+          </w:p>
+        </w:tc>
+        <w:tc>
+          <w:tcPr>
+            <w:tcW w:type="dxa" w:w="6463"/>
+            <w:vAlign w:val="top"/>
+          </w:tcPr>
+          <w:p>
+            <w:pPr>
+              <w:pStyle w:val="Compact"/>
+              <w:spacing w:after="60" w:line="252" w:lineRule="auto"/>
+              <w:jc w:val="left"/>
+            </w:pPr>
+            <w:r>
+              <w:rPr>
+                <w:sz w:val="19"/>
+              </w:rPr>
+              <w:t xml:space="preserve">Bloke etmeyen okuma, üreticinin izin verdiği daha kısa ölçüm bütçesi ve gerekirse zaman hedefini karşılayan eşdeğer ToF taşıyıcısı kullanılacaktır. Ölçüm geçerliliği ve durma mesafesi yeniden kontrol edilecek; gerekirse araç hızı azaltılacaktır. Beş sensör ve 250 ms veri yaşı sınırı korunacaktır.</w:t>
+            </w:r>
+          </w:p>
+        </w:tc>
+        <w:tc>
+          <w:tcPr>
+            <w:tcW w:type="dxa" w:w="850"/>
+            <w:vAlign w:val="top"/>
+          </w:tcPr>
+          <w:p>
+            <w:pPr>
+              <w:pStyle w:val="Compact"/>
+              <w:spacing w:after="60" w:line="252" w:lineRule="auto"/>
+              <w:jc w:val="left"/>
+            </w:pPr>
+            <w:r>
+              <w:rPr>
+                <w:sz w:val="19"/>
+              </w:rPr>
+              <w:t xml:space="preserve">1, 3</w:t>
+            </w:r>
+          </w:p>
+        </w:tc>
+      </w:tr>
+      <w:tr>
+        <w:trPr>
+          <w:cantSplit/>
+        </w:trPr>
+        <w:tc>
+          <w:tcPr>
+            <w:tcW w:type="dxa" w:w="2324"/>
+            <w:vAlign w:val="top"/>
+          </w:tcPr>
+          <w:p>
+            <w:pPr>
+              <w:pStyle w:val="Compact"/>
+              <w:spacing w:after="60" w:line="252" w:lineRule="auto"/>
+              <w:jc w:val="left"/>
+            </w:pPr>
+            <w:r>
+              <w:rPr>
+                <w:sz w:val="19"/>
+              </w:rPr>
               <w:t xml:space="preserve">Parça temini veya bütçe sapması</w:t>
             </w:r>
           </w:p>
@@ -5133,7 +5181,7 @@
               <w:rPr>
                 <w:sz w:val="19"/>
               </w:rPr>
-              <w:t xml:space="preserve">1–5</w:t>
+              <w:t xml:space="preserve">1–4</w:t>
             </w:r>
           </w:p>
         </w:tc>
@@ -5162,7 +5210,7 @@
         <w:pStyle w:val="FirstParagraph"/>
       </w:pPr>
       <w:r>
-        <w:t xml:space="preserve">Araştırma Konya Teknik Üniversitesi Elektrik-Elektronik Mühendisliği kapsamında, yürütücü ve akademik danışmanın bilimsel çalışması olarak yürütülecektir. Planlanan deney yeri, Konya Teknik Üniversitesi Elektrik-Elektronik Mühendisliği Bölümünde bir derslikte kurulacak 3 × 3 metrelik İKA deney alanıdır. Derslik içinde 3 × 3 metrelik düz zeminli alan ayrılacak; kullanım zamanı ders programına ve bölümün iznine göre düzenlenecektir. Diğer altyapı kişisel kaynaklar ve proje bütçesiyle sağlanacaktır.</w:t>
+        <w:t xml:space="preserve">Araştırma Konya Teknik Üniversitesi Elektrik-Elektronik Mühendisliği kapsamında, yürütücü ve akademik danışmanın bilimsel çalışması olarak yürütülecektir. Deney yeri, bölümden kullanım teyidi alınan derslikte kurulacak 3 × 3 metrelik insansız kara aracı (İKA) deney alanıdır. Alanın kurulması ve kullanım zamanı ders programıyla koordineli düzenlenecek; tavan yüksekliği ve sabitleme olanağı yerinde ölçülecektir. Diğer altyapı kişisel kaynaklar ve proje bütçesiyle sağlanacaktır.</w:t>
       </w:r>
     </w:p>
     <w:tbl>
@@ -5253,7 +5301,7 @@
               <w:rPr>
                 <w:sz w:val="19"/>
               </w:rPr>
-              <w:t xml:space="preserve">Üniversitede kullanımı planlanan derslik</w:t>
+              <w:t xml:space="preserve">Kullanım teyidi alınan üniversite dersliği</w:t>
             </w:r>
           </w:p>
         </w:tc>
@@ -5272,7 +5320,7 @@
               <w:rPr>
                 <w:sz w:val="19"/>
               </w:rPr>
-              <w:t xml:space="preserve">3 × 3 metrelik deney alanının kurulması; bölüm izni ve uygun zamanlama ile kullanım</w:t>
+              <w:t xml:space="preserve">3 × 3 metrelik deney alanının kurulması; ders programıyla koordineli kullanım</w:t>
             </w:r>
           </w:p>
         </w:tc>
@@ -5359,92 +5407,6 @@
                 <w:sz w:val="19"/>
               </w:rPr>
               <w:t xml:space="preserve">Bağımsız deney videosu ve ölçüm kaydı</w:t>
-            </w:r>
-          </w:p>
-        </w:tc>
-      </w:tr>
-      <w:tr>
-        <w:trPr>
-          <w:cantSplit/>
-        </w:trPr>
-        <w:tc>
-          <w:tcPr>
-            <w:tcW w:type="dxa" w:w="2381"/>
-            <w:vAlign w:val="top"/>
-          </w:tcPr>
-          <w:p>
-            <w:pPr>
-              <w:pStyle w:val="Compact"/>
-              <w:spacing w:after="60" w:line="252" w:lineRule="auto"/>
-              <w:jc w:val="left"/>
-            </w:pPr>
-            <w:r>
-              <w:rPr>
-                <w:sz w:val="19"/>
-              </w:rPr>
-              <w:t xml:space="preserve">Proje bütçesinden sağlanacak kontrol, algılama ve hareket bileşenleri</w:t>
-            </w:r>
-          </w:p>
-        </w:tc>
-        <w:tc>
-          <w:tcPr>
-            <w:tcW w:type="dxa" w:w="7257"/>
-            <w:vAlign w:val="top"/>
-          </w:tcPr>
-          <w:p>
-            <w:pPr>
-              <w:pStyle w:val="Compact"/>
-              <w:spacing w:after="60" w:line="252" w:lineRule="auto"/>
-              <w:jc w:val="left"/>
-            </w:pPr>
-            <w:r>
-              <w:rPr>
-                <w:sz w:val="19"/>
-              </w:rPr>
-              <w:t xml:space="preserve">Araç prototipinin kurulması</w:t>
-            </w:r>
-          </w:p>
-        </w:tc>
-      </w:tr>
-      <w:tr>
-        <w:trPr>
-          <w:cantSplit/>
-        </w:trPr>
-        <w:tc>
-          <w:tcPr>
-            <w:tcW w:type="dxa" w:w="2381"/>
-            <w:vAlign w:val="top"/>
-          </w:tcPr>
-          <w:p>
-            <w:pPr>
-              <w:pStyle w:val="Compact"/>
-              <w:spacing w:after="60" w:line="252" w:lineRule="auto"/>
-              <w:jc w:val="left"/>
-            </w:pPr>
-            <w:r>
-              <w:rPr>
-                <w:sz w:val="19"/>
-              </w:rPr>
-              <w:t xml:space="preserve">Proje bütçesinden sağlanacak multimetre, uzunluk ölçüm aracı, telefon sabitleme ve işaretleme malzemesi</w:t>
-            </w:r>
-          </w:p>
-        </w:tc>
-        <w:tc>
-          <w:tcPr>
-            <w:tcW w:type="dxa" w:w="7257"/>
-            <w:vAlign w:val="top"/>
-          </w:tcPr>
-          <w:p>
-            <w:pPr>
-              <w:pStyle w:val="Compact"/>
-              <w:spacing w:after="60" w:line="252" w:lineRule="auto"/>
-              <w:jc w:val="left"/>
-            </w:pPr>
-            <w:r>
-              <w:rPr>
-                <w:sz w:val="19"/>
-              </w:rPr>
-              <w:t xml:space="preserve">Elektriksel kontrol, deney alanının kurulması ve görüntü kalibrasyonu</w:t>
             </w:r>
           </w:p>
         </w:tc>
@@ -5822,17 +5784,17 @@
         <w:pStyle w:val="BodyText"/>
       </w:pPr>
       <w:r>
-        <w:t xml:space="preserve">Paylaşılabilir yazılım, bağlantı bilgileri ve deney düzeni, proje için kullanılan GitHub deposunda sürümlenecektir. Veri paylaşımında kişiler veya mekâna ait tanımlayıcı görüntüler ayıklanacak, bilimsel değerlendirme için gerekli araç/alan verileri korunacaktır. Çıktıların, yürütücünün gömülü kontrol, arayüz geliştirme ve deneysel analiz becerilerine katkı sağlaması beklenmektedir. Proje sonunda bulguları içeren bir bildiri metni hazırlanarak bir ulusal bilimsel toplantıya gönderilmesi hedeflenmektedir. Kodlar, deney protokolü ve paylaşılabilir kayıtlar açık kaynak proje deposunda yayımlanacaktır.</w:t>
+        <w:t xml:space="preserve">Paylaşılabilir yazılım, bağlantı bilgileri ve deney düzeni, proje için kullanılan açık kaynak sürüm deposunda sürümlenecektir. Veri paylaşımında kişiler veya mekâna ait tanımlayıcı görüntüler ayıklanacak, bilimsel değerlendirme için gerekli araç/alan verileri korunacaktır. Çıktıların, yürütücünün gömülü kontrol, arayüz geliştirme ve deneysel analiz becerilerine katkı sağlaması beklenmektedir. Proje sonunda bulguları içeren bir bildiri metni hazırlanarak bir ulusal bilimsel toplantıya gönderilmesi hedeflenmektedir. Kodlar, deney protokolü ve paylaşılabilir kayıtlar açık kaynak proje deposunda yayımlanacaktır.</w:t>
       </w:r>
     </w:p>
     <w:bookmarkEnd w:id="54"/>
-    <w:bookmarkStart w:id="55" w:name="belirtmek-istenen-diğer-konular"/>
+    <w:bookmarkStart w:id="55" w:name="belirtmek-istediğiniz-diğer-konular"/>
     <w:p>
       <w:pPr>
         <w:pStyle w:val="Heading2"/>
       </w:pPr>
       <w:r>
-        <w:t xml:space="preserve">5. BELİRTMEK İSTENEN DİĞER KONULAR</w:t>
+        <w:t xml:space="preserve">5. BELİRTMEK İSTEDİĞİNİZ DİĞER KONULAR</w:t>
       </w:r>
     </w:p>
     <w:p>
@@ -6024,7 +5986,7 @@
               <w:rPr>
                 <w:sz w:val="19"/>
               </w:rPr>
-              <w:t xml:space="preserve">K01 — ESP32 geliştirme kartı</w:t>
+              <w:t xml:space="preserve">K01 — Kablosuz haberleşmeli kontrol kartı</w:t>
             </w:r>
           </w:p>
         </w:tc>
@@ -6591,7 +6553,7 @@
               <w:rPr>
                 <w:sz w:val="19"/>
               </w:rPr>
-              <w:t xml:space="preserve">K08 — Boş şasi veya şasi imalatı</w:t>
+              <w:t xml:space="preserve">K08 — İki motorlu araç için gövde plakası</w:t>
             </w:r>
           </w:p>
         </w:tc>
@@ -7520,7 +7482,7 @@
               <w:rPr>
                 <w:sz w:val="19"/>
               </w:rPr>
-              <w:t xml:space="preserve">500,00 TL</w:t>
+              <w:t xml:space="preserve">800,00 TL</w:t>
             </w:r>
           </w:p>
         </w:tc>
@@ -7539,7 +7501,7 @@
               <w:rPr>
                 <w:sz w:val="19"/>
               </w:rPr>
-              <w:t xml:space="preserve">500,00 TL</w:t>
+              <w:t xml:space="preserve">800,00 TL</w:t>
             </w:r>
           </w:p>
         </w:tc>
@@ -7723,87 +7685,6 @@
             </w:pPr>
             <w:r>
               <w:rPr>
-                <w:sz w:val="19"/>
-              </w:rPr>
-              <w:t xml:space="preserve">K22 — Yurt içi ürün teslim/kargo gideri</w:t>
-            </w:r>
-          </w:p>
-        </w:tc>
-        <w:tc>
-          <w:tcPr>
-            <w:tcW w:type="dxa" w:w="964"/>
-            <w:vAlign w:val="top"/>
-          </w:tcPr>
-          <w:p>
-            <w:pPr>
-              <w:pStyle w:val="Compact"/>
-              <w:spacing w:after="60" w:line="252" w:lineRule="auto"/>
-              <w:jc w:val="left"/>
-            </w:pPr>
-            <w:r>
-              <w:rPr>
-                <w:sz w:val="19"/>
-              </w:rPr>
-              <w:t xml:space="preserve">1 takım</w:t>
-            </w:r>
-          </w:p>
-        </w:tc>
-        <w:tc>
-          <w:tcPr>
-            <w:tcW w:type="dxa" w:w="1928"/>
-            <w:vAlign w:val="top"/>
-          </w:tcPr>
-          <w:p>
-            <w:pPr>
-              <w:pStyle w:val="Compact"/>
-              <w:spacing w:after="60" w:line="252" w:lineRule="auto"/>
-              <w:jc w:val="left"/>
-            </w:pPr>
-            <w:r>
-              <w:rPr>
-                <w:sz w:val="19"/>
-              </w:rPr>
-              <w:t xml:space="preserve">300,00 TL</w:t>
-            </w:r>
-          </w:p>
-        </w:tc>
-        <w:tc>
-          <w:tcPr>
-            <w:tcW w:type="dxa" w:w="1928"/>
-            <w:vAlign w:val="top"/>
-          </w:tcPr>
-          <w:p>
-            <w:pPr>
-              <w:pStyle w:val="Compact"/>
-              <w:spacing w:after="60" w:line="252" w:lineRule="auto"/>
-              <w:jc w:val="left"/>
-            </w:pPr>
-            <w:r>
-              <w:rPr>
-                <w:sz w:val="19"/>
-              </w:rPr>
-              <w:t xml:space="preserve">300,00 TL</w:t>
-            </w:r>
-          </w:p>
-        </w:tc>
-      </w:tr>
-      <w:tr>
-        <w:trPr>
-          <w:cantSplit/>
-        </w:trPr>
-        <w:tc>
-          <w:tcPr>
-            <w:tcW w:type="dxa" w:w="4819"/>
-            <w:vAlign w:val="top"/>
-          </w:tcPr>
-          <w:p>
-            <w:pPr>
-              <w:pStyle w:val="Compact"/>
-              <w:spacing w:after="60" w:line="252" w:lineRule="auto"/>
-              <w:jc w:val="left"/>
-            </w:pPr>
-            <w:r>
-              <w:rPr>
                 <w:b/>
                 <w:bCs/>
                 <w:sz w:val="19"/>
@@ -7864,7 +7745,7 @@
         <w:pStyle w:val="BodyText"/>
       </w:pPr>
       <w:r>
-        <w:t xml:space="preserve">Kontrol ve algılama için 3.500 TL, hareket/şasi için 2.850 TL, güç için 2.850 TL, montaj/bağlantı için 700 TL, deney düzeni için 1.300 TL ve yurt içi teslim için 300 TL ayrılmıştır. Kontrol ve algılama bileşenleri İP1–4’ün; deney düzeni ve ölçüm araçları İP1 ve İP5’in gereksinimlerini karşılayacaktır.</w:t>
+        <w:t xml:space="preserve">Kontrol ve algılama için 3.500 TL, hareket/şasi için 2.850 TL, güç için 2.850 TL, montaj/bağlantı için 700 TL, deney düzeni için 1.600 TL ayrılmıştır. Ayrı bir kargo ödeneği talep edilmemektedir. Kontrol ve algılama bileşenleri İP1–3’ün; deney düzeni ve ölçüm araçları İP1 ve İP4’ün gereksinimlerini karşılayacaktır.</w:t>
       </w:r>
     </w:p>
     <w:p>
@@ -7872,12 +7753,12 @@
         <w:pStyle w:val="BodyText"/>
       </w:pPr>
       <w:r>
-        <w:t xml:space="preserve">Mevcut telefon ve lehim ekipmanı yeniden bütçelenmemiştir. Hazır kitte bulunan parçalar ikinci kez alınmayacak; tedarik, Bölüm 2.2’de tanımlanan işlevsel uyum şartlarına göre yapılacaktır.</w:t>
+        <w:t xml:space="preserve">K08, iki enkoderli motorun bağlantısına uygun, en çok 25 × 20 cm araç zarfını sağlayan tek gövde plakasını kapsar; motor, tekerlek, elektronik ve ayrıca bütçelenen bağlantı elemanlarını içermez. Başlıca elektronik bileşenler, her biri ücretsiz teslim eşiğini karşılayan toplu yurt içi siparişlerle; küçük mekanik ve montaj malzemeleri yerel teslimle temin edilecektir. İncelenen iki tedarikçinin 23 Ekim 2026 teslim koşullarında 1.500 TL ve üzeri siparişler ücretsizdir. Telefon için gerekli sabitleme düzeneği 800 TL olarak planlanmıştır. Bu dağılım satıcı teklifi değil maliyet planıdır; sipariş toplamı ve teslim koşulları satın almadan önce doğrulanacaktır. Başlıca elektronik kalemlerin 23 Ekim 2026 tarihli satış sayfası gözlemleri ayrı maliyet kaydında tutulmuş; doğrudan fiyatı teyit edilemeyen mekanik/montaj kalemleri tahmin olarak bırakılmıştır. Mevcut telefon ve lehim ekipmanı yeniden bütçelenmemiştir. Aynı parça iki kalemde alınmayacak; tedarik Bölüm 2.2’deki işlevsel uyuma göre yapılacaktır.</w:t>
       </w:r>
     </w:p>
     <w:bookmarkEnd w:id="56"/>
     <w:bookmarkEnd w:id="57"/>
-    <w:bookmarkStart w:id="65" w:name="kaynaklar"/>
+    <w:bookmarkStart w:id="67" w:name="kaynaklar"/>
     <w:p>
       <w:pPr>
         <w:pStyle w:val="Heading2"/>
@@ -7948,6 +7829,59 @@
         </w:numPr>
       </w:pPr>
       <w:r>
+        <w:t xml:space="preserve">Borenstein, J., Feng, L. 1996.</w:t>
+      </w:r>
+      <w:r>
+        <w:t xml:space="preserve"> </w:t>
+      </w:r>
+      <w:r>
+        <w:t xml:space="preserve">“</w:t>
+      </w:r>
+      <w:r>
+        <w:t xml:space="preserve">Measurement and correction of systematic odometry errors in mobile robots</w:t>
+      </w:r>
+      <w:r>
+        <w:t xml:space="preserve">”</w:t>
+      </w:r>
+      <w:r>
+        <w:t xml:space="preserve">,</w:t>
+      </w:r>
+      <w:r>
+        <w:t xml:space="preserve"> </w:t>
+      </w:r>
+      <w:r>
+        <w:rPr>
+          <w:i/>
+          <w:iCs/>
+        </w:rPr>
+        <w:t xml:space="preserve">IEEE Transactions on Robotics and Automation</w:t>
+      </w:r>
+      <w:r>
+        <w:t xml:space="preserve">, 12(6), 869–880. DOI:</w:t>
+      </w:r>
+      <w:r>
+        <w:t xml:space="preserve"> </w:t>
+      </w:r>
+      <w:hyperlink r:id="rId59">
+        <w:r>
+          <w:rPr>
+            <w:rStyle w:val="Hyperlink"/>
+          </w:rPr>
+          <w:t xml:space="preserve">https://doi.org/10.1109/70.544770</w:t>
+        </w:r>
+      </w:hyperlink>
+      <w:r>
+        <w:t xml:space="preserve">.</w:t>
+      </w:r>
+    </w:p>
+    <w:p>
+      <w:pPr>
+        <w:numPr>
+          <w:ilvl w:val="0"/>
+          <w:numId w:val="1003"/>
+        </w:numPr>
+      </w:pPr>
+      <w:r>
         <w:t xml:space="preserve">Corke, P. 2017.</w:t>
       </w:r>
       <w:r>
@@ -7961,12 +7895,12 @@
         <w:t xml:space="preserve">Robotics, Vision and Control</w:t>
       </w:r>
       <w:r>
-        <w:t xml:space="preserve">. 2. baskı. Springer International Publishing. ISBN: 978-3-319-54413-7. DOI:</w:t>
+        <w:t xml:space="preserve">. 2. baskı. Cham: Springer International Publishing. ISBN: 978-3-319-54413-7. DOI:</w:t>
       </w:r>
       <w:r>
         <w:t xml:space="preserve"> </w:t>
       </w:r>
-      <w:hyperlink r:id="rId59">
+      <w:hyperlink r:id="rId60">
         <w:r>
           <w:rPr>
             <w:rStyle w:val="Hyperlink"/>
@@ -8019,7 +7953,7 @@
       <w:r>
         <w:t xml:space="preserve"> </w:t>
       </w:r>
-      <w:hyperlink r:id="rId60">
+      <w:hyperlink r:id="rId61">
         <w:r>
           <w:rPr>
             <w:rStyle w:val="Hyperlink"/>
@@ -8072,7 +8006,7 @@
       <w:r>
         <w:t xml:space="preserve"> </w:t>
       </w:r>
-      <w:hyperlink r:id="rId61">
+      <w:hyperlink r:id="rId62">
         <w:r>
           <w:rPr>
             <w:rStyle w:val="Hyperlink"/>
@@ -8125,7 +8059,7 @@
       <w:r>
         <w:t xml:space="preserve"> </w:t>
       </w:r>
-      <w:hyperlink r:id="rId62">
+      <w:hyperlink r:id="rId63">
         <w:r>
           <w:rPr>
             <w:rStyle w:val="Hyperlink"/>
@@ -8155,24 +8089,24 @@
           <w:i/>
           <w:iCs/>
         </w:rPr>
-        <w:t xml:space="preserve">VL53L0X: Time-of-Flight ranging sensor</w:t>
-      </w:r>
-      <w:r>
-        <w:t xml:space="preserve">. Veri sayfası DS11555, Rev. 6, Haziran 2024, Bölüm 6, s. 21–24. İnternet adresi:</w:t>
+        <w:t xml:space="preserve">Time-of-Flight ranging sensor</w:t>
+      </w:r>
+      <w:r>
+        <w:t xml:space="preserve">. Teknik veri sayfası DS11555, Rev. 6, Haziran 2024, Bölüm 3.10 ve 6. İnternet adresi:</w:t>
       </w:r>
       <w:r>
         <w:t xml:space="preserve"> </w:t>
       </w:r>
-      <w:hyperlink r:id="rId63">
+      <w:hyperlink r:id="rId64">
         <w:r>
           <w:rPr>
             <w:rStyle w:val="Hyperlink"/>
           </w:rPr>
-          <w:t xml:space="preserve">https://www.st.com/resource/en/datasheet/vl53l0x.pdf</w:t>
+          <w:t xml:space="preserve">Resmî teknik veri sayfası</w:t>
         </w:r>
       </w:hyperlink>
       <w:r>
-        <w:t xml:space="preserve">. Son erişim tarihi: 22 Ekim 2026.</w:t>
+        <w:t xml:space="preserve">. Son erişim tarihi: 23 Ekim 2026.</w:t>
       </w:r>
     </w:p>
     <w:p>
@@ -8216,7 +8150,7 @@
       <w:r>
         <w:t xml:space="preserve"> </w:t>
       </w:r>
-      <w:hyperlink r:id="rId64">
+      <w:hyperlink r:id="rId65">
         <w:r>
           <w:rPr>
             <w:rStyle w:val="Hyperlink"/>
@@ -8228,8 +8162,61 @@
         <w:t xml:space="preserve">.</w:t>
       </w:r>
     </w:p>
-    <w:bookmarkEnd w:id="65"/>
-    <w:bookmarkEnd w:id="66"/>
+    <w:p>
+      <w:pPr>
+        <w:numPr>
+          <w:ilvl w:val="0"/>
+          <w:numId w:val="1003"/>
+        </w:numPr>
+      </w:pPr>
+      <w:r>
+        <w:t xml:space="preserve">Zhang, Z. 2000.</w:t>
+      </w:r>
+      <w:r>
+        <w:t xml:space="preserve"> </w:t>
+      </w:r>
+      <w:r>
+        <w:t xml:space="preserve">“</w:t>
+      </w:r>
+      <w:r>
+        <w:t xml:space="preserve">A flexible new technique for camera calibration</w:t>
+      </w:r>
+      <w:r>
+        <w:t xml:space="preserve">”</w:t>
+      </w:r>
+      <w:r>
+        <w:t xml:space="preserve">,</w:t>
+      </w:r>
+      <w:r>
+        <w:t xml:space="preserve"> </w:t>
+      </w:r>
+      <w:r>
+        <w:rPr>
+          <w:i/>
+          <w:iCs/>
+        </w:rPr>
+        <w:t xml:space="preserve">IEEE Transactions on Pattern Analysis and Machine Intelligence</w:t>
+      </w:r>
+      <w:r>
+        <w:t xml:space="preserve">, 22(11), 1330–1334. DOI:</w:t>
+      </w:r>
+      <w:r>
+        <w:t xml:space="preserve"> </w:t>
+      </w:r>
+      <w:hyperlink r:id="rId66">
+        <w:r>
+          <w:rPr>
+            <w:rStyle w:val="Hyperlink"/>
+          </w:rPr>
+          <w:t xml:space="preserve">https://doi.org/10.1109/34.888718</w:t>
+        </w:r>
+      </w:hyperlink>
+      <w:r>
+        <w:t xml:space="preserve">.</w:t>
+      </w:r>
+    </w:p>
+    <w:bookmarkEnd w:id="67"/>
+    <w:bookmarkEnd w:id="68"/>
     <w:sectPr>
       <w:headerReference r:id="rId9" w:type="default"/>
       <w:footerReference r:id="rId10" w:type="default"/>

</xml_diff>

<commit_message>
Bütçe açıklamasını sadeleştir ve fiyat farklarını görünür kıl
</commit_message>
<xml_diff>
--- a/docs/2209-A/ARASTIRMA_ONERISI.docx
+++ b/docs/2209-A/ARASTIRMA_ONERISI.docx
@@ -1590,7 +1590,7 @@
         <w:pStyle w:val="BodyText"/>
       </w:pPr>
       <w:r>
-        <w:t xml:space="preserve">ToF ölçümünün geçerliliği; hedef yüzeyi, ortam ışığı ve ölçüm süresine bağlı olarak kontrol edilecektir. Referans ToF bileşeninin veri sayfası, farklı yansıtıcılık ve aydınlatma koşulları için ayrı menzil ve doğruluk değerleri vermektedir (STMicroelectronics, 2024). Bu nedenle üretici tablosundaki bir değer doğrudan aracın doğruluğu kabul edilmeyecek; seçilen taşıyıcı ve deney engeli için tekrarlı mesafe kontrolleri yapılacaktır.</w:t>
+        <w:t xml:space="preserve">ToF ölçümünün geçerliliği; hedef yüzeyi, ortam ışığı ve ölçüm süresine bağlı olarak kontrol edilecektir. Referans ToF bileşeninin veri sayfası, farklı yansıtıcılık ve aydınlatma koşulları için ayrı menzil/doğruluk değerleri ile 33 ms varsayılan ölçüm bütçesini vermektedir (STMicroelectronics, 2024). Bu nedenle üretici tablosundaki bir değer doğrudan aracın doğruluğu kabul edilmeyecek; seçilen taşıyıcı ve deney engeli için tekrarlı mesafe kontrolleri yapılacaktır.</w:t>
       </w:r>
     </w:p>
     <w:p>
@@ -1917,7 +1917,7 @@
         <w:pStyle w:val="BodyText"/>
       </w:pPr>
       <w:r>
-        <w:t xml:space="preserve">Denetim döngüsü 20 Hz, beş sensörün tam taraması en az 5 Hz ve görev telemetrisi 5 Hz olacak şekilde planlanmıştır. Sensör başına yaklaşık 33 ms ölçüm bütçesinde beşli tarama 165 ms tutacak; kanal seçimi ve veri işleme için 35 ms ayrılarak toplam tarama hedefi 200 ms olacaktır. Referans bileşende belirtilen 33 ms ölçüm bütçesi bu başlangıç planına dayanak oluşturmaktadır (STMicroelectronics, 2024). 250 ms veri yaşı sınırı, 200 ms taramaya 20 Hz denetimin bir periyodu olan 50 ms’nin eklenmesiyle belirlenmiştir. Bunlar ölçülmüş gecikmeler değil, zamanlama tasarım hedefleridir. Ölçüm başlangıcı zaman damgalanacak; veri yaşı her denetim adımında kontrol edilecektir. Eşik aşımı en geç sonraki 50 ms’lik adımda durdurmaya dönüşeceğinden, durma mesafesi hesabında 300 ms’lik toplam veri yaşı/tepki bütçesi dikkate alınacaktır.</w:t>
+        <w:t xml:space="preserve">Denetim döngüsü 20 Hz, beş sensörün tam taraması en az 5 Hz ve görev telemetrisi 5 Hz olacak şekilde planlanmıştır. Sensör başına yaklaşık 33 ms ölçüm bütçesinde beşli tarama 165 ms tutacak; kanal seçimi ve veri işleme için 35 ms ayrılarak toplam tarama hedefi 200 ms olacaktır. Başlangıç zamanlamasında Bölüm 2.2’de belirtilen varsayılan ölçüm bütçesi esas alınacaktır. 250 ms veri yaşı sınırı, 200 ms taramaya 20 Hz denetimin bir periyodu olan 50 ms’nin eklenmesiyle belirlenmiştir. Bunlar ölçülmüş gecikmeler değil, zamanlama tasarım hedefleridir. Ölçüm başlangıcı zaman damgalanacak; veri yaşı her denetim adımında kontrol edilecektir. Eşik aşımı en geç sonraki 50 ms’lik adımda durdurmaya dönüşeceğinden, durma mesafesi hesabında 300 ms’lik toplam veri yaşı/tepki bütçesi dikkate alınacaktır.</w:t>
       </w:r>
     </w:p>
     <w:p>
@@ -5838,20 +5838,11 @@
         <w:pStyle w:val="FirstParagraph"/>
       </w:pPr>
       <w:r>
-        <w:t xml:space="preserve">Toplam destek talebi</w:t>
-      </w:r>
-      <w:r>
-        <w:t xml:space="preserve"> </w:t>
-      </w:r>
-      <w:r>
         <w:rPr>
           <w:b/>
           <w:bCs/>
         </w:rPr>
-        <w:t xml:space="preserve">11.500 TL</w:t>
-      </w:r>
-      <w:r>
-        <w:t xml:space="preserve">’dir. Aşağıdaki birim ve toplam bedeller KDV dahil tahmini maliyetlerdir; bağlayıcı satıcı teklifi niteliği taşımaz. Kalemler bir araç prototipi, beş sensörlü algılama düzeni ve 40 denemelik değerlendirme için planlanmıştır.</w:t>
+        <w:t xml:space="preserve">Talep edilen destek: 11.500 TL</w:t>
       </w:r>
     </w:p>
     <w:tbl>
@@ -7444,7 +7435,7 @@
               <w:rPr>
                 <w:sz w:val="19"/>
               </w:rPr>
-              <w:t xml:space="preserve">K19 — Mevcut telefon için sabitleme düzeni</w:t>
+              <w:t xml:space="preserve">K19 — Telefon için ayarlı montaj seti</w:t>
             </w:r>
           </w:p>
         </w:tc>
@@ -7745,15 +7736,7 @@
         <w:pStyle w:val="BodyText"/>
       </w:pPr>
       <w:r>
-        <w:t xml:space="preserve">Kontrol ve algılama için 3.500 TL, hareket/şasi için 2.850 TL, güç için 2.850 TL, montaj/bağlantı için 700 TL, deney düzeni için 1.600 TL ayrılmıştır. Ayrı bir kargo ödeneği talep edilmemektedir. Kontrol ve algılama bileşenleri İP1–3’ün; deney düzeni ve ölçüm araçları İP1 ve İP4’ün gereksinimlerini karşılayacaktır.</w:t>
-      </w:r>
-    </w:p>
-    <w:p>
-      <w:pPr>
-        <w:pStyle w:val="BodyText"/>
-      </w:pPr>
-      <w:r>
-        <w:t xml:space="preserve">K08, iki enkoderli motorun bağlantısına uygun, en çok 25 × 20 cm araç zarfını sağlayan tek gövde plakasını kapsar; motor, tekerlek, elektronik ve ayrıca bütçelenen bağlantı elemanlarını içermez. Başlıca elektronik bileşenler, her biri ücretsiz teslim eşiğini karşılayan toplu yurt içi siparişlerle; küçük mekanik ve montaj malzemeleri yerel teslimle temin edilecektir. İncelenen iki tedarikçinin 23 Ekim 2026 teslim koşullarında 1.500 TL ve üzeri siparişler ücretsizdir. Telefon için gerekli sabitleme düzeneği 800 TL olarak planlanmıştır. Bu dağılım satıcı teklifi değil maliyet planıdır; sipariş toplamı ve teslim koşulları satın almadan önce doğrulanacaktır. Başlıca elektronik kalemlerin 23 Ekim 2026 tarihli satış sayfası gözlemleri ayrı maliyet kaydında tutulmuş; doğrudan fiyatı teyit edilemeyen mekanik/montaj kalemleri tahmin olarak bırakılmıştır. Mevcut telefon ve lehim ekipmanı yeniden bütçelenmemiştir. Aynı parça iki kalemde alınmayacak; tedarik Bölüm 2.2’deki işlevsel uyuma göre yapılacaktır.</w:t>
+        <w:t xml:space="preserve">Birim bedeller KDV dahil tahmini maliyetlerdir; satın alma öncesi güncel teklifle doğrulanacaktır. K19, uygun duvar/tavan sabitleme noktasına takılacak ayarlı taşıyıcı kol, telefon kelepçesi ve emniyet bağından oluşan montaj setini kapsamaktadır.</w:t>
       </w:r>
     </w:p>
     <w:bookmarkEnd w:id="56"/>
@@ -8102,7 +8085,7 @@
           <w:rPr>
             <w:rStyle w:val="Hyperlink"/>
           </w:rPr>
-          <w:t xml:space="preserve">Resmî teknik veri sayfası</w:t>
+          <w:t xml:space="preserve">https://www.st.com/resource/en/datasheet/vl53l0x.pdf</w:t>
         </w:r>
       </w:hyperlink>
       <w:r>

</xml_diff>

<commit_message>
Sayfa 10 ön çalışma tablosu ve grafiğinin yerleşimini dengele
</commit_message>
<xml_diff>
--- a/docs/2209-A/ARASTIRMA_ONERISI.docx
+++ b/docs/2209-A/ARASTIRMA_ONERISI.docx
@@ -3492,7 +3492,7 @@
             <w:r>
               <w:rPr>
                 <w:b/>
-                <w:sz w:val="19"/>
+                <w:sz w:val="20"/>
               </w:rPr>
               <w:t xml:space="preserve">Senaryo</w:t>
             </w:r>
@@ -3513,7 +3513,7 @@
             <w:r>
               <w:rPr>
                 <w:b/>
-                <w:sz w:val="19"/>
+                <w:sz w:val="20"/>
               </w:rPr>
               <w:t xml:space="preserve">Sınanan davranış</w:t>
             </w:r>
@@ -3534,7 +3534,7 @@
             <w:r>
               <w:rPr>
                 <w:b/>
-                <w:sz w:val="19"/>
+                <w:sz w:val="20"/>
               </w:rPr>
               <w:t xml:space="preserve">Çalıştırma sonucu</w:t>
             </w:r>
@@ -3558,7 +3558,7 @@
             </w:pPr>
             <w:r>
               <w:rPr>
-                <w:sz w:val="19"/>
+                <w:sz w:val="20"/>
               </w:rPr>
               <w:t xml:space="preserve">S1</w:t>
             </w:r>
@@ -3577,7 +3577,7 @@
             </w:pPr>
             <w:r>
               <w:rPr>
-                <w:sz w:val="19"/>
+                <w:sz w:val="20"/>
               </w:rPr>
               <w:t xml:space="preserve">Engelsiz görev ve hedefte 2 saniye durma</w:t>
             </w:r>
@@ -3596,7 +3596,7 @@
             </w:pPr>
             <w:r>
               <w:rPr>
-                <w:sz w:val="19"/>
+                <w:sz w:val="20"/>
               </w:rPr>
               <w:t xml:space="preserve">Beklenen tamamlanma geçişi sağlandı.</w:t>
             </w:r>
@@ -3620,7 +3620,7 @@
             </w:pPr>
             <w:r>
               <w:rPr>
-                <w:sz w:val="19"/>
+                <w:sz w:val="20"/>
               </w:rPr>
               <w:t xml:space="preserve">S2</w:t>
             </w:r>
@@ -3639,7 +3639,7 @@
             </w:pPr>
             <w:r>
               <w:rPr>
-                <w:sz w:val="19"/>
+                <w:sz w:val="20"/>
               </w:rPr>
               <w:t xml:space="preserve">Engel, kenar izleme ve süre/ilerleme koşullarıyla dönüş</w:t>
             </w:r>
@@ -3658,7 +3658,7 @@
             </w:pPr>
             <w:r>
               <w:rPr>
-                <w:sz w:val="19"/>
+                <w:sz w:val="20"/>
               </w:rPr>
               <w:t xml:space="preserve">Dönüş 5. saniyede doğrulandı; sentetik görev 9. saniyede tamamlandı.</w:t>
             </w:r>
@@ -3682,7 +3682,7 @@
             </w:pPr>
             <w:r>
               <w:rPr>
-                <w:sz w:val="19"/>
+                <w:sz w:val="20"/>
               </w:rPr>
               <w:t xml:space="preserve">S3</w:t>
             </w:r>
@@ -3701,7 +3701,7 @@
             </w:pPr>
             <w:r>
               <w:rPr>
-                <w:sz w:val="19"/>
+                <w:sz w:val="20"/>
               </w:rPr>
               <w:t xml:space="preserve">Hedefe ilerleme olmadan dönüş bandına girme</w:t>
             </w:r>
@@ -3720,7 +3720,7 @@
             </w:pPr>
             <w:r>
               <w:rPr>
-                <w:sz w:val="19"/>
+                <w:sz w:val="20"/>
               </w:rPr>
               <w:t xml:space="preserve">Rota takibine erken dönüş engellendi.</w:t>
             </w:r>
@@ -3744,7 +3744,7 @@
             </w:pPr>
             <w:r>
               <w:rPr>
-                <w:sz w:val="19"/>
+                <w:sz w:val="20"/>
               </w:rPr>
               <w:t xml:space="preserve">S4</w:t>
             </w:r>
@@ -3763,7 +3763,7 @@
             </w:pPr>
             <w:r>
               <w:rPr>
-                <w:sz w:val="19"/>
+                <w:sz w:val="20"/>
               </w:rPr>
               <w:t xml:space="preserve">Güncellenmeyen sensör zaman damgası</w:t>
             </w:r>
@@ -3782,7 +3782,7 @@
             </w:pPr>
             <w:r>
               <w:rPr>
-                <w:sz w:val="19"/>
+                <w:sz w:val="20"/>
               </w:rPr>
               <w:t xml:space="preserve">250 ms sınırının aşılmasını izleyen adımda durdurma üretildi.</w:t>
             </w:r>
@@ -3806,7 +3806,7 @@
             </w:pPr>
             <w:r>
               <w:rPr>
-                <w:sz w:val="19"/>
+                <w:sz w:val="20"/>
               </w:rPr>
               <w:t xml:space="preserve">S5</w:t>
             </w:r>
@@ -3825,7 +3825,7 @@
             </w:pPr>
             <w:r>
               <w:rPr>
-                <w:sz w:val="19"/>
+                <w:sz w:val="20"/>
               </w:rPr>
               <w:t xml:space="preserve">Bir saniye canlılık mesajı alınamaması</w:t>
             </w:r>
@@ -3844,7 +3844,7 @@
             </w:pPr>
             <w:r>
               <w:rPr>
-                <w:sz w:val="19"/>
+                <w:sz w:val="20"/>
               </w:rPr>
               <w:t xml:space="preserve">Bağlantı kaybı nedeniyle durdurma üretildi.</w:t>
             </w:r>
@@ -3868,7 +3868,7 @@
             </w:pPr>
             <w:r>
               <w:rPr>
-                <w:sz w:val="19"/>
+                <w:sz w:val="20"/>
               </w:rPr>
               <w:t xml:space="preserve">S6</w:t>
             </w:r>
@@ -3887,7 +3887,7 @@
             </w:pPr>
             <w:r>
               <w:rPr>
-                <w:sz w:val="19"/>
+                <w:sz w:val="20"/>
               </w:rPr>
               <w:t xml:space="preserve">Görevin 120 saniyeyi doldurması</w:t>
             </w:r>
@@ -3906,7 +3906,7 @@
             </w:pPr>
             <w:r>
               <w:rPr>
-                <w:sz w:val="19"/>
+                <w:sz w:val="20"/>
               </w:rPr>
               <w:t xml:space="preserve">Süre sınırında durdurma üretildi.</w:t>
             </w:r>
@@ -3932,7 +3932,7 @@
       <w:r>
         <w:drawing>
           <wp:inline>
-            <wp:extent cx="6048000" cy="2323316"/>
+            <wp:extent cx="6048000" cy="3835316"/>
             <wp:effectExtent b="0" l="0" r="0" t="0"/>
             <wp:docPr descr="Şekil 4 — Durum makinesi ön çalışması" title="" id="46" name="Picture"/>
             <a:graphic>
@@ -3953,7 +3953,7 @@
                   <pic:spPr bwMode="auto">
                     <a:xfrm>
                       <a:off x="0" y="0"/>
-                      <a:ext cx="6048000" cy="2323316"/>
+                      <a:ext cx="6048000" cy="3835316"/>
                     </a:xfrm>
                     <a:prstGeom prst="rect">
                       <a:avLst/>

</xml_diff>